<commit_message>
doc updates and image for use
</commit_message>
<xml_diff>
--- a/documents/rev.docx
+++ b/documents/rev.docx
@@ -178,10 +178,7 @@
       </w:ins>
       <w:ins w:id="10" w:author="Funes, Aaron" w:date="2026-10-10T14:18:00Z" w16du:dateUtc="2026-10-10T21:18:00Z">
         <w:r>
-          <w:t xml:space="preserve">                                                                  </w:t>
-        </w:r>
-        <w:r>
-          <w:t>_____________</w:t>
+          <w:t xml:space="preserve">                                                                  _____________</w:t>
         </w:r>
       </w:ins>
     </w:p>
@@ -346,13 +343,624 @@
         </w:r>
       </w:ins>
     </w:p>
+    <w:sdt>
+      <w:sdtPr>
+        <w:id w:val="-1979369858"/>
+        <w:docPartObj>
+          <w:docPartGallery w:val="Table of Contents"/>
+          <w:docPartUnique/>
+        </w:docPartObj>
+      </w:sdtPr>
+      <w:sdtEndPr>
+        <w:rPr>
+          <w:rFonts w:eastAsiaTheme="minorEastAsia" w:cs="Times New Roman"/>
+          <w:kern w:val="0"/>
+          <w:sz w:val="22"/>
+          <w:szCs w:val="22"/>
+        </w:rPr>
+      </w:sdtEndPr>
+      <w:sdtContent>
+        <w:p>
+          <w:pPr>
+            <w:jc w:val="center"/>
+            <w:rPr>
+              <w:b/>
+              <w:bCs/>
+            </w:rPr>
+          </w:pPr>
+          <w:r>
+            <w:rPr>
+              <w:b/>
+              <w:bCs/>
+            </w:rPr>
+            <w:t>Table of Contents</w:t>
+          </w:r>
+        </w:p>
+        <w:p>
+          <w:pPr>
+            <w:pStyle w:val="TOC1"/>
+          </w:pPr>
+          <w:r>
+            <w:t>Signature Page</w:t>
+          </w:r>
+          <w:r>
+            <w:ptab w:relativeTo="margin" w:alignment="right" w:leader="dot"/>
+          </w:r>
+          <w:r>
+            <w:t>ii</w:t>
+          </w:r>
+        </w:p>
+        <w:p>
+          <w:pPr>
+            <w:pStyle w:val="TOC1"/>
+          </w:pPr>
+          <w:r>
+            <w:t>List of Tables</w:t>
+          </w:r>
+          <w:r>
+            <w:ptab w:relativeTo="margin" w:alignment="right" w:leader="dot"/>
+          </w:r>
+          <w:r>
+            <w:t>iv</w:t>
+          </w:r>
+        </w:p>
+        <w:p>
+          <w:pPr>
+            <w:pStyle w:val="TOC1"/>
+          </w:pPr>
+          <w:r>
+            <w:t>List of Figures</w:t>
+          </w:r>
+          <w:r>
+            <w:ptab w:relativeTo="margin" w:alignment="right" w:leader="dot"/>
+          </w:r>
+          <w:r>
+            <w:t>v</w:t>
+          </w:r>
+        </w:p>
+        <w:p>
+          <w:pPr>
+            <w:pStyle w:val="TOC1"/>
+          </w:pPr>
+          <w:r>
+            <w:t>Abstract</w:t>
+          </w:r>
+          <w:r>
+            <w:ptab w:relativeTo="margin" w:alignment="right" w:leader="dot"/>
+          </w:r>
+          <w:r>
+            <w:t>vi</w:t>
+          </w:r>
+        </w:p>
+        <w:p>
+          <w:pPr>
+            <w:pStyle w:val="TOC1"/>
+          </w:pPr>
+          <w:r>
+            <w:t>Introduction</w:t>
+          </w:r>
+          <w:r>
+            <w:ptab w:relativeTo="margin" w:alignment="right" w:leader="dot"/>
+          </w:r>
+          <w:r>
+            <w:t>1</w:t>
+          </w:r>
+        </w:p>
+        <w:p>
+          <w:pPr>
+            <w:pStyle w:val="TOC1"/>
+          </w:pPr>
+          <w:r>
+            <w:t>Design Decisions</w:t>
+          </w:r>
+          <w:r>
+            <w:ptab w:relativeTo="margin" w:alignment="right" w:leader="dot"/>
+          </w:r>
+        </w:p>
+        <w:p>
+          <w:pPr>
+            <w:pStyle w:val="TOC1"/>
+          </w:pPr>
+          <w:r>
+            <w:t>Results</w:t>
+          </w:r>
+          <w:r>
+            <w:ptab w:relativeTo="margin" w:alignment="right" w:leader="dot"/>
+          </w:r>
+        </w:p>
+      </w:sdtContent>
+    </w:sdt>
     <w:p/>
     <w:p>
       <w:r>
         <w:br w:type="page"/>
       </w:r>
+    </w:p>
+    <w:p>
+      <w:pPr>
+        <w:jc w:val="center"/>
+      </w:pPr>
       <w:r>
         <w:lastRenderedPageBreak/>
+        <w:t>List of Tables</w:t>
+      </w:r>
+    </w:p>
+    <w:p>
+      <w:fldSimple w:instr=" TOC \h \z \c &quot;Table&quot; ">
+        <w:r>
+          <w:rPr>
+            <w:b/>
+            <w:bCs/>
+            <w:noProof/>
+          </w:rPr>
+          <w:t>No table of figures entries found.</w:t>
+        </w:r>
+      </w:fldSimple>
+      <w:r>
+        <w:br w:type="page"/>
+      </w:r>
+    </w:p>
+    <w:p>
+      <w:pPr>
+        <w:pStyle w:val="TableofFigures"/>
+        <w:tabs>
+          <w:tab w:val="right" w:leader="dot" w:pos="9350"/>
+        </w:tabs>
+        <w:jc w:val="center"/>
+        <w:rPr>
+          <w:b/>
+          <w:bCs/>
+        </w:rPr>
+      </w:pPr>
+      <w:r>
+        <w:rPr>
+          <w:b/>
+          <w:bCs/>
+        </w:rPr>
+        <w:lastRenderedPageBreak/>
+        <w:t>List of Figures</w:t>
+      </w:r>
+    </w:p>
+    <w:p>
+      <w:pPr>
+        <w:pStyle w:val="TableofFigures"/>
+        <w:tabs>
+          <w:tab w:val="right" w:leader="dot" w:pos="9350"/>
+        </w:tabs>
+        <w:rPr>
+          <w:noProof/>
+        </w:rPr>
+      </w:pPr>
+      <w:r>
+        <w:fldChar w:fldCharType="begin"/>
+      </w:r>
+      <w:r>
+        <w:instrText xml:space="preserve"> TOC \h \z \c "Figure" </w:instrText>
+      </w:r>
+      <w:r>
+        <w:fldChar w:fldCharType="separate"/>
+      </w:r>
+      <w:hyperlink w:anchor="_Toc243332428" w:history="1">
+        <w:r>
+          <w:rPr>
+            <w:rStyle w:val="Hyperlink"/>
+            <w:noProof/>
+          </w:rPr>
+          <w:t>Figure 1 : Original Image</w:t>
+        </w:r>
+        <w:r>
+          <w:rPr>
+            <w:noProof/>
+            <w:webHidden/>
+          </w:rPr>
+          <w:tab/>
+        </w:r>
+        <w:r>
+          <w:rPr>
+            <w:noProof/>
+            <w:webHidden/>
+          </w:rPr>
+          <w:fldChar w:fldCharType="begin"/>
+        </w:r>
+        <w:r>
+          <w:rPr>
+            <w:noProof/>
+            <w:webHidden/>
+          </w:rPr>
+          <w:instrText xml:space="preserve"> PAGEREF _Toc243332428 \h </w:instrText>
+        </w:r>
+        <w:r>
+          <w:rPr>
+            <w:noProof/>
+            <w:webHidden/>
+          </w:rPr>
+        </w:r>
+        <w:r>
+          <w:rPr>
+            <w:noProof/>
+            <w:webHidden/>
+          </w:rPr>
+          <w:fldChar w:fldCharType="separate"/>
+        </w:r>
+        <w:r>
+          <w:rPr>
+            <w:noProof/>
+            <w:webHidden/>
+          </w:rPr>
+          <w:t>1</w:t>
+        </w:r>
+        <w:r>
+          <w:rPr>
+            <w:noProof/>
+            <w:webHidden/>
+          </w:rPr>
+          <w:fldChar w:fldCharType="end"/>
+        </w:r>
+      </w:hyperlink>
+    </w:p>
+    <w:p>
+      <w:pPr>
+        <w:pStyle w:val="TableofFigures"/>
+        <w:tabs>
+          <w:tab w:val="right" w:leader="dot" w:pos="9350"/>
+        </w:tabs>
+        <w:rPr>
+          <w:noProof/>
+        </w:rPr>
+      </w:pPr>
+      <w:hyperlink w:anchor="_Toc243332429" w:history="1">
+        <w:r>
+          <w:rPr>
+            <w:rStyle w:val="Hyperlink"/>
+            <w:noProof/>
+          </w:rPr>
+          <w:t>Figure 2 : Post-processed image with edge detection applied</w:t>
+        </w:r>
+        <w:r>
+          <w:rPr>
+            <w:noProof/>
+            <w:webHidden/>
+          </w:rPr>
+          <w:tab/>
+        </w:r>
+        <w:r>
+          <w:rPr>
+            <w:noProof/>
+            <w:webHidden/>
+          </w:rPr>
+          <w:fldChar w:fldCharType="begin"/>
+        </w:r>
+        <w:r>
+          <w:rPr>
+            <w:noProof/>
+            <w:webHidden/>
+          </w:rPr>
+          <w:instrText xml:space="preserve"> PAGEREF _Toc243332429 \h </w:instrText>
+        </w:r>
+        <w:r>
+          <w:rPr>
+            <w:noProof/>
+            <w:webHidden/>
+          </w:rPr>
+        </w:r>
+        <w:r>
+          <w:rPr>
+            <w:noProof/>
+            <w:webHidden/>
+          </w:rPr>
+          <w:fldChar w:fldCharType="separate"/>
+        </w:r>
+        <w:r>
+          <w:rPr>
+            <w:noProof/>
+            <w:webHidden/>
+          </w:rPr>
+          <w:t>1</w:t>
+        </w:r>
+        <w:r>
+          <w:rPr>
+            <w:noProof/>
+            <w:webHidden/>
+          </w:rPr>
+          <w:fldChar w:fldCharType="end"/>
+        </w:r>
+      </w:hyperlink>
+    </w:p>
+    <w:p>
+      <w:pPr>
+        <w:pStyle w:val="TableofFigures"/>
+        <w:tabs>
+          <w:tab w:val="right" w:leader="dot" w:pos="9350"/>
+        </w:tabs>
+        <w:rPr>
+          <w:noProof/>
+        </w:rPr>
+      </w:pPr>
+      <w:hyperlink w:anchor="_Toc243332430" w:history="1">
+        <w:r>
+          <w:rPr>
+            <w:rStyle w:val="Hyperlink"/>
+            <w:noProof/>
+          </w:rPr>
+          <w:t>Figure 3: X and Y Filter</w:t>
+        </w:r>
+        <w:r>
+          <w:rPr>
+            <w:noProof/>
+            <w:webHidden/>
+          </w:rPr>
+          <w:tab/>
+        </w:r>
+        <w:r>
+          <w:rPr>
+            <w:noProof/>
+            <w:webHidden/>
+          </w:rPr>
+          <w:fldChar w:fldCharType="begin"/>
+        </w:r>
+        <w:r>
+          <w:rPr>
+            <w:noProof/>
+            <w:webHidden/>
+          </w:rPr>
+          <w:instrText xml:space="preserve"> PAGEREF _Toc243332430 \h </w:instrText>
+        </w:r>
+        <w:r>
+          <w:rPr>
+            <w:noProof/>
+            <w:webHidden/>
+          </w:rPr>
+        </w:r>
+        <w:r>
+          <w:rPr>
+            <w:noProof/>
+            <w:webHidden/>
+          </w:rPr>
+          <w:fldChar w:fldCharType="separate"/>
+        </w:r>
+        <w:r>
+          <w:rPr>
+            <w:noProof/>
+            <w:webHidden/>
+          </w:rPr>
+          <w:t>2</w:t>
+        </w:r>
+        <w:r>
+          <w:rPr>
+            <w:noProof/>
+            <w:webHidden/>
+          </w:rPr>
+          <w:fldChar w:fldCharType="end"/>
+        </w:r>
+      </w:hyperlink>
+    </w:p>
+    <w:p>
+      <w:pPr>
+        <w:pStyle w:val="TableofFigures"/>
+        <w:tabs>
+          <w:tab w:val="right" w:leader="dot" w:pos="9350"/>
+        </w:tabs>
+        <w:rPr>
+          <w:noProof/>
+        </w:rPr>
+      </w:pPr>
+      <w:hyperlink w:anchor="_Toc243332431" w:history="1">
+        <w:r>
+          <w:rPr>
+            <w:rStyle w:val="Hyperlink"/>
+            <w:noProof/>
+          </w:rPr>
+          <w:t>Figure 4 : Filter Operation</w:t>
+        </w:r>
+        <w:r>
+          <w:rPr>
+            <w:noProof/>
+            <w:webHidden/>
+          </w:rPr>
+          <w:tab/>
+        </w:r>
+        <w:r>
+          <w:rPr>
+            <w:noProof/>
+            <w:webHidden/>
+          </w:rPr>
+          <w:fldChar w:fldCharType="begin"/>
+        </w:r>
+        <w:r>
+          <w:rPr>
+            <w:noProof/>
+            <w:webHidden/>
+          </w:rPr>
+          <w:instrText xml:space="preserve"> PAGEREF _Toc243332431 \h </w:instrText>
+        </w:r>
+        <w:r>
+          <w:rPr>
+            <w:noProof/>
+            <w:webHidden/>
+          </w:rPr>
+        </w:r>
+        <w:r>
+          <w:rPr>
+            <w:noProof/>
+            <w:webHidden/>
+          </w:rPr>
+          <w:fldChar w:fldCharType="separate"/>
+        </w:r>
+        <w:r>
+          <w:rPr>
+            <w:noProof/>
+            <w:webHidden/>
+          </w:rPr>
+          <w:t>2</w:t>
+        </w:r>
+        <w:r>
+          <w:rPr>
+            <w:noProof/>
+            <w:webHidden/>
+          </w:rPr>
+          <w:fldChar w:fldCharType="end"/>
+        </w:r>
+      </w:hyperlink>
+    </w:p>
+    <w:p>
+      <w:r>
+        <w:fldChar w:fldCharType="end"/>
+      </w:r>
+      <w:r>
+        <w:br w:type="page"/>
+      </w:r>
+    </w:p>
+    <w:p>
+      <w:pPr>
+        <w:jc w:val="center"/>
+        <w:rPr>
+          <w:b/>
+          <w:bCs/>
+        </w:rPr>
+      </w:pPr>
+      <w:r>
+        <w:rPr>
+          <w:b/>
+          <w:bCs/>
+        </w:rPr>
+        <w:lastRenderedPageBreak/>
+        <w:t>Acronym List</w:t>
+      </w:r>
+    </w:p>
+    <w:tbl>
+      <w:tblPr>
+        <w:tblStyle w:val="TableGrid"/>
+        <w:tblW w:w="0" w:type="auto"/>
+        <w:tblLook w:val="04A0" w:firstRow="1" w:lastRow="0" w:firstColumn="1" w:lastColumn="0" w:noHBand="0" w:noVBand="1"/>
+      </w:tblPr>
+      <w:tblGrid>
+        <w:gridCol w:w="4788"/>
+        <w:gridCol w:w="4788"/>
+      </w:tblGrid>
+      <w:tr>
+        <w:tc>
+          <w:tcPr>
+            <w:tcW w:w="4788" w:type="dxa"/>
+          </w:tcPr>
+          <w:p>
+            <w:pPr>
+              <w:jc w:val="center"/>
+            </w:pPr>
+            <w:r>
+              <w:t>FPGA</w:t>
+            </w:r>
+          </w:p>
+        </w:tc>
+        <w:tc>
+          <w:tcPr>
+            <w:tcW w:w="4788" w:type="dxa"/>
+          </w:tcPr>
+          <w:p>
+            <w:pPr>
+              <w:jc w:val="center"/>
+            </w:pPr>
+            <w:r>
+              <w:t>Field-Programmable Gate Array</w:t>
+            </w:r>
+          </w:p>
+        </w:tc>
+      </w:tr>
+      <w:tr>
+        <w:tc>
+          <w:tcPr>
+            <w:tcW w:w="4788" w:type="dxa"/>
+          </w:tcPr>
+          <w:p>
+            <w:pPr>
+              <w:jc w:val="center"/>
+            </w:pPr>
+            <w:r>
+              <w:t>PL</w:t>
+            </w:r>
+          </w:p>
+        </w:tc>
+        <w:tc>
+          <w:tcPr>
+            <w:tcW w:w="4788" w:type="dxa"/>
+          </w:tcPr>
+          <w:p>
+            <w:pPr>
+              <w:jc w:val="center"/>
+            </w:pPr>
+            <w:r>
+              <w:t>Programmable Logic</w:t>
+            </w:r>
+          </w:p>
+        </w:tc>
+      </w:tr>
+      <w:tr>
+        <w:tc>
+          <w:tcPr>
+            <w:tcW w:w="4788" w:type="dxa"/>
+          </w:tcPr>
+          <w:p>
+            <w:pPr>
+              <w:jc w:val="center"/>
+            </w:pPr>
+            <w:r>
+              <w:t>AP SOC</w:t>
+            </w:r>
+          </w:p>
+        </w:tc>
+        <w:tc>
+          <w:tcPr>
+            <w:tcW w:w="4788" w:type="dxa"/>
+          </w:tcPr>
+          <w:p>
+            <w:pPr>
+              <w:jc w:val="center"/>
+            </w:pPr>
+            <w:r>
+              <w:t>All-Programmable System-On-Chip</w:t>
+            </w:r>
+          </w:p>
+        </w:tc>
+      </w:tr>
+      <w:tr>
+        <w:tc>
+          <w:tcPr>
+            <w:tcW w:w="4788" w:type="dxa"/>
+          </w:tcPr>
+          <w:p>
+            <w:pPr>
+              <w:jc w:val="center"/>
+            </w:pPr>
+            <w:r>
+              <w:t>PS</w:t>
+            </w:r>
+          </w:p>
+        </w:tc>
+        <w:tc>
+          <w:tcPr>
+            <w:tcW w:w="4788" w:type="dxa"/>
+          </w:tcPr>
+          <w:p>
+            <w:pPr>
+              <w:jc w:val="center"/>
+            </w:pPr>
+            <w:r>
+              <w:t>Processing System</w:t>
+            </w:r>
+          </w:p>
+        </w:tc>
+      </w:tr>
+    </w:tbl>
+    <w:p>
+      <w:pPr>
+        <w:jc w:val="center"/>
+        <w:rPr>
+          <w:b/>
+          <w:bCs/>
+        </w:rPr>
+      </w:pPr>
+    </w:p>
+    <w:p>
+      <w:r>
         <w:br w:type="page"/>
       </w:r>
     </w:p>
@@ -422,8 +1030,8 @@
       <w:pPr>
         <w:spacing w:line="480" w:lineRule="auto"/>
         <w:sectPr>
-          <w:headerReference w:type="default" r:id="rId7"/>
-          <w:footerReference w:type="default" r:id="rId8"/>
+          <w:headerReference w:type="default" r:id="rId8"/>
+          <w:footerReference w:type="default" r:id="rId9"/>
           <w:pgSz w:w="12240" w:h="15840"/>
           <w:pgMar w:top="1440" w:right="1440" w:bottom="1440" w:left="1440" w:header="720" w:footer="720" w:gutter="0"/>
           <w:pgNumType w:fmt="lowerRoman" w:start="2"/>
@@ -590,7 +1198,7 @@
                     </pic:cNvPicPr>
                   </pic:nvPicPr>
                   <pic:blipFill>
-                    <a:blip r:embed="rId9"/>
+                    <a:blip r:embed="rId10"/>
                     <a:stretch>
                       <a:fillRect/>
                     </a:stretch>
@@ -624,6 +1232,7 @@
         </w:rPr>
       </w:pPr>
       <w:bookmarkStart w:id="38" w:name="_Ref242543934"/>
+      <w:bookmarkStart w:id="39" w:name="_Toc243332428"/>
       <w:r>
         <w:rPr>
           <w:i w:val="0"/>
@@ -696,6 +1305,7 @@
         </w:rPr>
         <w:t xml:space="preserve"> : Original Image</w:t>
       </w:r>
+      <w:bookmarkEnd w:id="39"/>
     </w:p>
     <w:p>
       <w:pPr>
@@ -737,7 +1347,7 @@
                     </pic:cNvPicPr>
                   </pic:nvPicPr>
                   <pic:blipFill>
-                    <a:blip r:embed="rId10"/>
+                    <a:blip r:embed="rId11"/>
                     <a:stretch>
                       <a:fillRect/>
                     </a:stretch>
@@ -770,7 +1380,8 @@
           <w:szCs w:val="24"/>
         </w:rPr>
       </w:pPr>
-      <w:bookmarkStart w:id="39" w:name="_Ref242543947"/>
+      <w:bookmarkStart w:id="40" w:name="_Ref242543947"/>
+      <w:bookmarkStart w:id="41" w:name="_Toc243332429"/>
       <w:r>
         <w:rPr>
           <w:i w:val="0"/>
@@ -832,7 +1443,7 @@
         </w:rPr>
         <w:fldChar w:fldCharType="end"/>
       </w:r>
-      <w:bookmarkEnd w:id="39"/>
+      <w:bookmarkEnd w:id="40"/>
       <w:r>
         <w:rPr>
           <w:i w:val="0"/>
@@ -843,6 +1454,7 @@
         </w:rPr>
         <w:t xml:space="preserve"> : Post-processed image with edge detection applied</w:t>
       </w:r>
+      <w:bookmarkEnd w:id="41"/>
     </w:p>
     <w:p>
       <w:r>
@@ -888,10 +1500,7 @@
         <w:fldChar w:fldCharType="begin"/>
       </w:r>
       <w:r>
-        <w:instrText xml:space="preserve"> REF _Ref242543517 \h </w:instrText>
-      </w:r>
-      <w:r>
-        <w:instrText xml:space="preserve"> \* MERGEFORMAT </w:instrText>
+        <w:instrText xml:space="preserve"> REF _Ref242543517 \h  \* MERGEFORMAT </w:instrText>
       </w:r>
       <w:r>
         <w:fldChar w:fldCharType="separate"/>
@@ -966,7 +1575,7 @@
                     </pic:cNvPicPr>
                   </pic:nvPicPr>
                   <pic:blipFill>
-                    <a:blip r:embed="rId11"/>
+                    <a:blip r:embed="rId12"/>
                     <a:stretch>
                       <a:fillRect/>
                     </a:stretch>
@@ -999,7 +1608,8 @@
           <w:szCs w:val="24"/>
         </w:rPr>
       </w:pPr>
-      <w:bookmarkStart w:id="40" w:name="_Ref242543517"/>
+      <w:bookmarkStart w:id="42" w:name="_Ref242543517"/>
+      <w:bookmarkStart w:id="43" w:name="_Toc243332430"/>
       <w:r>
         <w:rPr>
           <w:i w:val="0"/>
@@ -1061,7 +1671,7 @@
         </w:rPr>
         <w:fldChar w:fldCharType="end"/>
       </w:r>
-      <w:bookmarkEnd w:id="40"/>
+      <w:bookmarkEnd w:id="42"/>
       <w:r>
         <w:rPr>
           <w:i w:val="0"/>
@@ -1072,6 +1682,7 @@
         </w:rPr>
         <w:t>: X and Y Filter</w:t>
       </w:r>
+      <w:bookmarkEnd w:id="43"/>
     </w:p>
     <w:p>
       <w:r>
@@ -1099,10 +1710,7 @@
         <w:fldChar w:fldCharType="begin"/>
       </w:r>
       <w:r>
-        <w:instrText xml:space="preserve"> REF _Ref242546529 \h </w:instrText>
-      </w:r>
-      <w:r>
-        <w:instrText xml:space="preserve"> \* MERGEFORMAT </w:instrText>
+        <w:instrText xml:space="preserve"> REF _Ref242546529 \h  \* MERGEFORMAT </w:instrText>
       </w:r>
       <w:r>
         <w:fldChar w:fldCharType="separate"/>
@@ -1162,7 +1770,7 @@
                     </pic:cNvPicPr>
                   </pic:nvPicPr>
                   <pic:blipFill>
-                    <a:blip r:embed="rId12"/>
+                    <a:blip r:embed="rId13"/>
                     <a:stretch>
                       <a:fillRect/>
                     </a:stretch>
@@ -1194,7 +1802,8 @@
           <w:szCs w:val="24"/>
         </w:rPr>
       </w:pPr>
-      <w:bookmarkStart w:id="41" w:name="_Ref242546529"/>
+      <w:bookmarkStart w:id="44" w:name="_Ref242546529"/>
+      <w:bookmarkStart w:id="45" w:name="_Toc243332431"/>
       <w:r>
         <w:rPr>
           <w:i w:val="0"/>
@@ -1250,7 +1859,7 @@
         </w:rPr>
         <w:fldChar w:fldCharType="end"/>
       </w:r>
-      <w:bookmarkEnd w:id="41"/>
+      <w:bookmarkEnd w:id="44"/>
       <w:r>
         <w:rPr>
           <w:i w:val="0"/>
@@ -1260,6 +1869,7 @@
         </w:rPr>
         <w:t xml:space="preserve"> : Filter Operation</w:t>
       </w:r>
+      <w:bookmarkEnd w:id="45"/>
     </w:p>
     <w:p>
       <w:pPr>
@@ -1271,16 +1881,183 @@
     </w:p>
     <w:p>
       <w:r>
-        <w:t>The Z</w:t>
-      </w:r>
-      <w:r>
-        <w:t>ybo Z7-20 development board</w:t>
-      </w:r>
-      <w:r>
-        <w:t xml:space="preserve"> is used for the application of this project. The Zybo Z7 is a All Programmable System-on-Chip (AP SoC) device. It contains a dual-core ARM Cortex-A9 processor with Field Programmable Gate Array (FPGA) logic.</w:t>
-      </w:r>
-      <w:r>
-        <w:t xml:space="preserve"> The Zybo Z7 includes a mirco SD card input</w:t>
+        <w:t>The Zybo Z7-20 development board is used for the application of this project. The Zybo Z7 is a All Programmable System-on-Chip (AP SoC) device. It contains a dual-core ARM Cortex-A9 processor with Field Programmable Gate Array (FPGA) logic.</w:t>
+      </w:r>
+      <w:r>
+        <w:t xml:space="preserve"> </w:t>
+      </w:r>
+      <w:r>
+        <w:t>The board can be broken down in to two sections, programmable logic and the processing system (PS).</w:t>
+      </w:r>
+    </w:p>
+    <w:p>
+      <w:pPr>
+        <w:keepNext/>
+        <w:jc w:val="center"/>
+      </w:pPr>
+      <w:r>
+        <w:rPr>
+          <w:noProof/>
+        </w:rPr>
+        <w:lastRenderedPageBreak/>
+        <w:drawing>
+          <wp:inline distT="0" distB="0" distL="0" distR="0" wp14:anchorId="048BEE78" wp14:editId="484856C8">
+            <wp:extent cx="3190875" cy="3519706"/>
+            <wp:effectExtent l="0" t="0" r="0" b="0"/>
+            <wp:docPr id="1019188872" name="Picture 1"/>
+            <wp:cNvGraphicFramePr>
+              <a:graphicFrameLocks xmlns:a="http://schemas.openxmlformats.org/drawingml/2006/main" noChangeAspect="1"/>
+            </wp:cNvGraphicFramePr>
+            <a:graphic xmlns:a="http://schemas.openxmlformats.org/drawingml/2006/main">
+              <a:graphicData uri="http://schemas.openxmlformats.org/drawingml/2006/picture">
+                <pic:pic xmlns:pic="http://schemas.openxmlformats.org/drawingml/2006/picture">
+                  <pic:nvPicPr>
+                    <pic:cNvPr id="0" name="Picture 1"/>
+                    <pic:cNvPicPr>
+                      <a:picLocks noChangeAspect="1" noChangeArrowheads="1"/>
+                    </pic:cNvPicPr>
+                  </pic:nvPicPr>
+                  <pic:blipFill>
+                    <a:blip r:embed="rId14">
+                      <a:extLst>
+                        <a:ext uri="{28A0092B-C50C-407E-A947-70E740481C1C}">
+                          <a14:useLocalDpi xmlns:a14="http://schemas.microsoft.com/office/drawing/2010/main" val="0"/>
+                        </a:ext>
+                      </a:extLst>
+                    </a:blip>
+                    <a:srcRect/>
+                    <a:stretch>
+                      <a:fillRect/>
+                    </a:stretch>
+                  </pic:blipFill>
+                  <pic:spPr bwMode="auto">
+                    <a:xfrm>
+                      <a:off x="0" y="0"/>
+                      <a:ext cx="3213520" cy="3544685"/>
+                    </a:xfrm>
+                    <a:prstGeom prst="rect">
+                      <a:avLst/>
+                    </a:prstGeom>
+                    <a:noFill/>
+                    <a:ln>
+                      <a:noFill/>
+                    </a:ln>
+                  </pic:spPr>
+                </pic:pic>
+              </a:graphicData>
+            </a:graphic>
+          </wp:inline>
+        </w:drawing>
+      </w:r>
+    </w:p>
+    <w:p>
+      <w:pPr>
+        <w:pStyle w:val="Caption"/>
+        <w:jc w:val="center"/>
+        <w:rPr>
+          <w:i w:val="0"/>
+          <w:iCs w:val="0"/>
+          <w:color w:val="auto"/>
+          <w:sz w:val="24"/>
+          <w:szCs w:val="24"/>
+          <w:vertAlign w:val="superscript"/>
+        </w:rPr>
+      </w:pPr>
+      <w:r>
+        <w:rPr>
+          <w:i w:val="0"/>
+          <w:iCs w:val="0"/>
+          <w:color w:val="auto"/>
+          <w:sz w:val="24"/>
+          <w:szCs w:val="24"/>
+        </w:rPr>
+        <w:t xml:space="preserve">Figure </w:t>
+      </w:r>
+      <w:r>
+        <w:rPr>
+          <w:i w:val="0"/>
+          <w:iCs w:val="0"/>
+          <w:color w:val="auto"/>
+          <w:sz w:val="24"/>
+          <w:szCs w:val="24"/>
+        </w:rPr>
+        <w:fldChar w:fldCharType="begin"/>
+      </w:r>
+      <w:r>
+        <w:rPr>
+          <w:i w:val="0"/>
+          <w:iCs w:val="0"/>
+          <w:color w:val="auto"/>
+          <w:sz w:val="24"/>
+          <w:szCs w:val="24"/>
+        </w:rPr>
+        <w:instrText xml:space="preserve"> SEQ Figure \* ARABIC </w:instrText>
+      </w:r>
+      <w:r>
+        <w:rPr>
+          <w:i w:val="0"/>
+          <w:iCs w:val="0"/>
+          <w:color w:val="auto"/>
+          <w:sz w:val="24"/>
+          <w:szCs w:val="24"/>
+        </w:rPr>
+        <w:fldChar w:fldCharType="separate"/>
+      </w:r>
+      <w:r>
+        <w:rPr>
+          <w:i w:val="0"/>
+          <w:iCs w:val="0"/>
+          <w:noProof/>
+          <w:color w:val="auto"/>
+          <w:sz w:val="24"/>
+          <w:szCs w:val="24"/>
+        </w:rPr>
+        <w:t>5</w:t>
+      </w:r>
+      <w:r>
+        <w:rPr>
+          <w:i w:val="0"/>
+          <w:iCs w:val="0"/>
+          <w:color w:val="auto"/>
+          <w:sz w:val="24"/>
+          <w:szCs w:val="24"/>
+        </w:rPr>
+        <w:fldChar w:fldCharType="end"/>
+      </w:r>
+      <w:r>
+        <w:rPr>
+          <w:i w:val="0"/>
+          <w:iCs w:val="0"/>
+          <w:color w:val="auto"/>
+          <w:sz w:val="24"/>
+          <w:szCs w:val="24"/>
+        </w:rPr>
+        <w:t>: Zybo Block Diagram</w:t>
+      </w:r>
+      <w:r>
+        <w:rPr>
+          <w:i w:val="0"/>
+          <w:iCs w:val="0"/>
+          <w:color w:val="auto"/>
+          <w:sz w:val="24"/>
+          <w:szCs w:val="24"/>
+          <w:vertAlign w:val="superscript"/>
+        </w:rPr>
+        <w:t>1</w:t>
+      </w:r>
+    </w:p>
+    <w:p>
+      <w:r>
+        <w:t xml:space="preserve">In order to access the PL design for the Sobel filter, Advanced eXtensible </w:t>
+      </w:r>
+      <w:r>
+        <w:t>Interface (AXI) buses are used to establish commun</w:t>
+      </w:r>
+      <w:r>
+        <w:t>s</w:t>
+      </w:r>
+      <w:r>
+        <w:t xml:space="preserve">ications with PS portion. </w:t>
       </w:r>
     </w:p>
     <w:sectPr>
@@ -1289,10 +2066,9 @@
       <w:pgNumType w:start="1"/>
       <w:cols w:space="720"/>
       <w:docGrid w:linePitch="360"/>
-      <w:sectPrChange w:id="42" w:author="Funes, Aaron" w:date="2026-10-10T14:25:00Z" w16du:dateUtc="2026-10-10T21:25:00Z">
+      <w:sectPrChange w:id="46" w:author="Funes, Aaron" w:date="2026-10-10T14:25:00Z" w16du:dateUtc="2026-10-10T21:25:00Z">
         <w:sectPr>
           <w:pgMar w:top="1440" w:right="1440" w:bottom="1440" w:left="1440" w:header="720" w:footer="720" w:gutter="0"/>
-          <w:pgNumType w:start="0"/>
         </w:sectPr>
       </w:sectPrChange>
     </w:sectPr>
@@ -1373,7 +2149,14 @@
   <w:p>
     <w:pPr>
       <w:pStyle w:val="Footer"/>
+      <w:numPr>
+        <w:ilvl w:val="0"/>
+        <w:numId w:val="1"/>
+      </w:numPr>
     </w:pPr>
+    <w:r>
+      <w:t>Zybo Z7 Reference Manual</w:t>
+    </w:r>
   </w:p>
 </w:ftr>
 </file>
@@ -1411,6 +2194,103 @@
     </w:pPr>
   </w:p>
 </w:hdr>
+</file>
+
+<file path=word/numbering.xml><?xml version="1.0" encoding="utf-8"?>
+<w:numbering xmlns:wpc="http://schemas.microsoft.com/office/word/2010/wordprocessingCanvas" xmlns:cx="http://schemas.microsoft.com/office/drawing/2014/chartex" xmlns:cx1="http://schemas.microsoft.com/office/drawing/2015/9/8/chartex" xmlns:cx2="http://schemas.microsoft.com/office/drawing/2015/10/21/chartex" xmlns:cx3="http://schemas.microsoft.com/office/drawing/2016/5/9/chartex" xmlns:cx4="http://schemas.microsoft.com/office/drawing/2016/5/10/chartex" xmlns:cx5="http://schemas.microsoft.com/office/drawing/2016/5/11/chartex" xmlns:cx6="http://schemas.microsoft.com/office/drawing/2016/5/12/chartex" xmlns:cx7="http://schemas.microsoft.com/office/drawing/2016/5/13/chartex" xmlns:cx8="http://schemas.microsoft.com/office/drawing/2016/5/14/chartex" xmlns:mc="http://schemas.openxmlformats.org/markup-compatibility/2006" xmlns:aink="http://schemas.microsoft.com/office/drawing/2016/ink" xmlns:am3d="http://schemas.microsoft.com/office/drawing/2017/model3d" xmlns:o="urn:schemas-microsoft-com:office:office" xmlns:oel="http://schemas.microsoft.com/office/2019/extlst" xmlns:r="http://schemas.openxmlformats.org/officeDocument/2006/relationships" xmlns:m="http://schemas.openxmlformats.org/officeDocument/2006/math" xmlns:v="urn:schemas-microsoft-com:vml" xmlns:wp14="http://schemas.microsoft.com/office/word/2010/wordprocessingDrawing" xmlns:wp="http://schemas.openxmlformats.org/drawingml/2006/wordprocessingDrawing" xmlns:w10="urn:schemas-microsoft-com:office:word" xmlns:w="http://schemas.openxmlformats.org/wordprocessingml/2006/main" xmlns:w14="http://schemas.microsoft.com/office/word/2010/wordml" xmlns:w15="http://schemas.microsoft.com/office/word/2012/wordml" xmlns:w16cex="http://schemas.microsoft.com/office/word/2018/wordml/cex" xmlns:w16cid="http://schemas.microsoft.com/office/word/2016/wordml/cid" xmlns:w16="http://schemas.microsoft.com/office/word/2018/wordml" xmlns:w16du="http://schemas.microsoft.com/office/word/2023/wordml/word16du" xmlns:w16sdtdh="http://schemas.microsoft.com/office/word/2020/wordml/sdtdatahash" xmlns:w16sdtfl="http://schemas.microsoft.com/office/word/2024/wordml/sdtformatlock" xmlns:w16se="http://schemas.microsoft.com/office/word/2015/wordml/symex" xmlns:wpg="http://schemas.microsoft.com/office/word/2010/wordprocessingGroup" xmlns:wpi="http://schemas.microsoft.com/office/word/2010/wordprocessingInk" xmlns:wne="http://schemas.microsoft.com/office/word/2006/wordml" xmlns:wps="http://schemas.microsoft.com/office/word/2010/wordprocessingShape" mc:Ignorable="w14 w15 w16se w16cid w16 w16cex w16sdtdh w16sdtfl w16du wp14">
+  <w:abstractNum w:abstractNumId="0" w15:restartNumberingAfterBreak="0">
+    <w:nsid w:val="6CB51F75"/>
+    <w:multiLevelType w:val="hybridMultilevel"/>
+    <w:tmpl w:val="91C26C5A"/>
+    <w:lvl w:ilvl="0" w:tplc="0409000F">
+      <w:start w:val="1"/>
+      <w:numFmt w:val="decimal"/>
+      <w:lvlText w:val="%1."/>
+      <w:lvlJc w:val="left"/>
+      <w:pPr>
+        <w:ind w:left="720" w:hanging="360"/>
+      </w:pPr>
+      <w:rPr>
+        <w:rFonts w:hint="default"/>
+      </w:rPr>
+    </w:lvl>
+    <w:lvl w:ilvl="1" w:tplc="04090019" w:tentative="1">
+      <w:start w:val="1"/>
+      <w:numFmt w:val="lowerLetter"/>
+      <w:lvlText w:val="%2."/>
+      <w:lvlJc w:val="left"/>
+      <w:pPr>
+        <w:ind w:left="1440" w:hanging="360"/>
+      </w:pPr>
+    </w:lvl>
+    <w:lvl w:ilvl="2" w:tplc="0409001B" w:tentative="1">
+      <w:start w:val="1"/>
+      <w:numFmt w:val="lowerRoman"/>
+      <w:lvlText w:val="%3."/>
+      <w:lvlJc w:val="right"/>
+      <w:pPr>
+        <w:ind w:left="2160" w:hanging="180"/>
+      </w:pPr>
+    </w:lvl>
+    <w:lvl w:ilvl="3" w:tplc="0409000F" w:tentative="1">
+      <w:start w:val="1"/>
+      <w:numFmt w:val="decimal"/>
+      <w:lvlText w:val="%4."/>
+      <w:lvlJc w:val="left"/>
+      <w:pPr>
+        <w:ind w:left="2880" w:hanging="360"/>
+      </w:pPr>
+    </w:lvl>
+    <w:lvl w:ilvl="4" w:tplc="04090019" w:tentative="1">
+      <w:start w:val="1"/>
+      <w:numFmt w:val="lowerLetter"/>
+      <w:lvlText w:val="%5."/>
+      <w:lvlJc w:val="left"/>
+      <w:pPr>
+        <w:ind w:left="3600" w:hanging="360"/>
+      </w:pPr>
+    </w:lvl>
+    <w:lvl w:ilvl="5" w:tplc="0409001B" w:tentative="1">
+      <w:start w:val="1"/>
+      <w:numFmt w:val="lowerRoman"/>
+      <w:lvlText w:val="%6."/>
+      <w:lvlJc w:val="right"/>
+      <w:pPr>
+        <w:ind w:left="4320" w:hanging="180"/>
+      </w:pPr>
+    </w:lvl>
+    <w:lvl w:ilvl="6" w:tplc="0409000F" w:tentative="1">
+      <w:start w:val="1"/>
+      <w:numFmt w:val="decimal"/>
+      <w:lvlText w:val="%7."/>
+      <w:lvlJc w:val="left"/>
+      <w:pPr>
+        <w:ind w:left="5040" w:hanging="360"/>
+      </w:pPr>
+    </w:lvl>
+    <w:lvl w:ilvl="7" w:tplc="04090019" w:tentative="1">
+      <w:start w:val="1"/>
+      <w:numFmt w:val="lowerLetter"/>
+      <w:lvlText w:val="%8."/>
+      <w:lvlJc w:val="left"/>
+      <w:pPr>
+        <w:ind w:left="5760" w:hanging="360"/>
+      </w:pPr>
+    </w:lvl>
+    <w:lvl w:ilvl="8" w:tplc="0409001B" w:tentative="1">
+      <w:start w:val="1"/>
+      <w:numFmt w:val="lowerRoman"/>
+      <w:lvlText w:val="%9."/>
+      <w:lvlJc w:val="right"/>
+      <w:pPr>
+        <w:ind w:left="6480" w:hanging="180"/>
+      </w:pPr>
+    </w:lvl>
+  </w:abstractNum>
+  <w:num w:numId="1" w16cid:durableId="1722751409">
+    <w:abstractNumId w:val="0"/>
+  </w:num>
+</w:numbering>
 </file>
 
 <file path=word/people.xml><?xml version="1.0" encoding="utf-8"?>
@@ -2398,7 +3278,6 @@
     <w:basedOn w:val="Heading1"/>
     <w:next w:val="Normal"/>
     <w:uiPriority w:val="39"/>
-    <w:semiHidden/>
     <w:unhideWhenUsed/>
     <w:qFormat/>
     <w:rsid w:val="00842A0A"/>
@@ -2485,6 +3364,47 @@
       <w:sz w:val="18"/>
       <w:szCs w:val="18"/>
     </w:rPr>
+  </w:style>
+  <w:style w:type="paragraph" w:styleId="TableofFigures">
+    <w:name w:val="table of figures"/>
+    <w:basedOn w:val="Normal"/>
+    <w:next w:val="Normal"/>
+    <w:uiPriority w:val="99"/>
+    <w:unhideWhenUsed/>
+    <w:rsid w:val="007A28B5"/>
+    <w:pPr>
+      <w:spacing w:after="0"/>
+    </w:pPr>
+  </w:style>
+  <w:style w:type="character" w:styleId="Hyperlink">
+    <w:name w:val="Hyperlink"/>
+    <w:basedOn w:val="DefaultParagraphFont"/>
+    <w:uiPriority w:val="99"/>
+    <w:unhideWhenUsed/>
+    <w:rsid w:val="007A28B5"/>
+    <w:rPr>
+      <w:color w:val="467886" w:themeColor="hyperlink"/>
+      <w:u w:val="single"/>
+    </w:rPr>
+  </w:style>
+  <w:style w:type="table" w:styleId="TableGrid">
+    <w:name w:val="Table Grid"/>
+    <w:basedOn w:val="TableNormal"/>
+    <w:uiPriority w:val="39"/>
+    <w:rsid w:val="00885A2B"/>
+    <w:pPr>
+      <w:spacing w:after="0" w:line="240" w:lineRule="auto"/>
+    </w:pPr>
+    <w:tblPr>
+      <w:tblBorders>
+        <w:top w:val="single" w:sz="4" w:space="0" w:color="auto"/>
+        <w:left w:val="single" w:sz="4" w:space="0" w:color="auto"/>
+        <w:bottom w:val="single" w:sz="4" w:space="0" w:color="auto"/>
+        <w:right w:val="single" w:sz="4" w:space="0" w:color="auto"/>
+        <w:insideH w:val="single" w:sz="4" w:space="0" w:color="auto"/>
+        <w:insideV w:val="single" w:sz="4" w:space="0" w:color="auto"/>
+      </w:tblBorders>
+    </w:tblPr>
   </w:style>
 </w:styles>
 </file>

</xml_diff>

<commit_message>
document updated, need results section update and vitis description
</commit_message>
<xml_diff>
--- a/documents/rev.docx
+++ b/documents/rev.docx
@@ -105,7 +105,7 @@
       <w:r>
         <w:t>(Official end of the sem</w:t>
       </w:r>
-      <w:ins w:id="0" w:author="Funes, Aaron" w:date="2026-10-10T14:06:00Z" w16du:dateUtc="2026-10-10T21:06:00Z">
+      <w:ins w:id="0" w:author="Funes, Aaron" w:date="2026-10-10T14:06:00Z">
         <w:r>
           <w:t>ester)</w:t>
         </w:r>
@@ -127,12 +127,12 @@
     <w:p>
       <w:pPr>
         <w:rPr>
-          <w:ins w:id="1" w:author="Funes, Aaron" w:date="2026-10-10T14:14:00Z" w16du:dateUtc="2026-10-10T21:14:00Z"/>
+          <w:ins w:id="1" w:author="Funes, Aaron" w:date="2026-10-10T14:14:00Z"/>
         </w:rPr>
       </w:pPr>
       <w:bookmarkStart w:id="2" w:name="Signature_Page"/>
       <w:bookmarkEnd w:id="2"/>
-      <w:ins w:id="3" w:author="Funes, Aaron" w:date="2026-10-10T14:09:00Z" w16du:dateUtc="2026-10-10T21:09:00Z">
+      <w:ins w:id="3" w:author="Funes, Aaron" w:date="2026-10-10T14:09:00Z">
         <w:r>
           <w:lastRenderedPageBreak/>
           <w:t>The graduate project of Aaron Funes is approved:</w:t>
@@ -142,21 +142,21 @@
     <w:p>
       <w:pPr>
         <w:rPr>
-          <w:ins w:id="4" w:author="Funes, Aaron" w:date="2026-10-10T14:14:00Z" w16du:dateUtc="2026-10-10T21:14:00Z"/>
-        </w:rPr>
-      </w:pPr>
-    </w:p>
-    <w:p>
-      <w:pPr>
-        <w:rPr>
-          <w:ins w:id="5" w:author="Funes, Aaron" w:date="2026-10-10T14:14:00Z" w16du:dateUtc="2026-10-10T21:14:00Z"/>
-        </w:rPr>
-      </w:pPr>
-    </w:p>
-    <w:p>
-      <w:pPr>
-        <w:rPr>
-          <w:ins w:id="6" w:author="Funes, Aaron" w:date="2026-10-10T14:14:00Z" w16du:dateUtc="2026-10-10T21:14:00Z"/>
+          <w:ins w:id="4" w:author="Funes, Aaron" w:date="2026-10-10T14:14:00Z"/>
+        </w:rPr>
+      </w:pPr>
+    </w:p>
+    <w:p>
+      <w:pPr>
+        <w:rPr>
+          <w:ins w:id="5" w:author="Funes, Aaron" w:date="2026-10-10T14:14:00Z"/>
+        </w:rPr>
+      </w:pPr>
+    </w:p>
+    <w:p>
+      <w:pPr>
+        <w:rPr>
+          <w:ins w:id="6" w:author="Funes, Aaron" w:date="2026-10-10T14:14:00Z"/>
         </w:rPr>
       </w:pPr>
     </w:p>
@@ -164,58 +164,58 @@
       <w:pPr>
         <w:spacing w:after="0"/>
         <w:rPr>
-          <w:ins w:id="7" w:author="Funes, Aaron" w:date="2026-10-10T14:16:00Z" w16du:dateUtc="2026-10-10T21:16:00Z"/>
-        </w:rPr>
-        <w:pPrChange w:id="8" w:author="Funes, Aaron" w:date="2026-10-10T14:16:00Z" w16du:dateUtc="2026-10-10T21:16:00Z">
+          <w:ins w:id="7" w:author="Funes, Aaron" w:date="2026-10-10T14:16:00Z"/>
+        </w:rPr>
+        <w:pPrChange w:id="8" w:author="Funes, Aaron" w:date="2026-10-10T14:16:00Z">
           <w:pPr/>
         </w:pPrChange>
       </w:pPr>
-      <w:ins w:id="9" w:author="Funes, Aaron" w:date="2026-10-10T14:16:00Z" w16du:dateUtc="2026-10-10T21:16:00Z">
-        <w:r>
-          <w:t>____________________________</w:t>
-        </w:r>
-        <w:proofErr w:type="gramStart"/>
-        <w:r>
-          <w:t>__</w:t>
-        </w:r>
-        <w:proofErr w:type="gramEnd"/>
-        <w:r>
-          <w:t>_</w:t>
+      <w:ins w:id="9" w:author="Funes, Aaron" w:date="2026-10-10T14:16:00Z">
+        <w:r>
+          <w:t>_______________________________</w:t>
         </w:r>
       </w:ins>
-      <w:ins w:id="10" w:author="Funes, Aaron" w:date="2026-10-10T14:17:00Z" w16du:dateUtc="2026-10-10T21:17:00Z">
+      <w:ins w:id="10" w:author="Funes, Aaron" w:date="2026-10-10T14:17:00Z">
         <w:r>
           <w:t xml:space="preserve">  </w:t>
         </w:r>
       </w:ins>
-      <w:ins w:id="11" w:author="Funes, Aaron" w:date="2026-10-10T14:18:00Z" w16du:dateUtc="2026-10-10T21:18:00Z">
-        <w:r>
-          <w:t xml:space="preserve">                                                                  _____________</w:t>
+      <w:ins w:id="11" w:author="Funes, Aaron" w:date="2026-10-10T14:18:00Z">
+        <w:r>
+          <w:t xml:space="preserve">                                                              __</w:t>
         </w:r>
       </w:ins>
-    </w:p>
-    <w:p>
-      <w:pPr>
-        <w:rPr>
-          <w:ins w:id="12" w:author="Funes, Aaron" w:date="2026-10-10T14:17:00Z" w16du:dateUtc="2026-10-10T21:17:00Z"/>
-        </w:rPr>
-      </w:pPr>
-      <w:ins w:id="13" w:author="Funes, Aaron" w:date="2026-10-10T14:21:00Z" w16du:dateUtc="2026-10-10T21:21:00Z">
+      <w:r>
+        <w:t>_</w:t>
+      </w:r>
+      <w:ins w:id="12" w:author="Funes, Aaron" w:date="2026-10-10T14:18:00Z">
+        <w:r>
+          <w:t>_____</w:t>
+        </w:r>
+      </w:ins>
+    </w:p>
+    <w:p>
+      <w:pPr>
+        <w:rPr>
+          <w:ins w:id="13" w:author="Funes, Aaron" w:date="2026-10-10T14:17:00Z"/>
+        </w:rPr>
+      </w:pPr>
+      <w:ins w:id="14" w:author="Funes, Aaron" w:date="2026-10-10T14:21:00Z">
         <w:r>
           <w:t xml:space="preserve">Professor </w:t>
         </w:r>
       </w:ins>
-      <w:ins w:id="14" w:author="Funes, Aaron" w:date="2026-10-10T14:20:00Z" w16du:dateUtc="2026-10-10T21:20:00Z">
+      <w:ins w:id="15" w:author="Funes, Aaron" w:date="2026-10-10T14:20:00Z">
         <w:r>
           <w:t xml:space="preserve">Aaron Nanas                </w:t>
         </w:r>
       </w:ins>
-      <w:ins w:id="15" w:author="Funes, Aaron" w:date="2026-10-10T14:18:00Z" w16du:dateUtc="2026-10-10T21:18:00Z">
+      <w:ins w:id="16" w:author="Funes, Aaron" w:date="2026-10-10T14:18:00Z">
         <w:r>
           <w:t xml:space="preserve">                                                                          Date</w:t>
         </w:r>
       </w:ins>
-      <w:ins w:id="16" w:author="Funes, Aaron" w:date="2026-10-10T14:16:00Z" w16du:dateUtc="2026-10-10T21:16:00Z">
+      <w:ins w:id="17" w:author="Funes, Aaron" w:date="2026-10-10T14:16:00Z">
         <w:r>
           <w:br/>
         </w:r>
@@ -224,14 +224,14 @@
     <w:p>
       <w:pPr>
         <w:rPr>
-          <w:ins w:id="17" w:author="Funes, Aaron" w:date="2026-10-10T14:17:00Z" w16du:dateUtc="2026-10-10T21:17:00Z"/>
-        </w:rPr>
-      </w:pPr>
-    </w:p>
-    <w:p>
-      <w:pPr>
-        <w:rPr>
-          <w:ins w:id="18" w:author="Funes, Aaron" w:date="2026-10-10T14:17:00Z" w16du:dateUtc="2026-10-10T21:17:00Z"/>
+          <w:ins w:id="18" w:author="Funes, Aaron" w:date="2026-10-10T14:17:00Z"/>
+        </w:rPr>
+      </w:pPr>
+    </w:p>
+    <w:p>
+      <w:pPr>
+        <w:rPr>
+          <w:ins w:id="19" w:author="Funes, Aaron" w:date="2026-10-10T14:17:00Z"/>
         </w:rPr>
       </w:pPr>
     </w:p>
@@ -239,46 +239,49 @@
       <w:pPr>
         <w:spacing w:after="0"/>
         <w:rPr>
-          <w:ins w:id="19" w:author="Funes, Aaron" w:date="2026-10-10T14:17:00Z" w16du:dateUtc="2026-10-10T21:17:00Z"/>
-        </w:rPr>
-      </w:pPr>
-      <w:ins w:id="20" w:author="Funes, Aaron" w:date="2026-10-10T14:17:00Z" w16du:dateUtc="2026-10-10T21:17:00Z">
-        <w:r>
-          <w:t>____________________________</w:t>
-        </w:r>
-        <w:proofErr w:type="gramStart"/>
-        <w:r>
-          <w:t>__</w:t>
-        </w:r>
-        <w:proofErr w:type="gramEnd"/>
-        <w:r>
-          <w:t>_</w:t>
+          <w:ins w:id="20" w:author="Funes, Aaron" w:date="2026-10-10T14:17:00Z"/>
+        </w:rPr>
+      </w:pPr>
+      <w:ins w:id="21" w:author="Funes, Aaron" w:date="2026-10-10T14:17:00Z">
+        <w:r>
+          <w:t>_______________________________</w:t>
         </w:r>
       </w:ins>
-      <w:ins w:id="21" w:author="Funes, Aaron" w:date="2026-10-10T14:18:00Z" w16du:dateUtc="2026-10-10T21:18:00Z">
-        <w:r>
-          <w:t xml:space="preserve">                                                                    _____________</w:t>
+      <w:ins w:id="22" w:author="Funes, Aaron" w:date="2026-10-10T14:18:00Z">
+        <w:r>
+          <w:t xml:space="preserve">                                                               </w:t>
         </w:r>
       </w:ins>
+      <w:r>
+        <w:t xml:space="preserve">   </w:t>
+      </w:r>
+      <w:r>
+        <w:t>_</w:t>
+      </w:r>
+      <w:ins w:id="23" w:author="Funes, Aaron" w:date="2026-10-10T14:18:00Z">
+        <w:r>
+          <w:t>_______</w:t>
+        </w:r>
+      </w:ins>
     </w:p>
     <w:p>
       <w:pPr>
         <w:spacing w:after="0"/>
         <w:rPr>
-          <w:ins w:id="22" w:author="Funes, Aaron" w:date="2026-10-10T14:17:00Z" w16du:dateUtc="2026-10-10T21:17:00Z"/>
-        </w:rPr>
-      </w:pPr>
-      <w:ins w:id="23" w:author="Funes, Aaron" w:date="2026-10-10T14:17:00Z" w16du:dateUtc="2026-10-10T21:17:00Z">
+          <w:ins w:id="24" w:author="Funes, Aaron" w:date="2026-10-10T14:17:00Z"/>
+        </w:rPr>
+      </w:pPr>
+      <w:ins w:id="25" w:author="Funes, Aaron" w:date="2026-10-10T14:17:00Z">
         <w:r>
           <w:t xml:space="preserve">Dr. </w:t>
         </w:r>
       </w:ins>
-      <w:ins w:id="24" w:author="Funes, Aaron" w:date="2026-10-10T14:20:00Z" w16du:dateUtc="2026-10-10T21:20:00Z">
+      <w:ins w:id="26" w:author="Funes, Aaron" w:date="2026-10-10T14:20:00Z">
         <w:r>
           <w:t xml:space="preserve">Myung Cho            </w:t>
         </w:r>
       </w:ins>
-      <w:ins w:id="25" w:author="Funes, Aaron" w:date="2026-10-10T14:19:00Z" w16du:dateUtc="2026-10-10T21:19:00Z">
+      <w:ins w:id="27" w:author="Funes, Aaron" w:date="2026-10-10T14:19:00Z">
         <w:r>
           <w:t xml:space="preserve">                                                                                               Date</w:t>
         </w:r>
@@ -287,21 +290,21 @@
     <w:p>
       <w:pPr>
         <w:rPr>
-          <w:ins w:id="26" w:author="Funes, Aaron" w:date="2026-10-10T14:17:00Z" w16du:dateUtc="2026-10-10T21:17:00Z"/>
-        </w:rPr>
-      </w:pPr>
-    </w:p>
-    <w:p>
-      <w:pPr>
-        <w:rPr>
-          <w:ins w:id="27" w:author="Funes, Aaron" w:date="2026-10-10T14:17:00Z" w16du:dateUtc="2026-10-10T21:17:00Z"/>
-        </w:rPr>
-      </w:pPr>
-    </w:p>
-    <w:p>
-      <w:pPr>
-        <w:rPr>
-          <w:ins w:id="28" w:author="Funes, Aaron" w:date="2026-10-10T14:17:00Z" w16du:dateUtc="2026-10-10T21:17:00Z"/>
+          <w:ins w:id="28" w:author="Funes, Aaron" w:date="2026-10-10T14:17:00Z"/>
+        </w:rPr>
+      </w:pPr>
+    </w:p>
+    <w:p>
+      <w:pPr>
+        <w:rPr>
+          <w:ins w:id="29" w:author="Funes, Aaron" w:date="2026-10-10T14:17:00Z"/>
+        </w:rPr>
+      </w:pPr>
+    </w:p>
+    <w:p>
+      <w:pPr>
+        <w:rPr>
+          <w:ins w:id="30" w:author="Funes, Aaron" w:date="2026-10-10T14:17:00Z"/>
         </w:rPr>
       </w:pPr>
     </w:p>
@@ -309,36 +312,37 @@
       <w:pPr>
         <w:spacing w:after="0"/>
         <w:rPr>
-          <w:ins w:id="29" w:author="Funes, Aaron" w:date="2026-10-10T14:17:00Z" w16du:dateUtc="2026-10-10T21:17:00Z"/>
-        </w:rPr>
-      </w:pPr>
-      <w:ins w:id="30" w:author="Funes, Aaron" w:date="2026-10-10T14:17:00Z" w16du:dateUtc="2026-10-10T21:17:00Z">
-        <w:r>
-          <w:t>____________________________</w:t>
-        </w:r>
-        <w:proofErr w:type="gramStart"/>
-        <w:r>
-          <w:t>__</w:t>
-        </w:r>
-        <w:proofErr w:type="gramEnd"/>
-        <w:r>
-          <w:t>_</w:t>
+          <w:ins w:id="31" w:author="Funes, Aaron" w:date="2026-10-10T14:17:00Z"/>
+        </w:rPr>
+      </w:pPr>
+      <w:ins w:id="32" w:author="Funes, Aaron" w:date="2026-10-10T14:17:00Z">
+        <w:r>
+          <w:t>_______________________________</w:t>
         </w:r>
       </w:ins>
-      <w:ins w:id="31" w:author="Funes, Aaron" w:date="2026-10-10T14:18:00Z" w16du:dateUtc="2026-10-10T21:18:00Z">
-        <w:r>
-          <w:t xml:space="preserve">                                                                    _____________</w:t>
+      <w:ins w:id="33" w:author="Funes, Aaron" w:date="2026-10-10T14:18:00Z">
+        <w:r>
+          <w:t xml:space="preserve">                                                           </w:t>
         </w:r>
       </w:ins>
+      <w:r>
+        <w:tab/>
+        <w:t xml:space="preserve">   </w:t>
+      </w:r>
+      <w:ins w:id="34" w:author="Funes, Aaron" w:date="2026-10-10T14:18:00Z">
+        <w:r>
+          <w:t>_______</w:t>
+        </w:r>
+      </w:ins>
     </w:p>
     <w:p>
       <w:pPr>
         <w:spacing w:after="0"/>
         <w:rPr>
-          <w:ins w:id="32" w:author="Funes, Aaron" w:date="2026-10-10T14:32:00Z" w16du:dateUtc="2026-10-10T21:32:00Z"/>
-        </w:rPr>
-      </w:pPr>
-      <w:ins w:id="33" w:author="Funes, Aaron" w:date="2026-10-10T14:17:00Z" w16du:dateUtc="2026-10-10T21:17:00Z">
+          <w:ins w:id="35" w:author="Funes, Aaron" w:date="2026-10-10T14:32:00Z"/>
+        </w:rPr>
+      </w:pPr>
+      <w:ins w:id="36" w:author="Funes, Aaron" w:date="2026-10-10T14:17:00Z">
         <w:r>
           <w:t xml:space="preserve">Dr. </w:t>
         </w:r>
@@ -351,17 +355,17 @@
           <w:t xml:space="preserve"> Mirzaei</w:t>
         </w:r>
       </w:ins>
-      <w:ins w:id="34" w:author="Funes, Aaron" w:date="2026-10-10T14:19:00Z" w16du:dateUtc="2026-10-10T21:19:00Z">
+      <w:ins w:id="37" w:author="Funes, Aaron" w:date="2026-10-10T14:19:00Z">
         <w:r>
           <w:t>,</w:t>
         </w:r>
       </w:ins>
-      <w:ins w:id="35" w:author="Funes, Aaron" w:date="2026-10-10T14:20:00Z" w16du:dateUtc="2026-10-10T21:20:00Z">
+      <w:ins w:id="38" w:author="Funes, Aaron" w:date="2026-10-10T14:20:00Z">
         <w:r>
           <w:t xml:space="preserve"> Chair </w:t>
         </w:r>
       </w:ins>
-      <w:ins w:id="36" w:author="Funes, Aaron" w:date="2026-10-10T14:19:00Z" w16du:dateUtc="2026-10-10T21:19:00Z">
+      <w:ins w:id="39" w:author="Funes, Aaron" w:date="2026-10-10T14:19:00Z">
         <w:r>
           <w:t xml:space="preserve">                                                                                Date</w:t>
         </w:r>
@@ -370,10 +374,10 @@
     <w:p>
       <w:pPr>
         <w:rPr>
-          <w:ins w:id="37" w:author="Funes, Aaron" w:date="2026-10-10T14:32:00Z" w16du:dateUtc="2026-10-10T21:32:00Z"/>
-        </w:rPr>
-      </w:pPr>
-      <w:ins w:id="38" w:author="Funes, Aaron" w:date="2026-10-10T14:32:00Z" w16du:dateUtc="2026-10-10T21:32:00Z">
+          <w:ins w:id="40" w:author="Funes, Aaron" w:date="2026-10-10T14:32:00Z"/>
+        </w:rPr>
+      </w:pPr>
+      <w:ins w:id="41" w:author="Funes, Aaron" w:date="2026-10-10T14:32:00Z">
         <w:r>
           <w:br w:type="page"/>
         </w:r>
@@ -382,7 +386,7 @@
     <w:sdt>
       <w:sdtPr>
         <w:rPr>
-          <w:rFonts w:eastAsiaTheme="minorEastAsia" w:cs="Times New Roman"/>
+          <w:rFonts w:asciiTheme="minorHAnsi" w:eastAsiaTheme="minorEastAsia" w:hAnsiTheme="minorHAnsi" w:cs="Times New Roman"/>
           <w:b/>
           <w:bCs/>
           <w:color w:val="auto"/>
@@ -398,7 +402,6 @@
       </w:sdtPr>
       <w:sdtEndPr>
         <w:rPr>
-          <w:rFonts w:asciiTheme="minorHAnsi" w:hAnsiTheme="minorHAnsi"/>
           <w:b w:val="0"/>
           <w:bCs w:val="0"/>
         </w:rPr>
@@ -432,21 +435,7 @@
               <w:b/>
               <w:bCs/>
             </w:rPr>
-            <w:t>Signature Pa</w:t>
-          </w:r>
-          <w:r>
-            <w:rPr>
-              <w:b/>
-              <w:bCs/>
-            </w:rPr>
-            <w:t>g</w:t>
-          </w:r>
-          <w:r>
-            <w:rPr>
-              <w:b/>
-              <w:bCs/>
-            </w:rPr>
-            <w:t>e</w:t>
+            <w:t>Signature Page</w:t>
           </w:r>
           <w:r>
             <w:ptab w:relativeTo="margin" w:alignment="right" w:leader="dot"/>
@@ -503,21 +492,7 @@
               <w:b/>
               <w:bCs/>
             </w:rPr>
-            <w:t>List of</w:t>
-          </w:r>
-          <w:r>
-            <w:rPr>
-              <w:b/>
-              <w:bCs/>
-            </w:rPr>
-            <w:t xml:space="preserve"> </w:t>
-          </w:r>
-          <w:r>
-            <w:rPr>
-              <w:b/>
-              <w:bCs/>
-            </w:rPr>
-            <w:t>Figures</w:t>
+            <w:t>List of Figures</w:t>
           </w:r>
           <w:r>
             <w:fldChar w:fldCharType="end"/>
@@ -547,21 +522,7 @@
               <w:b/>
               <w:bCs/>
             </w:rPr>
-            <w:t>Abstra</w:t>
-          </w:r>
-          <w:r>
-            <w:rPr>
-              <w:b/>
-              <w:bCs/>
-            </w:rPr>
-            <w:t>c</w:t>
-          </w:r>
-          <w:r>
-            <w:rPr>
-              <w:b/>
-              <w:bCs/>
-            </w:rPr>
-            <w:t>t</w:t>
+            <w:t>Abstract</w:t>
           </w:r>
           <w:r>
             <w:fldChar w:fldCharType="end"/>
@@ -578,10 +539,41 @@
             <w:pStyle w:val="TOC1"/>
           </w:pPr>
           <w:r>
-            <w:t>1.</w:t>
+            <w:rPr>
+              <w:b/>
+            </w:rPr>
+            <w:fldChar w:fldCharType="begin"/>
           </w:r>
           <w:r>
+            <w:rPr>
+              <w:b/>
+            </w:rPr>
+            <w:instrText xml:space="preserve"> REF _Ref243463948 \h </w:instrText>
+          </w:r>
+          <w:r>
+            <w:rPr>
+              <w:b/>
+            </w:rPr>
+          </w:r>
+          <w:r>
+            <w:rPr>
+              <w:b/>
+            </w:rPr>
+            <w:fldChar w:fldCharType="separate"/>
+          </w:r>
+          <w:r>
+            <w:rPr>
+              <w:b/>
+              <w:bCs/>
+              <w:color w:val="000000" w:themeColor="text1"/>
+            </w:rPr>
             <w:t>Introduction</w:t>
+          </w:r>
+          <w:r>
+            <w:rPr>
+              <w:b/>
+            </w:rPr>
+            <w:fldChar w:fldCharType="end"/>
           </w:r>
           <w:r>
             <w:ptab w:relativeTo="margin" w:alignment="right" w:leader="dot"/>
@@ -593,18 +585,48 @@
         <w:p>
           <w:pPr>
             <w:pStyle w:val="TOC1"/>
+            <w:rPr>
+              <w:b/>
+            </w:rPr>
           </w:pPr>
           <w:r>
-            <w:t>2.</w:t>
+            <w:rPr>
+              <w:b/>
+            </w:rPr>
+            <w:fldChar w:fldCharType="begin"/>
           </w:r>
           <w:r>
-            <w:t xml:space="preserve">Design </w:t>
+            <w:instrText xml:space="preserve"> REF _Ref243463993 \h </w:instrText>
           </w:r>
           <w:r>
-            <w:t>Implementation</w:t>
+            <w:rPr>
+              <w:b/>
+            </w:rPr>
+          </w:r>
+          <w:r>
+            <w:rPr>
+              <w:b/>
+            </w:rPr>
+            <w:fldChar w:fldCharType="separate"/>
+          </w:r>
+          <w:r>
+            <w:rPr>
+              <w:b/>
+              <w:bCs/>
+            </w:rPr>
+            <w:t>Design Implementation</w:t>
+          </w:r>
+          <w:r>
+            <w:rPr>
+              <w:b/>
+            </w:rPr>
+            <w:fldChar w:fldCharType="end"/>
           </w:r>
           <w:r>
             <w:ptab w:relativeTo="margin" w:alignment="right" w:leader="dot"/>
+          </w:r>
+          <w:r>
+            <w:t>4</w:t>
           </w:r>
         </w:p>
         <w:p>
@@ -612,11 +634,17 @@
             <w:pStyle w:val="TOC1"/>
           </w:pPr>
           <w:r>
+            <w:rPr>
+              <w:b/>
+            </w:rPr>
             <w:t>Results</w:t>
           </w:r>
           <w:r>
             <w:ptab w:relativeTo="margin" w:alignment="right" w:leader="dot"/>
           </w:r>
+          <w:r>
+            <w:t>7</w:t>
+          </w:r>
         </w:p>
       </w:sdtContent>
     </w:sdt>
@@ -636,7 +664,7 @@
           <w:color w:val="auto"/>
         </w:rPr>
       </w:pPr>
-      <w:bookmarkStart w:id="39" w:name="_Ref243416515"/>
+      <w:bookmarkStart w:id="42" w:name="_Ref243416515"/>
       <w:r>
         <w:rPr>
           <w:b/>
@@ -646,44 +674,7 @@
         <w:lastRenderedPageBreak/>
         <w:t>List of Tables</w:t>
       </w:r>
-      <w:bookmarkEnd w:id="39"/>
-    </w:p>
-    <w:p>
-      <w:fldSimple w:instr=" TOC \h \z \c &quot;Table&quot; ">
-        <w:r>
-          <w:rPr>
-            <w:b/>
-            <w:bCs/>
-            <w:noProof/>
-          </w:rPr>
-          <w:t>No table of figures entries found.</w:t>
-        </w:r>
-      </w:fldSimple>
-      <w:r>
-        <w:br w:type="page"/>
-      </w:r>
-    </w:p>
-    <w:p>
-      <w:pPr>
-        <w:pStyle w:val="Heading1"/>
-        <w:jc w:val="center"/>
-        <w:rPr>
-          <w:b/>
-          <w:bCs/>
-          <w:color w:val="auto"/>
-        </w:rPr>
-      </w:pPr>
-      <w:bookmarkStart w:id="40" w:name="_Ref243416578"/>
-      <w:r>
-        <w:rPr>
-          <w:b/>
-          <w:bCs/>
-          <w:color w:val="auto"/>
-        </w:rPr>
-        <w:lastRenderedPageBreak/>
-        <w:t>List of Figures</w:t>
-      </w:r>
-      <w:bookmarkEnd w:id="40"/>
+      <w:bookmarkEnd w:id="42"/>
     </w:p>
     <w:p>
       <w:pPr>
@@ -700,18 +691,19 @@
         <w:fldChar w:fldCharType="begin"/>
       </w:r>
       <w:r>
-        <w:instrText xml:space="preserve"> TOC \h \z \c "Figure" </w:instrText>
+        <w:instrText xml:space="preserve"> TOC \h \z \c "Table" </w:instrText>
       </w:r>
       <w:r>
         <w:fldChar w:fldCharType="separate"/>
       </w:r>
-      <w:hyperlink w:anchor="_Toc243417049" w:history="1">
+      <w:hyperlink w:anchor="_Toc243843887" w:history="1">
         <w:r>
           <w:rPr>
             <w:rStyle w:val="Hyperlink"/>
-            <w:noProof/>
-          </w:rPr>
-          <w:t>Figure 1 : Original Image</w:t>
+            <w:b/>
+            <w:noProof/>
+          </w:rPr>
+          <w:t>Table 1 : Bit Range Definition</w:t>
         </w:r>
         <w:r>
           <w:rPr>
@@ -732,7 +724,7 @@
             <w:noProof/>
             <w:webHidden/>
           </w:rPr>
-          <w:instrText xml:space="preserve"> PAGEREF _Toc243417049 \h </w:instrText>
+          <w:instrText xml:space="preserve"> PAGEREF _Toc243843887 \h </w:instrText>
         </w:r>
         <w:r>
           <w:rPr>
@@ -752,7 +744,7 @@
             <w:noProof/>
             <w:webHidden/>
           </w:rPr>
-          <w:t>1</w:t>
+          <w:t>5</w:t>
         </w:r>
         <w:r>
           <w:rPr>
@@ -762,6 +754,41 @@
           <w:fldChar w:fldCharType="end"/>
         </w:r>
       </w:hyperlink>
+    </w:p>
+    <w:p>
+      <w:r>
+        <w:rPr>
+          <w:b/>
+          <w:bCs/>
+          <w:noProof/>
+        </w:rPr>
+        <w:fldChar w:fldCharType="end"/>
+      </w:r>
+      <w:r>
+        <w:br w:type="page"/>
+      </w:r>
+    </w:p>
+    <w:p>
+      <w:pPr>
+        <w:pStyle w:val="Heading1"/>
+        <w:jc w:val="center"/>
+        <w:rPr>
+          <w:b/>
+          <w:bCs/>
+          <w:color w:val="auto"/>
+        </w:rPr>
+      </w:pPr>
+      <w:bookmarkStart w:id="43" w:name="_Ref243416578"/>
+      <w:r>
+        <w:rPr>
+          <w:b/>
+          <w:bCs/>
+          <w:color w:val="auto"/>
+        </w:rPr>
+        <w:lastRenderedPageBreak/>
+        <w:t>List of Figures</w:t>
+      </w:r>
+      <w:bookmarkEnd w:id="43"/>
     </w:p>
     <w:p>
       <w:pPr>
@@ -774,13 +801,23 @@
           <w:noProof/>
         </w:rPr>
       </w:pPr>
-      <w:hyperlink w:anchor="_Toc243417050" w:history="1">
+      <w:r>
+        <w:fldChar w:fldCharType="begin"/>
+      </w:r>
+      <w:r>
+        <w:instrText xml:space="preserve"> TOC \h \z \c "Figure" </w:instrText>
+      </w:r>
+      <w:r>
+        <w:fldChar w:fldCharType="separate"/>
+      </w:r>
+      <w:hyperlink w:anchor="_Toc243843889" w:history="1">
         <w:r>
           <w:rPr>
             <w:rStyle w:val="Hyperlink"/>
-            <w:noProof/>
-          </w:rPr>
-          <w:t>Figure 2 : Post-processed image with edge detection applied</w:t>
+            <w:b/>
+            <w:noProof/>
+          </w:rPr>
+          <w:t>Figure 1 : Original Image</w:t>
         </w:r>
         <w:r>
           <w:rPr>
@@ -801,7 +838,7 @@
             <w:noProof/>
             <w:webHidden/>
           </w:rPr>
-          <w:instrText xml:space="preserve"> PAGEREF _Toc243417050 \h </w:instrText>
+          <w:instrText xml:space="preserve"> PAGEREF _Toc243843889 \h </w:instrText>
         </w:r>
         <w:r>
           <w:rPr>
@@ -843,13 +880,14 @@
           <w:noProof/>
         </w:rPr>
       </w:pPr>
-      <w:hyperlink w:anchor="_Toc243417051" w:history="1">
+      <w:hyperlink w:anchor="_Toc243843890" w:history="1">
         <w:r>
           <w:rPr>
             <w:rStyle w:val="Hyperlink"/>
-            <w:noProof/>
-          </w:rPr>
-          <w:t>Figure 3: X and Y Filter</w:t>
+            <w:b/>
+            <w:noProof/>
+          </w:rPr>
+          <w:t>Figure 2 : Post-processed image with edge detection applied</w:t>
         </w:r>
         <w:r>
           <w:rPr>
@@ -870,7 +908,7 @@
             <w:noProof/>
             <w:webHidden/>
           </w:rPr>
-          <w:instrText xml:space="preserve"> PAGEREF _Toc243417051 \h </w:instrText>
+          <w:instrText xml:space="preserve"> PAGEREF _Toc243843890 \h </w:instrText>
         </w:r>
         <w:r>
           <w:rPr>
@@ -890,7 +928,7 @@
             <w:noProof/>
             <w:webHidden/>
           </w:rPr>
-          <w:t>2</w:t>
+          <w:t>1</w:t>
         </w:r>
         <w:r>
           <w:rPr>
@@ -912,13 +950,14 @@
           <w:noProof/>
         </w:rPr>
       </w:pPr>
-      <w:hyperlink w:anchor="_Toc243417052" w:history="1">
+      <w:hyperlink w:anchor="_Toc243843891" w:history="1">
         <w:r>
           <w:rPr>
             <w:rStyle w:val="Hyperlink"/>
-            <w:noProof/>
-          </w:rPr>
-          <w:t>Figure 4 : Filter Operation</w:t>
+            <w:b/>
+            <w:noProof/>
+          </w:rPr>
+          <w:t>Figure 3: X and Y Filter</w:t>
         </w:r>
         <w:r>
           <w:rPr>
@@ -939,7 +978,7 @@
             <w:noProof/>
             <w:webHidden/>
           </w:rPr>
-          <w:instrText xml:space="preserve"> PAGEREF _Toc243417052 \h </w:instrText>
+          <w:instrText xml:space="preserve"> PAGEREF _Toc243843891 \h </w:instrText>
         </w:r>
         <w:r>
           <w:rPr>
@@ -981,13 +1020,14 @@
           <w:noProof/>
         </w:rPr>
       </w:pPr>
-      <w:hyperlink w:anchor="_Toc243417053" w:history="1">
+      <w:hyperlink w:anchor="_Toc243843892" w:history="1">
         <w:r>
           <w:rPr>
             <w:rStyle w:val="Hyperlink"/>
-            <w:noProof/>
-          </w:rPr>
-          <w:t>Figure 5: Zybo Block Diagram</w:t>
+            <w:b/>
+            <w:noProof/>
+          </w:rPr>
+          <w:t>Figure 4 : Filter Operation</w:t>
         </w:r>
         <w:r>
           <w:rPr>
@@ -1008,7 +1048,7 @@
             <w:noProof/>
             <w:webHidden/>
           </w:rPr>
-          <w:instrText xml:space="preserve"> PAGEREF _Toc243417053 \h </w:instrText>
+          <w:instrText xml:space="preserve"> PAGEREF _Toc243843892 \h </w:instrText>
         </w:r>
         <w:r>
           <w:rPr>
@@ -1028,7 +1068,7 @@
             <w:noProof/>
             <w:webHidden/>
           </w:rPr>
-          <w:t>3</w:t>
+          <w:t>2</w:t>
         </w:r>
         <w:r>
           <w:rPr>
@@ -1050,27 +1090,154 @@
           <w:noProof/>
         </w:rPr>
       </w:pPr>
-      <w:hyperlink w:anchor="_Toc243417054" w:history="1">
+      <w:hyperlink w:anchor="_Toc243843893" w:history="1">
         <w:r>
           <w:rPr>
             <w:rStyle w:val="Hyperlink"/>
-            <w:noProof/>
-          </w:rPr>
-          <w:t xml:space="preserve">Figure 6: </w:t>
-        </w:r>
+            <w:b/>
+            <w:noProof/>
+          </w:rPr>
+          <w:t>Figure 5: Zybo Block Diagram</w:t>
+        </w:r>
+        <w:r>
+          <w:rPr>
+            <w:noProof/>
+            <w:webHidden/>
+          </w:rPr>
+          <w:tab/>
+        </w:r>
+        <w:r>
+          <w:rPr>
+            <w:noProof/>
+            <w:webHidden/>
+          </w:rPr>
+          <w:fldChar w:fldCharType="begin"/>
+        </w:r>
+        <w:r>
+          <w:rPr>
+            <w:noProof/>
+            <w:webHidden/>
+          </w:rPr>
+          <w:instrText xml:space="preserve"> PAGEREF _Toc243843893 \h </w:instrText>
+        </w:r>
+        <w:r>
+          <w:rPr>
+            <w:noProof/>
+            <w:webHidden/>
+          </w:rPr>
+        </w:r>
+        <w:r>
+          <w:rPr>
+            <w:noProof/>
+            <w:webHidden/>
+          </w:rPr>
+          <w:fldChar w:fldCharType="separate"/>
+        </w:r>
+        <w:r>
+          <w:rPr>
+            <w:noProof/>
+            <w:webHidden/>
+          </w:rPr>
+          <w:t>3</w:t>
+        </w:r>
+        <w:r>
+          <w:rPr>
+            <w:noProof/>
+            <w:webHidden/>
+          </w:rPr>
+          <w:fldChar w:fldCharType="end"/>
+        </w:r>
+      </w:hyperlink>
+    </w:p>
+    <w:p>
+      <w:pPr>
+        <w:pStyle w:val="TableofFigures"/>
+        <w:tabs>
+          <w:tab w:val="right" w:leader="dot" w:pos="9350"/>
+        </w:tabs>
+        <w:rPr>
+          <w:rFonts w:eastAsiaTheme="minorEastAsia"/>
+          <w:noProof/>
+        </w:rPr>
+      </w:pPr>
+      <w:hyperlink w:anchor="_Toc243843894" w:history="1">
         <w:r>
           <w:rPr>
             <w:rStyle w:val="Hyperlink"/>
-            <w:noProof/>
-          </w:rPr>
-          <w:t>S</w:t>
-        </w:r>
+            <w:b/>
+            <w:noProof/>
+          </w:rPr>
+          <w:t>Figure 6 : Grey Scale Range</w:t>
+        </w:r>
+        <w:r>
+          <w:rPr>
+            <w:noProof/>
+            <w:webHidden/>
+          </w:rPr>
+          <w:tab/>
+        </w:r>
+        <w:r>
+          <w:rPr>
+            <w:noProof/>
+            <w:webHidden/>
+          </w:rPr>
+          <w:fldChar w:fldCharType="begin"/>
+        </w:r>
+        <w:r>
+          <w:rPr>
+            <w:noProof/>
+            <w:webHidden/>
+          </w:rPr>
+          <w:instrText xml:space="preserve"> PAGEREF _Toc243843894 \h </w:instrText>
+        </w:r>
+        <w:r>
+          <w:rPr>
+            <w:noProof/>
+            <w:webHidden/>
+          </w:rPr>
+        </w:r>
+        <w:r>
+          <w:rPr>
+            <w:noProof/>
+            <w:webHidden/>
+          </w:rPr>
+          <w:fldChar w:fldCharType="separate"/>
+        </w:r>
+        <w:r>
+          <w:rPr>
+            <w:noProof/>
+            <w:webHidden/>
+          </w:rPr>
+          <w:t>3</w:t>
+        </w:r>
+        <w:r>
+          <w:rPr>
+            <w:noProof/>
+            <w:webHidden/>
+          </w:rPr>
+          <w:fldChar w:fldCharType="end"/>
+        </w:r>
+      </w:hyperlink>
+    </w:p>
+    <w:p>
+      <w:pPr>
+        <w:pStyle w:val="TableofFigures"/>
+        <w:tabs>
+          <w:tab w:val="right" w:leader="dot" w:pos="9350"/>
+        </w:tabs>
+        <w:rPr>
+          <w:rFonts w:eastAsiaTheme="minorEastAsia"/>
+          <w:noProof/>
+        </w:rPr>
+      </w:pPr>
+      <w:hyperlink w:anchor="_Toc243843895" w:history="1">
         <w:r>
           <w:rPr>
             <w:rStyle w:val="Hyperlink"/>
-            <w:noProof/>
-          </w:rPr>
-          <w:t>obel Filter Block Design</w:t>
+            <w:b/>
+            <w:noProof/>
+          </w:rPr>
+          <w:t>Figure 7: Sobel Filter Block Design</w:t>
         </w:r>
         <w:r>
           <w:rPr>
@@ -1091,7 +1258,7 @@
             <w:noProof/>
             <w:webHidden/>
           </w:rPr>
-          <w:instrText xml:space="preserve"> PAGEREF _Toc243417054 \h </w:instrText>
+          <w:instrText xml:space="preserve"> PAGEREF _Toc243843895 \h </w:instrText>
         </w:r>
         <w:r>
           <w:rPr>
@@ -1112,6 +1279,219 @@
             <w:webHidden/>
           </w:rPr>
           <w:t>4</w:t>
+        </w:r>
+        <w:r>
+          <w:rPr>
+            <w:noProof/>
+            <w:webHidden/>
+          </w:rPr>
+          <w:fldChar w:fldCharType="end"/>
+        </w:r>
+      </w:hyperlink>
+    </w:p>
+    <w:p>
+      <w:pPr>
+        <w:pStyle w:val="TableofFigures"/>
+        <w:tabs>
+          <w:tab w:val="right" w:leader="dot" w:pos="9350"/>
+        </w:tabs>
+        <w:rPr>
+          <w:rFonts w:eastAsiaTheme="minorEastAsia"/>
+          <w:noProof/>
+        </w:rPr>
+      </w:pPr>
+      <w:hyperlink w:anchor="_Toc243843896" w:history="1">
+        <w:r>
+          <w:rPr>
+            <w:rStyle w:val="Hyperlink"/>
+            <w:b/>
+            <w:bCs/>
+            <w:noProof/>
+          </w:rPr>
+          <w:t>Figure 8: Sobel Filter State Diagram</w:t>
+        </w:r>
+        <w:r>
+          <w:rPr>
+            <w:noProof/>
+            <w:webHidden/>
+          </w:rPr>
+          <w:tab/>
+        </w:r>
+        <w:r>
+          <w:rPr>
+            <w:noProof/>
+            <w:webHidden/>
+          </w:rPr>
+          <w:fldChar w:fldCharType="begin"/>
+        </w:r>
+        <w:r>
+          <w:rPr>
+            <w:noProof/>
+            <w:webHidden/>
+          </w:rPr>
+          <w:instrText xml:space="preserve"> PAGEREF _Toc243843896 \h </w:instrText>
+        </w:r>
+        <w:r>
+          <w:rPr>
+            <w:noProof/>
+            <w:webHidden/>
+          </w:rPr>
+        </w:r>
+        <w:r>
+          <w:rPr>
+            <w:noProof/>
+            <w:webHidden/>
+          </w:rPr>
+          <w:fldChar w:fldCharType="separate"/>
+        </w:r>
+        <w:r>
+          <w:rPr>
+            <w:noProof/>
+            <w:webHidden/>
+          </w:rPr>
+          <w:t>4</w:t>
+        </w:r>
+        <w:r>
+          <w:rPr>
+            <w:noProof/>
+            <w:webHidden/>
+          </w:rPr>
+          <w:fldChar w:fldCharType="end"/>
+        </w:r>
+      </w:hyperlink>
+    </w:p>
+    <w:p>
+      <w:pPr>
+        <w:pStyle w:val="TableofFigures"/>
+        <w:tabs>
+          <w:tab w:val="right" w:leader="dot" w:pos="9350"/>
+        </w:tabs>
+        <w:rPr>
+          <w:rFonts w:eastAsiaTheme="minorEastAsia"/>
+          <w:noProof/>
+        </w:rPr>
+      </w:pPr>
+      <w:hyperlink w:anchor="_Toc243843897" w:history="1">
+        <w:r>
+          <w:rPr>
+            <w:rStyle w:val="Hyperlink"/>
+            <w:b/>
+            <w:bCs/>
+            <w:noProof/>
+          </w:rPr>
+          <w:t>Figure 9: Sobel X &amp; Y State Machine Diagram</w:t>
+        </w:r>
+        <w:r>
+          <w:rPr>
+            <w:noProof/>
+            <w:webHidden/>
+          </w:rPr>
+          <w:tab/>
+        </w:r>
+        <w:r>
+          <w:rPr>
+            <w:noProof/>
+            <w:webHidden/>
+          </w:rPr>
+          <w:fldChar w:fldCharType="begin"/>
+        </w:r>
+        <w:r>
+          <w:rPr>
+            <w:noProof/>
+            <w:webHidden/>
+          </w:rPr>
+          <w:instrText xml:space="preserve"> PAGEREF _Toc243843897 \h </w:instrText>
+        </w:r>
+        <w:r>
+          <w:rPr>
+            <w:noProof/>
+            <w:webHidden/>
+          </w:rPr>
+        </w:r>
+        <w:r>
+          <w:rPr>
+            <w:noProof/>
+            <w:webHidden/>
+          </w:rPr>
+          <w:fldChar w:fldCharType="separate"/>
+        </w:r>
+        <w:r>
+          <w:rPr>
+            <w:noProof/>
+            <w:webHidden/>
+          </w:rPr>
+          <w:t>5</w:t>
+        </w:r>
+        <w:r>
+          <w:rPr>
+            <w:noProof/>
+            <w:webHidden/>
+          </w:rPr>
+          <w:fldChar w:fldCharType="end"/>
+        </w:r>
+      </w:hyperlink>
+    </w:p>
+    <w:p>
+      <w:pPr>
+        <w:pStyle w:val="TableofFigures"/>
+        <w:tabs>
+          <w:tab w:val="right" w:leader="dot" w:pos="9350"/>
+        </w:tabs>
+        <w:rPr>
+          <w:rFonts w:eastAsiaTheme="minorEastAsia"/>
+          <w:noProof/>
+        </w:rPr>
+      </w:pPr>
+      <w:hyperlink w:anchor="_Toc243843898" w:history="1">
+        <w:r>
+          <w:rPr>
+            <w:rStyle w:val="Hyperlink"/>
+            <w:b/>
+            <w:bCs/>
+            <w:noProof/>
+          </w:rPr>
+          <w:t>Figure 10 : Overflow Logic</w:t>
+        </w:r>
+        <w:r>
+          <w:rPr>
+            <w:noProof/>
+            <w:webHidden/>
+          </w:rPr>
+          <w:tab/>
+        </w:r>
+        <w:r>
+          <w:rPr>
+            <w:noProof/>
+            <w:webHidden/>
+          </w:rPr>
+          <w:fldChar w:fldCharType="begin"/>
+        </w:r>
+        <w:r>
+          <w:rPr>
+            <w:noProof/>
+            <w:webHidden/>
+          </w:rPr>
+          <w:instrText xml:space="preserve"> PAGEREF _Toc243843898 \h </w:instrText>
+        </w:r>
+        <w:r>
+          <w:rPr>
+            <w:noProof/>
+            <w:webHidden/>
+          </w:rPr>
+        </w:r>
+        <w:r>
+          <w:rPr>
+            <w:noProof/>
+            <w:webHidden/>
+          </w:rPr>
+          <w:fldChar w:fldCharType="separate"/>
+        </w:r>
+        <w:r>
+          <w:rPr>
+            <w:noProof/>
+            <w:webHidden/>
+          </w:rPr>
+          <w:t>6</w:t>
         </w:r>
         <w:r>
           <w:rPr>
@@ -1294,7 +1674,7 @@
           <w:color w:val="auto"/>
         </w:rPr>
       </w:pPr>
-      <w:bookmarkStart w:id="41" w:name="_Ref243416590"/>
+      <w:bookmarkStart w:id="44" w:name="_Ref243416590"/>
       <w:r>
         <w:rPr>
           <w:b/>
@@ -1304,7 +1684,7 @@
         <w:lastRenderedPageBreak/>
         <w:t>Abstract</w:t>
       </w:r>
-      <w:bookmarkEnd w:id="41"/>
+      <w:bookmarkEnd w:id="44"/>
     </w:p>
     <w:p>
       <w:pPr>
@@ -1388,16 +1768,14 @@
     <w:p>
       <w:pPr>
         <w:pStyle w:val="Heading1"/>
-        <w:numPr>
-          <w:ilvl w:val="0"/>
-          <w:numId w:val="2"/>
-        </w:numPr>
+        <w:ind w:left="720"/>
         <w:rPr>
           <w:b/>
           <w:bCs/>
           <w:color w:val="000000" w:themeColor="text1"/>
         </w:rPr>
       </w:pPr>
+      <w:bookmarkStart w:id="45" w:name="_Ref243463948"/>
       <w:r>
         <w:rPr>
           <w:b/>
@@ -1407,6 +1785,7 @@
         <w:lastRenderedPageBreak/>
         <w:t>Introduction</w:t>
       </w:r>
+      <w:bookmarkEnd w:id="45"/>
     </w:p>
     <w:p>
       <w:pPr>
@@ -1563,17 +1942,19 @@
         <w:pStyle w:val="Caption"/>
         <w:jc w:val="center"/>
         <w:rPr>
-          <w:i w:val="0"/>
-          <w:iCs w:val="0"/>
-          <w:color w:val="000000" w:themeColor="text1"/>
-          <w:sz w:val="24"/>
-          <w:szCs w:val="24"/>
-        </w:rPr>
-      </w:pPr>
-      <w:bookmarkStart w:id="42" w:name="_Ref242543934"/>
-      <w:bookmarkStart w:id="43" w:name="_Toc243417049"/>
-      <w:r>
-        <w:rPr>
+          <w:b/>
+          <w:i w:val="0"/>
+          <w:iCs w:val="0"/>
+          <w:color w:val="000000" w:themeColor="text1"/>
+          <w:sz w:val="24"/>
+          <w:szCs w:val="24"/>
+        </w:rPr>
+      </w:pPr>
+      <w:bookmarkStart w:id="46" w:name="_Ref242543934"/>
+      <w:bookmarkStart w:id="47" w:name="_Toc243843889"/>
+      <w:r>
+        <w:rPr>
+          <w:b/>
           <w:i w:val="0"/>
           <w:iCs w:val="0"/>
           <w:color w:val="000000" w:themeColor="text1"/>
@@ -1584,6 +1965,7 @@
       </w:r>
       <w:r>
         <w:rPr>
+          <w:b/>
           <w:i w:val="0"/>
           <w:iCs w:val="0"/>
           <w:color w:val="000000" w:themeColor="text1"/>
@@ -1594,6 +1976,7 @@
       </w:r>
       <w:r>
         <w:rPr>
+          <w:b/>
           <w:i w:val="0"/>
           <w:iCs w:val="0"/>
           <w:color w:val="000000" w:themeColor="text1"/>
@@ -1604,6 +1987,7 @@
       </w:r>
       <w:r>
         <w:rPr>
+          <w:b/>
           <w:i w:val="0"/>
           <w:iCs w:val="0"/>
           <w:color w:val="000000" w:themeColor="text1"/>
@@ -1614,6 +1998,7 @@
       </w:r>
       <w:r>
         <w:rPr>
+          <w:b/>
           <w:i w:val="0"/>
           <w:iCs w:val="0"/>
           <w:noProof/>
@@ -1625,6 +2010,7 @@
       </w:r>
       <w:r>
         <w:rPr>
+          <w:b/>
           <w:i w:val="0"/>
           <w:iCs w:val="0"/>
           <w:color w:val="000000" w:themeColor="text1"/>
@@ -1633,9 +2019,10 @@
         </w:rPr>
         <w:fldChar w:fldCharType="end"/>
       </w:r>
-      <w:bookmarkEnd w:id="42"/>
-      <w:r>
-        <w:rPr>
+      <w:bookmarkEnd w:id="46"/>
+      <w:r>
+        <w:rPr>
+          <w:b/>
           <w:i w:val="0"/>
           <w:iCs w:val="0"/>
           <w:color w:val="000000" w:themeColor="text1"/>
@@ -1644,7 +2031,7 @@
         </w:rPr>
         <w:t xml:space="preserve"> : Original Image</w:t>
       </w:r>
-      <w:bookmarkEnd w:id="43"/>
+      <w:bookmarkEnd w:id="47"/>
     </w:p>
     <w:p>
       <w:pPr>
@@ -1712,17 +2099,19 @@
         <w:pStyle w:val="Caption"/>
         <w:jc w:val="center"/>
         <w:rPr>
-          <w:i w:val="0"/>
-          <w:iCs w:val="0"/>
-          <w:color w:val="000000" w:themeColor="text1"/>
-          <w:sz w:val="24"/>
-          <w:szCs w:val="24"/>
-        </w:rPr>
-      </w:pPr>
-      <w:bookmarkStart w:id="44" w:name="_Ref242543947"/>
-      <w:bookmarkStart w:id="45" w:name="_Toc243417050"/>
-      <w:r>
-        <w:rPr>
+          <w:b/>
+          <w:i w:val="0"/>
+          <w:iCs w:val="0"/>
+          <w:color w:val="000000" w:themeColor="text1"/>
+          <w:sz w:val="24"/>
+          <w:szCs w:val="24"/>
+        </w:rPr>
+      </w:pPr>
+      <w:bookmarkStart w:id="48" w:name="_Ref242543947"/>
+      <w:bookmarkStart w:id="49" w:name="_Toc243843890"/>
+      <w:r>
+        <w:rPr>
+          <w:b/>
           <w:i w:val="0"/>
           <w:iCs w:val="0"/>
           <w:color w:val="000000" w:themeColor="text1"/>
@@ -1733,6 +2122,7 @@
       </w:r>
       <w:r>
         <w:rPr>
+          <w:b/>
           <w:i w:val="0"/>
           <w:iCs w:val="0"/>
           <w:color w:val="000000" w:themeColor="text1"/>
@@ -1743,6 +2133,7 @@
       </w:r>
       <w:r>
         <w:rPr>
+          <w:b/>
           <w:i w:val="0"/>
           <w:iCs w:val="0"/>
           <w:color w:val="000000" w:themeColor="text1"/>
@@ -1753,6 +2144,7 @@
       </w:r>
       <w:r>
         <w:rPr>
+          <w:b/>
           <w:i w:val="0"/>
           <w:iCs w:val="0"/>
           <w:color w:val="000000" w:themeColor="text1"/>
@@ -1763,6 +2155,7 @@
       </w:r>
       <w:r>
         <w:rPr>
+          <w:b/>
           <w:i w:val="0"/>
           <w:iCs w:val="0"/>
           <w:noProof/>
@@ -1774,6 +2167,7 @@
       </w:r>
       <w:r>
         <w:rPr>
+          <w:b/>
           <w:i w:val="0"/>
           <w:iCs w:val="0"/>
           <w:color w:val="000000" w:themeColor="text1"/>
@@ -1782,9 +2176,10 @@
         </w:rPr>
         <w:fldChar w:fldCharType="end"/>
       </w:r>
-      <w:bookmarkEnd w:id="44"/>
-      <w:r>
-        <w:rPr>
+      <w:bookmarkEnd w:id="48"/>
+      <w:r>
+        <w:rPr>
+          <w:b/>
           <w:i w:val="0"/>
           <w:iCs w:val="0"/>
           <w:color w:val="000000" w:themeColor="text1"/>
@@ -1793,7 +2188,7 @@
         </w:rPr>
         <w:t xml:space="preserve"> : Post-processed image with edge detection applied</w:t>
       </w:r>
-      <w:bookmarkEnd w:id="45"/>
+      <w:bookmarkEnd w:id="49"/>
     </w:p>
     <w:p>
       <w:r>
@@ -1948,17 +2343,19 @@
         <w:pStyle w:val="Caption"/>
         <w:jc w:val="center"/>
         <w:rPr>
-          <w:i w:val="0"/>
-          <w:iCs w:val="0"/>
-          <w:color w:val="000000" w:themeColor="text1"/>
-          <w:sz w:val="24"/>
-          <w:szCs w:val="24"/>
-        </w:rPr>
-      </w:pPr>
-      <w:bookmarkStart w:id="46" w:name="_Ref242543517"/>
-      <w:bookmarkStart w:id="47" w:name="_Toc243417051"/>
-      <w:r>
-        <w:rPr>
+          <w:b/>
+          <w:i w:val="0"/>
+          <w:iCs w:val="0"/>
+          <w:color w:val="000000" w:themeColor="text1"/>
+          <w:sz w:val="24"/>
+          <w:szCs w:val="24"/>
+        </w:rPr>
+      </w:pPr>
+      <w:bookmarkStart w:id="50" w:name="_Ref242543517"/>
+      <w:bookmarkStart w:id="51" w:name="_Toc243843891"/>
+      <w:r>
+        <w:rPr>
+          <w:b/>
           <w:i w:val="0"/>
           <w:iCs w:val="0"/>
           <w:color w:val="000000" w:themeColor="text1"/>
@@ -1969,6 +2366,7 @@
       </w:r>
       <w:r>
         <w:rPr>
+          <w:b/>
           <w:i w:val="0"/>
           <w:iCs w:val="0"/>
           <w:color w:val="000000" w:themeColor="text1"/>
@@ -1979,6 +2377,7 @@
       </w:r>
       <w:r>
         <w:rPr>
+          <w:b/>
           <w:i w:val="0"/>
           <w:iCs w:val="0"/>
           <w:color w:val="000000" w:themeColor="text1"/>
@@ -1989,6 +2388,7 @@
       </w:r>
       <w:r>
         <w:rPr>
+          <w:b/>
           <w:i w:val="0"/>
           <w:iCs w:val="0"/>
           <w:color w:val="000000" w:themeColor="text1"/>
@@ -1999,6 +2399,7 @@
       </w:r>
       <w:r>
         <w:rPr>
+          <w:b/>
           <w:i w:val="0"/>
           <w:iCs w:val="0"/>
           <w:noProof/>
@@ -2010,6 +2411,7 @@
       </w:r>
       <w:r>
         <w:rPr>
+          <w:b/>
           <w:i w:val="0"/>
           <w:iCs w:val="0"/>
           <w:color w:val="000000" w:themeColor="text1"/>
@@ -2018,9 +2420,10 @@
         </w:rPr>
         <w:fldChar w:fldCharType="end"/>
       </w:r>
-      <w:bookmarkEnd w:id="46"/>
-      <w:r>
-        <w:rPr>
+      <w:bookmarkEnd w:id="50"/>
+      <w:r>
+        <w:rPr>
+          <w:b/>
           <w:i w:val="0"/>
           <w:iCs w:val="0"/>
           <w:color w:val="000000" w:themeColor="text1"/>
@@ -2029,7 +2432,54 @@
         </w:rPr>
         <w:t>: X and Y Filter</w:t>
       </w:r>
-      <w:bookmarkEnd w:id="47"/>
+      <w:bookmarkEnd w:id="51"/>
+    </w:p>
+    <w:p>
+      <w:r>
+        <w:t>To apply the derivative, weights are multiplied to each pixel location with the upper row being pixels (0,0), (0,1), (0,2), where the designation is (</w:t>
+      </w:r>
+      <w:proofErr w:type="spellStart"/>
+      <w:proofErr w:type="gramStart"/>
+      <w:r>
+        <w:t>row,column</w:t>
+      </w:r>
+      <w:proofErr w:type="spellEnd"/>
+      <w:proofErr w:type="gramEnd"/>
+      <w:r>
+        <w:t xml:space="preserve">). Once all the weights are applied to each pixel </w:t>
+      </w:r>
+      <w:proofErr w:type="gramStart"/>
+      <w:r>
+        <w:t>location</w:t>
+      </w:r>
+      <w:proofErr w:type="gramEnd"/>
+      <w:r>
+        <w:t xml:space="preserve"> they are summed providing the associated out</w:t>
+      </w:r>
+      <w:r>
+        <w:t>put</w:t>
+      </w:r>
+      <w:r>
+        <w:t xml:space="preserve"> value for G</w:t>
+      </w:r>
+      <w:r>
+        <w:rPr>
+          <w:vertAlign w:val="subscript"/>
+        </w:rPr>
+        <w:t>x</w:t>
+      </w:r>
+      <w:r>
+        <w:t xml:space="preserve"> or G</w:t>
+      </w:r>
+      <w:r>
+        <w:rPr>
+          <w:vertAlign w:val="subscript"/>
+        </w:rPr>
+        <w:t>y</w:t>
+      </w:r>
+      <w:r>
+        <w:t>.</w:t>
+      </w:r>
     </w:p>
     <w:p>
       <w:r>
@@ -2143,18 +2593,22 @@
         <w:pStyle w:val="Caption"/>
         <w:jc w:val="center"/>
         <w:rPr>
-          <w:i w:val="0"/>
-          <w:iCs w:val="0"/>
-          <w:sz w:val="24"/>
-          <w:szCs w:val="24"/>
-        </w:rPr>
-      </w:pPr>
-      <w:bookmarkStart w:id="48" w:name="_Ref242546529"/>
-      <w:bookmarkStart w:id="49" w:name="_Toc243417052"/>
-      <w:r>
-        <w:rPr>
-          <w:i w:val="0"/>
-          <w:iCs w:val="0"/>
+          <w:b/>
+          <w:i w:val="0"/>
+          <w:iCs w:val="0"/>
+          <w:color w:val="000000" w:themeColor="text1"/>
+          <w:sz w:val="24"/>
+          <w:szCs w:val="24"/>
+        </w:rPr>
+      </w:pPr>
+      <w:bookmarkStart w:id="52" w:name="_Ref242546529"/>
+      <w:bookmarkStart w:id="53" w:name="_Toc243843892"/>
+      <w:r>
+        <w:rPr>
+          <w:b/>
+          <w:i w:val="0"/>
+          <w:iCs w:val="0"/>
+          <w:color w:val="000000" w:themeColor="text1"/>
           <w:sz w:val="24"/>
           <w:szCs w:val="24"/>
         </w:rPr>
@@ -2162,8 +2616,10 @@
       </w:r>
       <w:r>
         <w:rPr>
-          <w:i w:val="0"/>
-          <w:iCs w:val="0"/>
+          <w:b/>
+          <w:i w:val="0"/>
+          <w:iCs w:val="0"/>
+          <w:color w:val="000000" w:themeColor="text1"/>
           <w:sz w:val="24"/>
           <w:szCs w:val="24"/>
         </w:rPr>
@@ -2171,8 +2627,10 @@
       </w:r>
       <w:r>
         <w:rPr>
-          <w:i w:val="0"/>
-          <w:iCs w:val="0"/>
+          <w:b/>
+          <w:i w:val="0"/>
+          <w:iCs w:val="0"/>
+          <w:color w:val="000000" w:themeColor="text1"/>
           <w:sz w:val="24"/>
           <w:szCs w:val="24"/>
         </w:rPr>
@@ -2180,8 +2638,10 @@
       </w:r>
       <w:r>
         <w:rPr>
-          <w:i w:val="0"/>
-          <w:iCs w:val="0"/>
+          <w:b/>
+          <w:i w:val="0"/>
+          <w:iCs w:val="0"/>
+          <w:color w:val="000000" w:themeColor="text1"/>
           <w:sz w:val="24"/>
           <w:szCs w:val="24"/>
         </w:rPr>
@@ -2189,9 +2649,11 @@
       </w:r>
       <w:r>
         <w:rPr>
+          <w:b/>
           <w:i w:val="0"/>
           <w:iCs w:val="0"/>
           <w:noProof/>
+          <w:color w:val="000000" w:themeColor="text1"/>
           <w:sz w:val="24"/>
           <w:szCs w:val="24"/>
         </w:rPr>
@@ -2199,24 +2661,28 @@
       </w:r>
       <w:r>
         <w:rPr>
-          <w:i w:val="0"/>
-          <w:iCs w:val="0"/>
+          <w:b/>
+          <w:i w:val="0"/>
+          <w:iCs w:val="0"/>
+          <w:color w:val="000000" w:themeColor="text1"/>
           <w:sz w:val="24"/>
           <w:szCs w:val="24"/>
         </w:rPr>
         <w:fldChar w:fldCharType="end"/>
       </w:r>
-      <w:bookmarkEnd w:id="48"/>
-      <w:r>
-        <w:rPr>
-          <w:i w:val="0"/>
-          <w:iCs w:val="0"/>
+      <w:bookmarkEnd w:id="52"/>
+      <w:r>
+        <w:rPr>
+          <w:b/>
+          <w:i w:val="0"/>
+          <w:iCs w:val="0"/>
+          <w:color w:val="000000" w:themeColor="text1"/>
           <w:sz w:val="24"/>
           <w:szCs w:val="24"/>
         </w:rPr>
         <w:t xml:space="preserve"> : Filter Operation</w:t>
       </w:r>
-      <w:bookmarkEnd w:id="49"/>
+      <w:bookmarkEnd w:id="53"/>
     </w:p>
     <w:p>
       <w:pPr>
@@ -2342,6 +2808,7 @@
         <w:pStyle w:val="Caption"/>
         <w:jc w:val="center"/>
         <w:rPr>
+          <w:b/>
           <w:i w:val="0"/>
           <w:iCs w:val="0"/>
           <w:color w:val="auto"/>
@@ -2350,9 +2817,10 @@
           <w:vertAlign w:val="superscript"/>
         </w:rPr>
       </w:pPr>
-      <w:bookmarkStart w:id="50" w:name="_Toc243417053"/>
-      <w:r>
-        <w:rPr>
+      <w:bookmarkStart w:id="54" w:name="_Toc243843893"/>
+      <w:r>
+        <w:rPr>
+          <w:b/>
           <w:i w:val="0"/>
           <w:iCs w:val="0"/>
           <w:color w:val="auto"/>
@@ -2363,6 +2831,7 @@
       </w:r>
       <w:r>
         <w:rPr>
+          <w:b/>
           <w:i w:val="0"/>
           <w:iCs w:val="0"/>
           <w:color w:val="auto"/>
@@ -2373,6 +2842,7 @@
       </w:r>
       <w:r>
         <w:rPr>
+          <w:b/>
           <w:i w:val="0"/>
           <w:iCs w:val="0"/>
           <w:color w:val="auto"/>
@@ -2383,6 +2853,7 @@
       </w:r>
       <w:r>
         <w:rPr>
+          <w:b/>
           <w:i w:val="0"/>
           <w:iCs w:val="0"/>
           <w:color w:val="auto"/>
@@ -2393,6 +2864,7 @@
       </w:r>
       <w:r>
         <w:rPr>
+          <w:b/>
           <w:i w:val="0"/>
           <w:iCs w:val="0"/>
           <w:noProof/>
@@ -2404,6 +2876,7 @@
       </w:r>
       <w:r>
         <w:rPr>
+          <w:b/>
           <w:i w:val="0"/>
           <w:iCs w:val="0"/>
           <w:color w:val="auto"/>
@@ -2414,6 +2887,7 @@
       </w:r>
       <w:r>
         <w:rPr>
+          <w:b/>
           <w:i w:val="0"/>
           <w:iCs w:val="0"/>
           <w:color w:val="auto"/>
@@ -2425,6 +2899,7 @@
       <w:proofErr w:type="spellStart"/>
       <w:r>
         <w:rPr>
+          <w:b/>
           <w:i w:val="0"/>
           <w:iCs w:val="0"/>
           <w:color w:val="auto"/>
@@ -2436,6 +2911,7 @@
       <w:proofErr w:type="spellEnd"/>
       <w:r>
         <w:rPr>
+          <w:b/>
           <w:i w:val="0"/>
           <w:iCs w:val="0"/>
           <w:color w:val="auto"/>
@@ -2444,7 +2920,7 @@
         </w:rPr>
         <w:t xml:space="preserve"> Block Diagram</w:t>
       </w:r>
-      <w:bookmarkEnd w:id="50"/>
+      <w:bookmarkEnd w:id="54"/>
     </w:p>
     <w:p>
       <w:proofErr w:type="gramStart"/>
@@ -2489,22 +2965,176 @@
     </w:p>
     <w:p>
       <w:r>
-        <w:br w:type="page"/>
-      </w:r>
-    </w:p>
+        <w:t>To perform the arithmetic correctly in the firmware logic, signed fixed-point arithmetic is used.</w:t>
+      </w:r>
+      <w:r>
+        <w:t xml:space="preserve"> Using a grey-scale image each pixel is represented by </w:t>
+      </w:r>
+      <w:r>
+        <w:t xml:space="preserve">a </w:t>
+      </w:r>
+      <w:r>
+        <w:t xml:space="preserve">uint8, unsigned </w:t>
+      </w:r>
+      <w:r>
+        <w:t>8-bit</w:t>
+      </w:r>
+      <w:r>
+        <w:t>, value. On the grey-scale range, a max value of 255 is white whi</w:t>
+      </w:r>
+      <w:r>
+        <w:t xml:space="preserve">le a min value of zero is black. </w:t>
+      </w:r>
+    </w:p>
+    <w:p>
+      <w:pPr>
+        <w:keepNext/>
+        <w:jc w:val="center"/>
+      </w:pPr>
+      <w:r>
+        <w:rPr>
+          <w:noProof/>
+        </w:rPr>
+        <w:drawing>
+          <wp:inline distT="0" distB="0" distL="0" distR="0" wp14:anchorId="0FAD2419" wp14:editId="062F64A3">
+            <wp:extent cx="4076700" cy="1800101"/>
+            <wp:effectExtent l="0" t="0" r="0" b="0"/>
+            <wp:docPr id="1" name="Picture 1" descr="Greyscale and Color Image | TheAILearner"/>
+            <wp:cNvGraphicFramePr>
+              <a:graphicFrameLocks xmlns:a="http://schemas.openxmlformats.org/drawingml/2006/main" noChangeAspect="1"/>
+            </wp:cNvGraphicFramePr>
+            <a:graphic xmlns:a="http://schemas.openxmlformats.org/drawingml/2006/main">
+              <a:graphicData uri="http://schemas.openxmlformats.org/drawingml/2006/picture">
+                <pic:pic xmlns:pic="http://schemas.openxmlformats.org/drawingml/2006/picture">
+                  <pic:nvPicPr>
+                    <pic:cNvPr id="0" name="Picture 1" descr="Greyscale and Color Image | TheAILearner"/>
+                    <pic:cNvPicPr>
+                      <a:picLocks noChangeAspect="1" noChangeArrowheads="1"/>
+                    </pic:cNvPicPr>
+                  </pic:nvPicPr>
+                  <pic:blipFill>
+                    <a:blip r:embed="rId15">
+                      <a:extLst>
+                        <a:ext uri="{28A0092B-C50C-407E-A947-70E740481C1C}">
+                          <a14:useLocalDpi xmlns:a14="http://schemas.microsoft.com/office/drawing/2010/main" val="0"/>
+                        </a:ext>
+                      </a:extLst>
+                    </a:blip>
+                    <a:srcRect/>
+                    <a:stretch>
+                      <a:fillRect/>
+                    </a:stretch>
+                  </pic:blipFill>
+                  <pic:spPr bwMode="auto">
+                    <a:xfrm>
+                      <a:off x="0" y="0"/>
+                      <a:ext cx="4087062" cy="1804676"/>
+                    </a:xfrm>
+                    <a:prstGeom prst="rect">
+                      <a:avLst/>
+                    </a:prstGeom>
+                    <a:noFill/>
+                    <a:ln>
+                      <a:noFill/>
+                    </a:ln>
+                  </pic:spPr>
+                </pic:pic>
+              </a:graphicData>
+            </a:graphic>
+          </wp:inline>
+        </w:drawing>
+      </w:r>
+    </w:p>
+    <w:p>
+      <w:pPr>
+        <w:pStyle w:val="Caption"/>
+        <w:jc w:val="center"/>
+        <w:rPr>
+          <w:b/>
+          <w:i w:val="0"/>
+          <w:color w:val="000000" w:themeColor="text1"/>
+          <w:sz w:val="24"/>
+        </w:rPr>
+      </w:pPr>
+      <w:bookmarkStart w:id="55" w:name="_Toc243843894"/>
+      <w:r>
+        <w:rPr>
+          <w:b/>
+          <w:i w:val="0"/>
+          <w:color w:val="000000" w:themeColor="text1"/>
+          <w:sz w:val="24"/>
+        </w:rPr>
+        <w:t xml:space="preserve">Figure </w:t>
+      </w:r>
+      <w:r>
+        <w:rPr>
+          <w:b/>
+          <w:i w:val="0"/>
+          <w:color w:val="000000" w:themeColor="text1"/>
+          <w:sz w:val="24"/>
+        </w:rPr>
+        <w:fldChar w:fldCharType="begin"/>
+      </w:r>
+      <w:r>
+        <w:rPr>
+          <w:b/>
+          <w:i w:val="0"/>
+          <w:color w:val="000000" w:themeColor="text1"/>
+          <w:sz w:val="24"/>
+        </w:rPr>
+        <w:instrText xml:space="preserve"> SEQ Figure \* ARABIC </w:instrText>
+      </w:r>
+      <w:r>
+        <w:rPr>
+          <w:b/>
+          <w:i w:val="0"/>
+          <w:color w:val="000000" w:themeColor="text1"/>
+          <w:sz w:val="24"/>
+        </w:rPr>
+        <w:fldChar w:fldCharType="separate"/>
+      </w:r>
+      <w:r>
+        <w:rPr>
+          <w:b/>
+          <w:i w:val="0"/>
+          <w:noProof/>
+          <w:color w:val="000000" w:themeColor="text1"/>
+          <w:sz w:val="24"/>
+        </w:rPr>
+        <w:t>6</w:t>
+      </w:r>
+      <w:r>
+        <w:rPr>
+          <w:b/>
+          <w:i w:val="0"/>
+          <w:color w:val="000000" w:themeColor="text1"/>
+          <w:sz w:val="24"/>
+        </w:rPr>
+        <w:fldChar w:fldCharType="end"/>
+      </w:r>
+      <w:r>
+        <w:rPr>
+          <w:b/>
+          <w:i w:val="0"/>
+          <w:color w:val="000000" w:themeColor="text1"/>
+          <w:sz w:val="24"/>
+        </w:rPr>
+        <w:t xml:space="preserve"> : Grey Scale Range</w:t>
+      </w:r>
+      <w:bookmarkEnd w:id="55"/>
+    </w:p>
+    <w:p/>
     <w:p>
       <w:pPr>
         <w:pStyle w:val="Heading1"/>
-        <w:numPr>
-          <w:ilvl w:val="0"/>
-          <w:numId w:val="2"/>
-        </w:numPr>
+        <w:ind w:left="720"/>
         <w:rPr>
           <w:b/>
           <w:bCs/>
           <w:color w:val="auto"/>
         </w:rPr>
       </w:pPr>
+      <w:bookmarkStart w:id="56" w:name="_Ref243463993"/>
       <w:r>
         <w:rPr>
           <w:b/>
@@ -2514,6 +3144,7 @@
         <w:lastRenderedPageBreak/>
         <w:t>Design Implementation</w:t>
       </w:r>
+      <w:bookmarkEnd w:id="56"/>
       <w:r>
         <w:rPr>
           <w:b/>
@@ -2537,10 +3168,7 @@
         <w:fldChar w:fldCharType="begin"/>
       </w:r>
       <w:r>
-        <w:instrText xml:space="preserve"> REF _Ref243417072 \h </w:instrText>
-      </w:r>
-      <w:r>
-        <w:instrText xml:space="preserve"> \* MERGEFORMAT </w:instrText>
+        <w:instrText xml:space="preserve"> REF _Ref243417072 \h  \* MERGEFORMAT </w:instrText>
       </w:r>
       <w:r>
         <w:fldChar w:fldCharType="separate"/>
@@ -2552,7 +3180,7 @@
         <w:rPr>
           <w:noProof/>
         </w:rPr>
-        <w:t>6</w:t>
+        <w:t>7</w:t>
       </w:r>
       <w:r>
         <w:fldChar w:fldCharType="end"/>
@@ -2567,6 +3195,9 @@
         <w:jc w:val="center"/>
       </w:pPr>
       <w:r>
+        <w:rPr>
+          <w:noProof/>
+        </w:rPr>
         <w:drawing>
           <wp:inline distT="0" distB="0" distL="0" distR="0" wp14:anchorId="5F07374B" wp14:editId="7325483C">
             <wp:extent cx="2565987" cy="3081528"/>
@@ -2583,7 +3214,7 @@
                     <pic:cNvPicPr/>
                   </pic:nvPicPr>
                   <pic:blipFill>
-                    <a:blip r:embed="rId15"/>
+                    <a:blip r:embed="rId16"/>
                     <a:stretch>
                       <a:fillRect/>
                     </a:stretch>
@@ -2609,72 +3240,1596 @@
         <w:pStyle w:val="Caption"/>
         <w:jc w:val="center"/>
         <w:rPr>
+          <w:b/>
           <w:i w:val="0"/>
           <w:iCs w:val="0"/>
           <w:color w:val="auto"/>
-        </w:rPr>
-      </w:pPr>
-      <w:bookmarkStart w:id="51" w:name="_Toc243417054"/>
-      <w:bookmarkStart w:id="52" w:name="_Ref243417072"/>
-      <w:r>
-        <w:rPr>
+          <w:sz w:val="24"/>
+        </w:rPr>
+      </w:pPr>
+      <w:bookmarkStart w:id="57" w:name="_Ref243417072"/>
+      <w:bookmarkStart w:id="58" w:name="_Toc243843895"/>
+      <w:r>
+        <w:rPr>
+          <w:b/>
           <w:i w:val="0"/>
           <w:iCs w:val="0"/>
           <w:color w:val="auto"/>
+          <w:sz w:val="24"/>
         </w:rPr>
         <w:t xml:space="preserve">Figure </w:t>
       </w:r>
       <w:r>
         <w:rPr>
+          <w:b/>
           <w:i w:val="0"/>
           <w:iCs w:val="0"/>
           <w:color w:val="auto"/>
+          <w:sz w:val="24"/>
         </w:rPr>
         <w:fldChar w:fldCharType="begin"/>
       </w:r>
       <w:r>
         <w:rPr>
+          <w:b/>
           <w:i w:val="0"/>
           <w:iCs w:val="0"/>
           <w:color w:val="auto"/>
+          <w:sz w:val="24"/>
         </w:rPr>
         <w:instrText xml:space="preserve"> SEQ Figure \* ARABIC </w:instrText>
       </w:r>
       <w:r>
         <w:rPr>
+          <w:b/>
           <w:i w:val="0"/>
           <w:iCs w:val="0"/>
           <w:color w:val="auto"/>
+          <w:sz w:val="24"/>
         </w:rPr>
         <w:fldChar w:fldCharType="separate"/>
       </w:r>
       <w:r>
         <w:rPr>
+          <w:b/>
           <w:i w:val="0"/>
           <w:iCs w:val="0"/>
           <w:noProof/>
           <w:color w:val="auto"/>
-        </w:rPr>
-        <w:t>6</w:t>
-      </w:r>
-      <w:r>
-        <w:rPr>
+          <w:sz w:val="24"/>
+        </w:rPr>
+        <w:t>7</w:t>
+      </w:r>
+      <w:r>
+        <w:rPr>
+          <w:b/>
           <w:i w:val="0"/>
           <w:iCs w:val="0"/>
           <w:color w:val="auto"/>
+          <w:sz w:val="24"/>
         </w:rPr>
         <w:fldChar w:fldCharType="end"/>
       </w:r>
-      <w:bookmarkEnd w:id="52"/>
-      <w:r>
-        <w:rPr>
+      <w:bookmarkEnd w:id="57"/>
+      <w:r>
+        <w:rPr>
+          <w:b/>
           <w:i w:val="0"/>
           <w:iCs w:val="0"/>
           <w:color w:val="auto"/>
+          <w:sz w:val="24"/>
         </w:rPr>
         <w:t>: Sobel Filter Block Design</w:t>
       </w:r>
-      <w:bookmarkEnd w:id="51"/>
+      <w:bookmarkEnd w:id="58"/>
+    </w:p>
+    <w:p>
+      <w:r>
+        <w:t xml:space="preserve">Finite-state machines (FSMs) control how the logic transitions through determined stages. The state machine below in </w:t>
+      </w:r>
+      <w:r>
+        <w:fldChar w:fldCharType="begin"/>
+      </w:r>
+      <w:r>
+        <w:instrText xml:space="preserve"> REF _Ref243734373 \h  \* MERGEFORMAT </w:instrText>
+      </w:r>
+      <w:r>
+        <w:fldChar w:fldCharType="separate"/>
+      </w:r>
+      <w:r>
+        <w:rPr>
+          <w:noProof/>
+        </w:rPr>
+        <w:fldChar w:fldCharType="begin"/>
+      </w:r>
+      <w:r>
+        <w:instrText xml:space="preserve"> REF _Ref243843957 \h </w:instrText>
+      </w:r>
+      <w:r>
+        <w:rPr>
+          <w:noProof/>
+        </w:rPr>
+      </w:r>
+      <w:r>
+        <w:rPr>
+          <w:noProof/>
+        </w:rPr>
+        <w:instrText xml:space="preserve"> \* MERGEFORMAT </w:instrText>
+      </w:r>
+      <w:r>
+        <w:rPr>
+          <w:noProof/>
+        </w:rPr>
+        <w:fldChar w:fldCharType="separate"/>
+      </w:r>
+      <w:r>
+        <w:t xml:space="preserve">Figure </w:t>
+      </w:r>
+      <w:r>
+        <w:rPr>
+          <w:noProof/>
+        </w:rPr>
+        <w:t>8</w:t>
+      </w:r>
+      <w:r>
+        <w:rPr>
+          <w:noProof/>
+        </w:rPr>
+        <w:fldChar w:fldCharType="end"/>
+      </w:r>
+      <w:r>
+        <w:fldChar w:fldCharType="end"/>
+      </w:r>
+      <w:r>
+        <w:t xml:space="preserve">, is the state flow for the </w:t>
+      </w:r>
+      <w:r>
+        <w:t xml:space="preserve">main </w:t>
+      </w:r>
+      <w:r>
+        <w:t xml:space="preserve">Sobel </w:t>
+      </w:r>
+      <w:r>
+        <w:t xml:space="preserve">filter </w:t>
+      </w:r>
+      <w:r>
+        <w:t>module. A start signal is used to initiate the module state machine.</w:t>
+      </w:r>
+    </w:p>
+    <w:p>
+      <w:pPr>
+        <w:keepNext/>
+        <w:jc w:val="center"/>
+      </w:pPr>
+      <w:r>
+        <w:drawing>
+          <wp:inline distT="0" distB="0" distL="0" distR="0" wp14:anchorId="4B7614AC" wp14:editId="5E5802E1">
+            <wp:extent cx="2553737" cy="2255520"/>
+            <wp:effectExtent l="0" t="0" r="0" b="0"/>
+            <wp:docPr id="704977146" name="Picture 1"/>
+            <wp:cNvGraphicFramePr>
+              <a:graphicFrameLocks xmlns:a="http://schemas.openxmlformats.org/drawingml/2006/main" noChangeAspect="1"/>
+            </wp:cNvGraphicFramePr>
+            <a:graphic xmlns:a="http://schemas.openxmlformats.org/drawingml/2006/main">
+              <a:graphicData uri="http://schemas.openxmlformats.org/drawingml/2006/picture">
+                <pic:pic xmlns:pic="http://schemas.openxmlformats.org/drawingml/2006/picture">
+                  <pic:nvPicPr>
+                    <pic:cNvPr id="704977146" name=""/>
+                    <pic:cNvPicPr/>
+                  </pic:nvPicPr>
+                  <pic:blipFill>
+                    <a:blip r:embed="rId17"/>
+                    <a:stretch>
+                      <a:fillRect/>
+                    </a:stretch>
+                  </pic:blipFill>
+                  <pic:spPr>
+                    <a:xfrm>
+                      <a:off x="0" y="0"/>
+                      <a:ext cx="2565004" cy="2265471"/>
+                    </a:xfrm>
+                    <a:prstGeom prst="rect">
+                      <a:avLst/>
+                    </a:prstGeom>
+                  </pic:spPr>
+                </pic:pic>
+              </a:graphicData>
+            </a:graphic>
+          </wp:inline>
+        </w:drawing>
+      </w:r>
+    </w:p>
+    <w:p>
+      <w:pPr>
+        <w:pStyle w:val="Caption"/>
+        <w:jc w:val="center"/>
+        <w:rPr>
+          <w:b/>
+          <w:bCs/>
+          <w:i w:val="0"/>
+          <w:iCs w:val="0"/>
+          <w:color w:val="000000" w:themeColor="text1"/>
+          <w:sz w:val="24"/>
+          <w:szCs w:val="24"/>
+        </w:rPr>
+      </w:pPr>
+      <w:bookmarkStart w:id="59" w:name="_Toc243843896"/>
+      <w:bookmarkStart w:id="60" w:name="_Ref243843957"/>
+      <w:r>
+        <w:rPr>
+          <w:b/>
+          <w:bCs/>
+          <w:i w:val="0"/>
+          <w:iCs w:val="0"/>
+          <w:color w:val="000000" w:themeColor="text1"/>
+          <w:sz w:val="24"/>
+          <w:szCs w:val="24"/>
+        </w:rPr>
+        <w:t xml:space="preserve">Figure </w:t>
+      </w:r>
+      <w:r>
+        <w:rPr>
+          <w:b/>
+          <w:bCs/>
+          <w:i w:val="0"/>
+          <w:iCs w:val="0"/>
+          <w:color w:val="000000" w:themeColor="text1"/>
+          <w:sz w:val="24"/>
+          <w:szCs w:val="24"/>
+        </w:rPr>
+        <w:fldChar w:fldCharType="begin"/>
+      </w:r>
+      <w:r>
+        <w:rPr>
+          <w:b/>
+          <w:bCs/>
+          <w:i w:val="0"/>
+          <w:iCs w:val="0"/>
+          <w:color w:val="000000" w:themeColor="text1"/>
+          <w:sz w:val="24"/>
+          <w:szCs w:val="24"/>
+        </w:rPr>
+        <w:instrText xml:space="preserve"> SEQ Figure \* ARABIC </w:instrText>
+      </w:r>
+      <w:r>
+        <w:rPr>
+          <w:b/>
+          <w:bCs/>
+          <w:i w:val="0"/>
+          <w:iCs w:val="0"/>
+          <w:color w:val="000000" w:themeColor="text1"/>
+          <w:sz w:val="24"/>
+          <w:szCs w:val="24"/>
+        </w:rPr>
+        <w:fldChar w:fldCharType="separate"/>
+      </w:r>
+      <w:r>
+        <w:rPr>
+          <w:b/>
+          <w:bCs/>
+          <w:i w:val="0"/>
+          <w:iCs w:val="0"/>
+          <w:noProof/>
+          <w:color w:val="000000" w:themeColor="text1"/>
+          <w:sz w:val="24"/>
+          <w:szCs w:val="24"/>
+        </w:rPr>
+        <w:t>8</w:t>
+      </w:r>
+      <w:r>
+        <w:rPr>
+          <w:b/>
+          <w:bCs/>
+          <w:i w:val="0"/>
+          <w:iCs w:val="0"/>
+          <w:color w:val="000000" w:themeColor="text1"/>
+          <w:sz w:val="24"/>
+          <w:szCs w:val="24"/>
+        </w:rPr>
+        <w:fldChar w:fldCharType="end"/>
+      </w:r>
+      <w:bookmarkEnd w:id="60"/>
+      <w:r>
+        <w:rPr>
+          <w:b/>
+          <w:bCs/>
+          <w:i w:val="0"/>
+          <w:iCs w:val="0"/>
+          <w:color w:val="000000" w:themeColor="text1"/>
+          <w:sz w:val="24"/>
+          <w:szCs w:val="24"/>
+        </w:rPr>
+        <w:t>: Sobel Filter State Diagram</w:t>
+      </w:r>
+      <w:bookmarkEnd w:id="59"/>
+    </w:p>
+    <w:p>
+      <w:r>
+        <w:lastRenderedPageBreak/>
+        <w:t xml:space="preserve">The state machine below in </w:t>
+      </w:r>
+      <w:r>
+        <w:fldChar w:fldCharType="begin"/>
+      </w:r>
+      <w:r>
+        <w:instrText xml:space="preserve"> REF _Ref243734373 \h  \* MERGEFORMAT </w:instrText>
+      </w:r>
+      <w:r>
+        <w:fldChar w:fldCharType="separate"/>
+      </w:r>
+      <w:r>
+        <w:t xml:space="preserve">Figure </w:t>
+      </w:r>
+      <w:r>
+        <w:rPr>
+          <w:noProof/>
+        </w:rPr>
+        <w:t>9</w:t>
+      </w:r>
+      <w:r>
+        <w:fldChar w:fldCharType="end"/>
+      </w:r>
+      <w:r>
+        <w:t xml:space="preserve">, is the state flow for </w:t>
+      </w:r>
+      <w:proofErr w:type="gramStart"/>
+      <w:r>
+        <w:t>the Sobel</w:t>
+      </w:r>
+      <w:proofErr w:type="gramEnd"/>
+      <w:r>
+        <w:t xml:space="preserve"> X and Y submodules. The arithmetic logic is broken down </w:t>
+      </w:r>
+      <w:proofErr w:type="gramStart"/>
+      <w:r>
+        <w:t>in to</w:t>
+      </w:r>
+      <w:proofErr w:type="gramEnd"/>
+      <w:r>
+        <w:t xml:space="preserve"> multiple stages to handle the saturation and overflow checks correctly.</w:t>
+      </w:r>
+    </w:p>
+    <w:p>
+      <w:pPr>
+        <w:keepNext/>
+        <w:jc w:val="center"/>
+      </w:pPr>
+      <w:r>
+        <w:rPr>
+          <w:noProof/>
+        </w:rPr>
+        <w:drawing>
+          <wp:inline distT="0" distB="0" distL="0" distR="0" wp14:anchorId="5BCC2CF9" wp14:editId="42E62360">
+            <wp:extent cx="2875019" cy="2712720"/>
+            <wp:effectExtent l="0" t="0" r="0" b="0"/>
+            <wp:docPr id="146599758" name="Picture 1"/>
+            <wp:cNvGraphicFramePr>
+              <a:graphicFrameLocks xmlns:a="http://schemas.openxmlformats.org/drawingml/2006/main" noChangeAspect="1"/>
+            </wp:cNvGraphicFramePr>
+            <a:graphic xmlns:a="http://schemas.openxmlformats.org/drawingml/2006/main">
+              <a:graphicData uri="http://schemas.openxmlformats.org/drawingml/2006/picture">
+                <pic:pic xmlns:pic="http://schemas.openxmlformats.org/drawingml/2006/picture">
+                  <pic:nvPicPr>
+                    <pic:cNvPr id="146599758" name=""/>
+                    <pic:cNvPicPr/>
+                  </pic:nvPicPr>
+                  <pic:blipFill>
+                    <a:blip r:embed="rId18"/>
+                    <a:stretch>
+                      <a:fillRect/>
+                    </a:stretch>
+                  </pic:blipFill>
+                  <pic:spPr>
+                    <a:xfrm>
+                      <a:off x="0" y="0"/>
+                      <a:ext cx="2882363" cy="2719649"/>
+                    </a:xfrm>
+                    <a:prstGeom prst="rect">
+                      <a:avLst/>
+                    </a:prstGeom>
+                  </pic:spPr>
+                </pic:pic>
+              </a:graphicData>
+            </a:graphic>
+          </wp:inline>
+        </w:drawing>
+      </w:r>
+    </w:p>
+    <w:p>
+      <w:pPr>
+        <w:pStyle w:val="Caption"/>
+        <w:jc w:val="center"/>
+        <w:rPr>
+          <w:b/>
+          <w:bCs/>
+          <w:i w:val="0"/>
+          <w:iCs w:val="0"/>
+          <w:sz w:val="24"/>
+          <w:szCs w:val="24"/>
+        </w:rPr>
+      </w:pPr>
+      <w:bookmarkStart w:id="61" w:name="_Ref243734373"/>
+      <w:bookmarkStart w:id="62" w:name="_Toc243843897"/>
+      <w:r>
+        <w:rPr>
+          <w:b/>
+          <w:bCs/>
+          <w:i w:val="0"/>
+          <w:iCs w:val="0"/>
+          <w:sz w:val="24"/>
+          <w:szCs w:val="24"/>
+        </w:rPr>
+        <w:t xml:space="preserve">Figure </w:t>
+      </w:r>
+      <w:r>
+        <w:rPr>
+          <w:b/>
+          <w:bCs/>
+          <w:i w:val="0"/>
+          <w:iCs w:val="0"/>
+          <w:sz w:val="24"/>
+          <w:szCs w:val="24"/>
+        </w:rPr>
+        <w:fldChar w:fldCharType="begin"/>
+      </w:r>
+      <w:r>
+        <w:rPr>
+          <w:b/>
+          <w:bCs/>
+          <w:i w:val="0"/>
+          <w:iCs w:val="0"/>
+          <w:sz w:val="24"/>
+          <w:szCs w:val="24"/>
+        </w:rPr>
+        <w:instrText xml:space="preserve"> SEQ Figure \* ARABIC </w:instrText>
+      </w:r>
+      <w:r>
+        <w:rPr>
+          <w:b/>
+          <w:bCs/>
+          <w:i w:val="0"/>
+          <w:iCs w:val="0"/>
+          <w:sz w:val="24"/>
+          <w:szCs w:val="24"/>
+        </w:rPr>
+        <w:fldChar w:fldCharType="separate"/>
+      </w:r>
+      <w:r>
+        <w:rPr>
+          <w:b/>
+          <w:bCs/>
+          <w:i w:val="0"/>
+          <w:iCs w:val="0"/>
+          <w:noProof/>
+          <w:sz w:val="24"/>
+          <w:szCs w:val="24"/>
+        </w:rPr>
+        <w:t>9</w:t>
+      </w:r>
+      <w:r>
+        <w:rPr>
+          <w:b/>
+          <w:bCs/>
+          <w:i w:val="0"/>
+          <w:iCs w:val="0"/>
+          <w:sz w:val="24"/>
+          <w:szCs w:val="24"/>
+        </w:rPr>
+        <w:fldChar w:fldCharType="end"/>
+      </w:r>
+      <w:bookmarkEnd w:id="61"/>
+      <w:r>
+        <w:rPr>
+          <w:b/>
+          <w:bCs/>
+          <w:i w:val="0"/>
+          <w:iCs w:val="0"/>
+          <w:sz w:val="24"/>
+          <w:szCs w:val="24"/>
+        </w:rPr>
+        <w:t>: Sobel X &amp; Y State Machine Diagram</w:t>
+      </w:r>
+      <w:bookmarkEnd w:id="62"/>
+    </w:p>
+    <w:p>
+      <w:r>
+        <w:t xml:space="preserve">The </w:t>
+      </w:r>
+      <w:r>
+        <w:t xml:space="preserve">input </w:t>
+      </w:r>
+      <w:r>
+        <w:t>array subsection</w:t>
+      </w:r>
+      <w:r>
+        <w:t xml:space="preserve"> for both the X and Y </w:t>
+      </w:r>
+      <w:r>
+        <w:t xml:space="preserve">sub </w:t>
+      </w:r>
+      <w:r>
+        <w:t>modules are nine uint8</w:t>
+      </w:r>
+      <w:r>
+        <w:t xml:space="preserve"> values</w:t>
+      </w:r>
+      <w:r>
+        <w:t xml:space="preserve">. </w:t>
+      </w:r>
+      <w:r>
+        <w:t>To</w:t>
+      </w:r>
+      <w:r>
+        <w:t xml:space="preserve"> perform the convolution operation, </w:t>
+      </w:r>
+      <w:r>
+        <w:t xml:space="preserve">the max and min </w:t>
+      </w:r>
+      <w:r>
+        <w:t xml:space="preserve">ranges </w:t>
+      </w:r>
+      <w:r>
+        <w:t xml:space="preserve">need to </w:t>
+      </w:r>
+      <w:r>
+        <w:t xml:space="preserve">be </w:t>
+      </w:r>
+      <w:r>
+        <w:t>determine</w:t>
+      </w:r>
+      <w:r>
+        <w:t>d</w:t>
+      </w:r>
+      <w:r>
+        <w:t xml:space="preserve"> </w:t>
+      </w:r>
+      <w:r>
+        <w:t>for</w:t>
+      </w:r>
+      <w:r>
+        <w:t xml:space="preserve"> the correct bit range for G</w:t>
+      </w:r>
+      <w:r>
+        <w:rPr>
+          <w:vertAlign w:val="subscript"/>
+        </w:rPr>
+        <w:t>x</w:t>
+      </w:r>
+      <w:r>
+        <w:t>/G</w:t>
+      </w:r>
+      <w:r>
+        <w:rPr>
+          <w:vertAlign w:val="subscript"/>
+        </w:rPr>
+        <w:t>y</w:t>
+      </w:r>
+      <w:r>
+        <w:t>. The m</w:t>
+      </w:r>
+      <w:r>
+        <w:t xml:space="preserve">ax range </w:t>
+      </w:r>
+      <w:r>
+        <w:t xml:space="preserve">is </w:t>
+      </w:r>
+      <w:r>
+        <w:t xml:space="preserve">a pixel value of 255 in </w:t>
+      </w:r>
+      <w:proofErr w:type="gramStart"/>
+      <w:r>
+        <w:t>all the</w:t>
+      </w:r>
+      <w:proofErr w:type="gramEnd"/>
+      <w:r>
+        <w:t xml:space="preserve"> positive weights and a pixel value of </w:t>
+      </w:r>
+      <w:r>
+        <w:t>zero</w:t>
+      </w:r>
+      <w:r>
+        <w:t xml:space="preserve"> </w:t>
+      </w:r>
+      <w:r>
+        <w:t>in</w:t>
+      </w:r>
+      <w:r>
+        <w:t xml:space="preserve"> every other weight, gaining a maximum value of 1020.</w:t>
+      </w:r>
+      <w:r>
+        <w:t xml:space="preserve"> </w:t>
+      </w:r>
+      <w:proofErr w:type="gramStart"/>
+      <w:r>
+        <w:t>This</w:t>
+      </w:r>
+      <w:proofErr w:type="gramEnd"/>
+      <w:r>
+        <w:t xml:space="preserve"> holds true for the minimum value with the negative weights, where the minimum value is -1020.</w:t>
+      </w:r>
+      <w:r>
+        <w:t xml:space="preserve"> For this to be stored properly in signed fixed point, a bit length of 11 is used. At the most significant bit (MSB) the weight is -2</w:t>
+      </w:r>
+      <w:r>
+        <w:rPr>
+          <w:vertAlign w:val="superscript"/>
+        </w:rPr>
+        <w:t>10</w:t>
+      </w:r>
+      <w:r>
+        <w:t>,</w:t>
+      </w:r>
+      <w:r>
+        <w:t xml:space="preserve"> the sign bit,</w:t>
+      </w:r>
+      <w:r>
+        <w:t xml:space="preserve"> giving a full range to -1024 to 1023.</w:t>
+      </w:r>
+    </w:p>
+    <w:p/>
+    <w:tbl>
+      <w:tblPr>
+        <w:tblStyle w:val="TableGrid"/>
+        <w:tblW w:w="0" w:type="auto"/>
+        <w:tblLook w:val="04A0" w:firstRow="1" w:lastRow="0" w:firstColumn="1" w:lastColumn="0" w:noHBand="0" w:noVBand="1"/>
+      </w:tblPr>
+      <w:tblGrid>
+        <w:gridCol w:w="870"/>
+        <w:gridCol w:w="870"/>
+        <w:gridCol w:w="870"/>
+        <w:gridCol w:w="870"/>
+        <w:gridCol w:w="870"/>
+        <w:gridCol w:w="871"/>
+        <w:gridCol w:w="871"/>
+        <w:gridCol w:w="871"/>
+        <w:gridCol w:w="871"/>
+        <w:gridCol w:w="871"/>
+        <w:gridCol w:w="871"/>
+      </w:tblGrid>
+      <w:tr>
+        <w:tc>
+          <w:tcPr>
+            <w:tcW w:w="870" w:type="dxa"/>
+            <w:tcBorders>
+              <w:bottom w:val="single" w:sz="4" w:space="0" w:color="auto"/>
+            </w:tcBorders>
+          </w:tcPr>
+          <w:p>
+            <w:pPr>
+              <w:jc w:val="center"/>
+            </w:pPr>
+            <w:r>
+              <w:t>-2</w:t>
+            </w:r>
+            <w:r>
+              <w:rPr>
+                <w:vertAlign w:val="superscript"/>
+              </w:rPr>
+              <w:t>10</w:t>
+            </w:r>
+          </w:p>
+        </w:tc>
+        <w:tc>
+          <w:tcPr>
+            <w:tcW w:w="870" w:type="dxa"/>
+            <w:tcBorders>
+              <w:bottom w:val="single" w:sz="4" w:space="0" w:color="auto"/>
+            </w:tcBorders>
+          </w:tcPr>
+          <w:p>
+            <w:pPr>
+              <w:jc w:val="center"/>
+            </w:pPr>
+            <w:r>
+              <w:t>2</w:t>
+            </w:r>
+            <w:r>
+              <w:rPr>
+                <w:vertAlign w:val="superscript"/>
+              </w:rPr>
+              <w:t>9</w:t>
+            </w:r>
+          </w:p>
+        </w:tc>
+        <w:tc>
+          <w:tcPr>
+            <w:tcW w:w="870" w:type="dxa"/>
+            <w:tcBorders>
+              <w:bottom w:val="single" w:sz="4" w:space="0" w:color="auto"/>
+            </w:tcBorders>
+          </w:tcPr>
+          <w:p>
+            <w:pPr>
+              <w:jc w:val="center"/>
+            </w:pPr>
+            <w:r>
+              <w:t>2</w:t>
+            </w:r>
+            <w:r>
+              <w:rPr>
+                <w:vertAlign w:val="superscript"/>
+              </w:rPr>
+              <w:t>8</w:t>
+            </w:r>
+          </w:p>
+        </w:tc>
+        <w:tc>
+          <w:tcPr>
+            <w:tcW w:w="870" w:type="dxa"/>
+            <w:tcBorders>
+              <w:bottom w:val="single" w:sz="4" w:space="0" w:color="auto"/>
+            </w:tcBorders>
+          </w:tcPr>
+          <w:p>
+            <w:pPr>
+              <w:jc w:val="center"/>
+            </w:pPr>
+            <w:r>
+              <w:t>2</w:t>
+            </w:r>
+            <w:r>
+              <w:rPr>
+                <w:vertAlign w:val="superscript"/>
+              </w:rPr>
+              <w:t>7</w:t>
+            </w:r>
+          </w:p>
+        </w:tc>
+        <w:tc>
+          <w:tcPr>
+            <w:tcW w:w="870" w:type="dxa"/>
+            <w:tcBorders>
+              <w:bottom w:val="single" w:sz="4" w:space="0" w:color="auto"/>
+            </w:tcBorders>
+          </w:tcPr>
+          <w:p>
+            <w:pPr>
+              <w:jc w:val="center"/>
+            </w:pPr>
+            <w:r>
+              <w:t>2</w:t>
+            </w:r>
+            <w:r>
+              <w:rPr>
+                <w:vertAlign w:val="superscript"/>
+              </w:rPr>
+              <w:t>6</w:t>
+            </w:r>
+          </w:p>
+        </w:tc>
+        <w:tc>
+          <w:tcPr>
+            <w:tcW w:w="871" w:type="dxa"/>
+            <w:tcBorders>
+              <w:bottom w:val="single" w:sz="4" w:space="0" w:color="auto"/>
+            </w:tcBorders>
+          </w:tcPr>
+          <w:p>
+            <w:pPr>
+              <w:jc w:val="center"/>
+            </w:pPr>
+            <w:r>
+              <w:t>2</w:t>
+            </w:r>
+            <w:r>
+              <w:rPr>
+                <w:vertAlign w:val="superscript"/>
+              </w:rPr>
+              <w:t>5</w:t>
+            </w:r>
+          </w:p>
+        </w:tc>
+        <w:tc>
+          <w:tcPr>
+            <w:tcW w:w="871" w:type="dxa"/>
+            <w:tcBorders>
+              <w:bottom w:val="single" w:sz="4" w:space="0" w:color="auto"/>
+            </w:tcBorders>
+          </w:tcPr>
+          <w:p>
+            <w:pPr>
+              <w:jc w:val="center"/>
+            </w:pPr>
+            <w:r>
+              <w:t>2</w:t>
+            </w:r>
+            <w:r>
+              <w:rPr>
+                <w:vertAlign w:val="superscript"/>
+              </w:rPr>
+              <w:t>4</w:t>
+            </w:r>
+          </w:p>
+        </w:tc>
+        <w:tc>
+          <w:tcPr>
+            <w:tcW w:w="871" w:type="dxa"/>
+            <w:tcBorders>
+              <w:bottom w:val="single" w:sz="4" w:space="0" w:color="auto"/>
+            </w:tcBorders>
+          </w:tcPr>
+          <w:p>
+            <w:pPr>
+              <w:jc w:val="center"/>
+            </w:pPr>
+            <w:r>
+              <w:t>2</w:t>
+            </w:r>
+            <w:r>
+              <w:rPr>
+                <w:vertAlign w:val="superscript"/>
+              </w:rPr>
+              <w:t>3</w:t>
+            </w:r>
+          </w:p>
+        </w:tc>
+        <w:tc>
+          <w:tcPr>
+            <w:tcW w:w="871" w:type="dxa"/>
+            <w:tcBorders>
+              <w:bottom w:val="single" w:sz="4" w:space="0" w:color="auto"/>
+            </w:tcBorders>
+          </w:tcPr>
+          <w:p>
+            <w:pPr>
+              <w:jc w:val="center"/>
+            </w:pPr>
+            <w:r>
+              <w:t>2</w:t>
+            </w:r>
+            <w:r>
+              <w:rPr>
+                <w:vertAlign w:val="superscript"/>
+              </w:rPr>
+              <w:t>2</w:t>
+            </w:r>
+          </w:p>
+        </w:tc>
+        <w:tc>
+          <w:tcPr>
+            <w:tcW w:w="871" w:type="dxa"/>
+            <w:tcBorders>
+              <w:bottom w:val="single" w:sz="4" w:space="0" w:color="auto"/>
+            </w:tcBorders>
+          </w:tcPr>
+          <w:p>
+            <w:pPr>
+              <w:jc w:val="center"/>
+            </w:pPr>
+            <w:r>
+              <w:t>2</w:t>
+            </w:r>
+            <w:r>
+              <w:rPr>
+                <w:vertAlign w:val="superscript"/>
+              </w:rPr>
+              <w:t>1</w:t>
+            </w:r>
+          </w:p>
+        </w:tc>
+        <w:tc>
+          <w:tcPr>
+            <w:tcW w:w="871" w:type="dxa"/>
+            <w:tcBorders>
+              <w:bottom w:val="single" w:sz="4" w:space="0" w:color="auto"/>
+            </w:tcBorders>
+          </w:tcPr>
+          <w:p>
+            <w:pPr>
+              <w:jc w:val="center"/>
+            </w:pPr>
+            <w:r>
+              <w:t>2</w:t>
+            </w:r>
+            <w:r>
+              <w:rPr>
+                <w:vertAlign w:val="superscript"/>
+              </w:rPr>
+              <w:t>0</w:t>
+            </w:r>
+          </w:p>
+        </w:tc>
+      </w:tr>
+      <w:tr>
+        <w:tc>
+          <w:tcPr>
+            <w:tcW w:w="870" w:type="dxa"/>
+            <w:tcBorders>
+              <w:left w:val="single" w:sz="4" w:space="0" w:color="auto"/>
+              <w:right w:val="nil"/>
+            </w:tcBorders>
+          </w:tcPr>
+          <w:p>
+            <w:pPr>
+              <w:jc w:val="center"/>
+            </w:pPr>
+            <w:r>
+              <w:t>MSB</w:t>
+            </w:r>
+          </w:p>
+        </w:tc>
+        <w:tc>
+          <w:tcPr>
+            <w:tcW w:w="870" w:type="dxa"/>
+            <w:tcBorders>
+              <w:left w:val="nil"/>
+              <w:right w:val="nil"/>
+            </w:tcBorders>
+          </w:tcPr>
+          <w:p>
+            <w:pPr>
+              <w:jc w:val="center"/>
+            </w:pPr>
+          </w:p>
+        </w:tc>
+        <w:tc>
+          <w:tcPr>
+            <w:tcW w:w="870" w:type="dxa"/>
+            <w:tcBorders>
+              <w:left w:val="nil"/>
+              <w:right w:val="nil"/>
+            </w:tcBorders>
+          </w:tcPr>
+          <w:p>
+            <w:pPr>
+              <w:jc w:val="center"/>
+            </w:pPr>
+          </w:p>
+        </w:tc>
+        <w:tc>
+          <w:tcPr>
+            <w:tcW w:w="870" w:type="dxa"/>
+            <w:tcBorders>
+              <w:left w:val="nil"/>
+              <w:right w:val="nil"/>
+            </w:tcBorders>
+          </w:tcPr>
+          <w:p>
+            <w:pPr>
+              <w:jc w:val="center"/>
+            </w:pPr>
+          </w:p>
+        </w:tc>
+        <w:tc>
+          <w:tcPr>
+            <w:tcW w:w="870" w:type="dxa"/>
+            <w:tcBorders>
+              <w:left w:val="nil"/>
+              <w:right w:val="nil"/>
+            </w:tcBorders>
+          </w:tcPr>
+          <w:p>
+            <w:pPr>
+              <w:jc w:val="center"/>
+            </w:pPr>
+          </w:p>
+        </w:tc>
+        <w:tc>
+          <w:tcPr>
+            <w:tcW w:w="871" w:type="dxa"/>
+            <w:tcBorders>
+              <w:left w:val="nil"/>
+              <w:right w:val="nil"/>
+            </w:tcBorders>
+          </w:tcPr>
+          <w:p>
+            <w:pPr>
+              <w:jc w:val="center"/>
+            </w:pPr>
+          </w:p>
+        </w:tc>
+        <w:tc>
+          <w:tcPr>
+            <w:tcW w:w="871" w:type="dxa"/>
+            <w:tcBorders>
+              <w:left w:val="nil"/>
+              <w:right w:val="nil"/>
+            </w:tcBorders>
+          </w:tcPr>
+          <w:p>
+            <w:pPr>
+              <w:jc w:val="center"/>
+            </w:pPr>
+          </w:p>
+        </w:tc>
+        <w:tc>
+          <w:tcPr>
+            <w:tcW w:w="871" w:type="dxa"/>
+            <w:tcBorders>
+              <w:left w:val="nil"/>
+              <w:right w:val="nil"/>
+            </w:tcBorders>
+          </w:tcPr>
+          <w:p>
+            <w:pPr>
+              <w:jc w:val="center"/>
+            </w:pPr>
+          </w:p>
+        </w:tc>
+        <w:tc>
+          <w:tcPr>
+            <w:tcW w:w="871" w:type="dxa"/>
+            <w:tcBorders>
+              <w:left w:val="nil"/>
+              <w:right w:val="nil"/>
+            </w:tcBorders>
+          </w:tcPr>
+          <w:p>
+            <w:pPr>
+              <w:jc w:val="center"/>
+            </w:pPr>
+          </w:p>
+        </w:tc>
+        <w:tc>
+          <w:tcPr>
+            <w:tcW w:w="871" w:type="dxa"/>
+            <w:tcBorders>
+              <w:left w:val="nil"/>
+              <w:right w:val="nil"/>
+            </w:tcBorders>
+          </w:tcPr>
+          <w:p>
+            <w:pPr>
+              <w:jc w:val="center"/>
+            </w:pPr>
+          </w:p>
+        </w:tc>
+        <w:tc>
+          <w:tcPr>
+            <w:tcW w:w="871" w:type="dxa"/>
+            <w:tcBorders>
+              <w:left w:val="nil"/>
+              <w:right w:val="single" w:sz="4" w:space="0" w:color="auto"/>
+            </w:tcBorders>
+          </w:tcPr>
+          <w:p>
+            <w:pPr>
+              <w:keepNext/>
+              <w:jc w:val="center"/>
+            </w:pPr>
+            <w:r>
+              <w:t>LSB</w:t>
+            </w:r>
+          </w:p>
+        </w:tc>
+      </w:tr>
+    </w:tbl>
+    <w:p>
+      <w:pPr>
+        <w:pStyle w:val="Caption"/>
+        <w:jc w:val="center"/>
+        <w:rPr>
+          <w:b/>
+          <w:color w:val="000000" w:themeColor="text1"/>
+          <w:sz w:val="24"/>
+        </w:rPr>
+      </w:pPr>
+      <w:bookmarkStart w:id="63" w:name="_Toc243843887"/>
+      <w:r>
+        <w:rPr>
+          <w:b/>
+          <w:color w:val="000000" w:themeColor="text1"/>
+          <w:sz w:val="24"/>
+        </w:rPr>
+        <w:t xml:space="preserve">Table </w:t>
+      </w:r>
+      <w:r>
+        <w:rPr>
+          <w:b/>
+          <w:color w:val="000000" w:themeColor="text1"/>
+          <w:sz w:val="24"/>
+        </w:rPr>
+        <w:fldChar w:fldCharType="begin"/>
+      </w:r>
+      <w:r>
+        <w:rPr>
+          <w:b/>
+          <w:color w:val="000000" w:themeColor="text1"/>
+          <w:sz w:val="24"/>
+        </w:rPr>
+        <w:instrText xml:space="preserve"> SEQ Table \* ARABIC </w:instrText>
+      </w:r>
+      <w:r>
+        <w:rPr>
+          <w:b/>
+          <w:color w:val="000000" w:themeColor="text1"/>
+          <w:sz w:val="24"/>
+        </w:rPr>
+        <w:fldChar w:fldCharType="separate"/>
+      </w:r>
+      <w:r>
+        <w:rPr>
+          <w:b/>
+          <w:noProof/>
+          <w:color w:val="000000" w:themeColor="text1"/>
+          <w:sz w:val="24"/>
+        </w:rPr>
+        <w:t>1</w:t>
+      </w:r>
+      <w:r>
+        <w:rPr>
+          <w:b/>
+          <w:color w:val="000000" w:themeColor="text1"/>
+          <w:sz w:val="24"/>
+        </w:rPr>
+        <w:fldChar w:fldCharType="end"/>
+      </w:r>
+      <w:r>
+        <w:rPr>
+          <w:b/>
+          <w:color w:val="000000" w:themeColor="text1"/>
+          <w:sz w:val="24"/>
+        </w:rPr>
+        <w:t xml:space="preserve"> : Bit Range Definition</w:t>
+      </w:r>
+      <w:bookmarkEnd w:id="63"/>
+    </w:p>
+    <w:p/>
+    <w:p/>
+    <w:p/>
+    <w:p/>
+    <w:p>
+      <w:r>
+        <w:lastRenderedPageBreak/>
+        <w:t xml:space="preserve">For the multiplication stage a saturation check is added to keep the output value to minimum value of -510 and a positive value of 510. Once the weights are applied </w:t>
+      </w:r>
+      <w:r>
+        <w:t xml:space="preserve">the summation stages are broken up </w:t>
+      </w:r>
+      <w:r>
+        <w:t>into</w:t>
+      </w:r>
+      <w:r>
+        <w:t xml:space="preserve"> groups of two </w:t>
+      </w:r>
+      <w:r>
+        <w:t>for</w:t>
+      </w:r>
+      <w:r>
+        <w:t xml:space="preserve"> the sign bits to be tracked properly.</w:t>
+      </w:r>
+    </w:p>
+    <w:p>
+      <w:pPr>
+        <w:keepNext/>
+        <w:jc w:val="center"/>
+      </w:pPr>
+      <w:r>
+        <w:rPr>
+          <w:noProof/>
+        </w:rPr>
+        <w:drawing>
+          <wp:inline distT="0" distB="0" distL="0" distR="0" wp14:anchorId="47969C1F" wp14:editId="03A7B11D">
+            <wp:extent cx="4053840" cy="1645357"/>
+            <wp:effectExtent l="0" t="0" r="0" b="0"/>
+            <wp:docPr id="212289476" name="Picture 1"/>
+            <wp:cNvGraphicFramePr>
+              <a:graphicFrameLocks xmlns:a="http://schemas.openxmlformats.org/drawingml/2006/main" noChangeAspect="1"/>
+            </wp:cNvGraphicFramePr>
+            <a:graphic xmlns:a="http://schemas.openxmlformats.org/drawingml/2006/main">
+              <a:graphicData uri="http://schemas.openxmlformats.org/drawingml/2006/picture">
+                <pic:pic xmlns:pic="http://schemas.openxmlformats.org/drawingml/2006/picture">
+                  <pic:nvPicPr>
+                    <pic:cNvPr id="212289476" name=""/>
+                    <pic:cNvPicPr/>
+                  </pic:nvPicPr>
+                  <pic:blipFill>
+                    <a:blip r:embed="rId19"/>
+                    <a:stretch>
+                      <a:fillRect/>
+                    </a:stretch>
+                  </pic:blipFill>
+                  <pic:spPr>
+                    <a:xfrm>
+                      <a:off x="0" y="0"/>
+                      <a:ext cx="4061424" cy="1648435"/>
+                    </a:xfrm>
+                    <a:prstGeom prst="rect">
+                      <a:avLst/>
+                    </a:prstGeom>
+                  </pic:spPr>
+                </pic:pic>
+              </a:graphicData>
+            </a:graphic>
+          </wp:inline>
+        </w:drawing>
+      </w:r>
+    </w:p>
+    <w:p>
+      <w:pPr>
+        <w:pStyle w:val="Caption"/>
+        <w:jc w:val="center"/>
+        <w:rPr>
+          <w:b/>
+          <w:bCs/>
+          <w:i w:val="0"/>
+          <w:iCs w:val="0"/>
+          <w:sz w:val="24"/>
+          <w:szCs w:val="24"/>
+        </w:rPr>
+      </w:pPr>
+      <w:bookmarkStart w:id="64" w:name="_Toc243843898"/>
+      <w:r>
+        <w:rPr>
+          <w:b/>
+          <w:bCs/>
+          <w:i w:val="0"/>
+          <w:iCs w:val="0"/>
+          <w:sz w:val="24"/>
+          <w:szCs w:val="24"/>
+        </w:rPr>
+        <w:t xml:space="preserve">Figure </w:t>
+      </w:r>
+      <w:r>
+        <w:rPr>
+          <w:b/>
+          <w:bCs/>
+          <w:i w:val="0"/>
+          <w:iCs w:val="0"/>
+          <w:sz w:val="24"/>
+          <w:szCs w:val="24"/>
+        </w:rPr>
+        <w:fldChar w:fldCharType="begin"/>
+      </w:r>
+      <w:r>
+        <w:rPr>
+          <w:b/>
+          <w:bCs/>
+          <w:i w:val="0"/>
+          <w:iCs w:val="0"/>
+          <w:sz w:val="24"/>
+          <w:szCs w:val="24"/>
+        </w:rPr>
+        <w:instrText xml:space="preserve"> SEQ Figure \* ARABIC </w:instrText>
+      </w:r>
+      <w:r>
+        <w:rPr>
+          <w:b/>
+          <w:bCs/>
+          <w:i w:val="0"/>
+          <w:iCs w:val="0"/>
+          <w:sz w:val="24"/>
+          <w:szCs w:val="24"/>
+        </w:rPr>
+        <w:fldChar w:fldCharType="separate"/>
+      </w:r>
+      <w:r>
+        <w:rPr>
+          <w:b/>
+          <w:bCs/>
+          <w:i w:val="0"/>
+          <w:iCs w:val="0"/>
+          <w:noProof/>
+          <w:sz w:val="24"/>
+          <w:szCs w:val="24"/>
+        </w:rPr>
+        <w:t>10</w:t>
+      </w:r>
+      <w:r>
+        <w:rPr>
+          <w:b/>
+          <w:bCs/>
+          <w:i w:val="0"/>
+          <w:iCs w:val="0"/>
+          <w:sz w:val="24"/>
+          <w:szCs w:val="24"/>
+        </w:rPr>
+        <w:fldChar w:fldCharType="end"/>
+      </w:r>
+      <w:r>
+        <w:rPr>
+          <w:b/>
+          <w:bCs/>
+          <w:i w:val="0"/>
+          <w:iCs w:val="0"/>
+          <w:sz w:val="24"/>
+          <w:szCs w:val="24"/>
+        </w:rPr>
+        <w:t xml:space="preserve"> : Overflow Logic</w:t>
+      </w:r>
+      <w:bookmarkEnd w:id="64"/>
+    </w:p>
+    <w:p/>
+    <w:p>
+      <w:r>
+        <w:t xml:space="preserve">After the convoluted values are computed the max output from the squared values is 1,040,400. </w:t>
+      </w:r>
+      <w:r>
+        <w:t xml:space="preserve">A </w:t>
+      </w:r>
+      <w:r>
+        <w:t xml:space="preserve">saturation </w:t>
+      </w:r>
+      <w:r>
+        <w:t xml:space="preserve">and overflow </w:t>
+      </w:r>
+      <w:r>
+        <w:t xml:space="preserve">check </w:t>
+      </w:r>
+      <w:r>
+        <w:t>are</w:t>
+      </w:r>
+      <w:r>
+        <w:t xml:space="preserve"> applied again in the Verilog code, shown in </w:t>
+      </w:r>
+      <w:r>
+        <w:fldChar w:fldCharType="begin"/>
+      </w:r>
+      <w:r>
+        <w:instrText xml:space="preserve"> REF _Ref243845774 \h </w:instrText>
+      </w:r>
+      <w:r>
+        <w:instrText xml:space="preserve"> \* MERGEFORMAT </w:instrText>
+      </w:r>
+      <w:r>
+        <w:fldChar w:fldCharType="separate"/>
+      </w:r>
+      <w:r>
+        <w:t xml:space="preserve">Figure </w:t>
+      </w:r>
+      <w:r>
+        <w:rPr>
+          <w:noProof/>
+        </w:rPr>
+        <w:t>11</w:t>
+      </w:r>
+      <w:r>
+        <w:fldChar w:fldCharType="end"/>
+      </w:r>
+      <w:r>
+        <w:t>, for square and sum calculations for the square root module.</w:t>
+      </w:r>
+    </w:p>
+    <w:p>
+      <w:pPr>
+        <w:keepNext/>
+        <w:jc w:val="center"/>
+      </w:pPr>
+      <w:r>
+        <w:drawing>
+          <wp:inline distT="0" distB="0" distL="0" distR="0" wp14:anchorId="4D060404" wp14:editId="2E50AF01">
+            <wp:extent cx="3872160" cy="2606675"/>
+            <wp:effectExtent l="0" t="0" r="0" b="0"/>
+            <wp:docPr id="1750635449" name="Picture 1"/>
+            <wp:cNvGraphicFramePr>
+              <a:graphicFrameLocks xmlns:a="http://schemas.openxmlformats.org/drawingml/2006/main" noChangeAspect="1"/>
+            </wp:cNvGraphicFramePr>
+            <a:graphic xmlns:a="http://schemas.openxmlformats.org/drawingml/2006/main">
+              <a:graphicData uri="http://schemas.openxmlformats.org/drawingml/2006/picture">
+                <pic:pic xmlns:pic="http://schemas.openxmlformats.org/drawingml/2006/picture">
+                  <pic:nvPicPr>
+                    <pic:cNvPr id="1750635449" name=""/>
+                    <pic:cNvPicPr/>
+                  </pic:nvPicPr>
+                  <pic:blipFill>
+                    <a:blip r:embed="rId20"/>
+                    <a:stretch>
+                      <a:fillRect/>
+                    </a:stretch>
+                  </pic:blipFill>
+                  <pic:spPr>
+                    <a:xfrm>
+                      <a:off x="0" y="0"/>
+                      <a:ext cx="3876791" cy="2609792"/>
+                    </a:xfrm>
+                    <a:prstGeom prst="rect">
+                      <a:avLst/>
+                    </a:prstGeom>
+                  </pic:spPr>
+                </pic:pic>
+              </a:graphicData>
+            </a:graphic>
+          </wp:inline>
+        </w:drawing>
+      </w:r>
+    </w:p>
+    <w:p>
+      <w:pPr>
+        <w:pStyle w:val="Caption"/>
+        <w:jc w:val="center"/>
+        <w:rPr>
+          <w:b/>
+          <w:bCs/>
+          <w:i w:val="0"/>
+          <w:iCs w:val="0"/>
+          <w:color w:val="000000" w:themeColor="text1"/>
+          <w:sz w:val="24"/>
+          <w:szCs w:val="24"/>
+        </w:rPr>
+      </w:pPr>
+      <w:bookmarkStart w:id="65" w:name="_Ref243845774"/>
+      <w:r>
+        <w:rPr>
+          <w:b/>
+          <w:bCs/>
+          <w:i w:val="0"/>
+          <w:iCs w:val="0"/>
+          <w:color w:val="000000" w:themeColor="text1"/>
+          <w:sz w:val="24"/>
+          <w:szCs w:val="24"/>
+        </w:rPr>
+        <w:t xml:space="preserve">Figure </w:t>
+      </w:r>
+      <w:r>
+        <w:rPr>
+          <w:b/>
+          <w:bCs/>
+          <w:i w:val="0"/>
+          <w:iCs w:val="0"/>
+          <w:color w:val="000000" w:themeColor="text1"/>
+          <w:sz w:val="24"/>
+          <w:szCs w:val="24"/>
+        </w:rPr>
+        <w:fldChar w:fldCharType="begin"/>
+      </w:r>
+      <w:r>
+        <w:rPr>
+          <w:b/>
+          <w:bCs/>
+          <w:i w:val="0"/>
+          <w:iCs w:val="0"/>
+          <w:color w:val="000000" w:themeColor="text1"/>
+          <w:sz w:val="24"/>
+          <w:szCs w:val="24"/>
+        </w:rPr>
+        <w:instrText xml:space="preserve"> SEQ Figure \* ARABIC </w:instrText>
+      </w:r>
+      <w:r>
+        <w:rPr>
+          <w:b/>
+          <w:bCs/>
+          <w:i w:val="0"/>
+          <w:iCs w:val="0"/>
+          <w:color w:val="000000" w:themeColor="text1"/>
+          <w:sz w:val="24"/>
+          <w:szCs w:val="24"/>
+        </w:rPr>
+        <w:fldChar w:fldCharType="separate"/>
+      </w:r>
+      <w:r>
+        <w:rPr>
+          <w:b/>
+          <w:bCs/>
+          <w:i w:val="0"/>
+          <w:iCs w:val="0"/>
+          <w:noProof/>
+          <w:color w:val="000000" w:themeColor="text1"/>
+          <w:sz w:val="24"/>
+          <w:szCs w:val="24"/>
+        </w:rPr>
+        <w:t>11</w:t>
+      </w:r>
+      <w:r>
+        <w:rPr>
+          <w:b/>
+          <w:bCs/>
+          <w:i w:val="0"/>
+          <w:iCs w:val="0"/>
+          <w:color w:val="000000" w:themeColor="text1"/>
+          <w:sz w:val="24"/>
+          <w:szCs w:val="24"/>
+        </w:rPr>
+        <w:fldChar w:fldCharType="end"/>
+      </w:r>
+      <w:bookmarkEnd w:id="65"/>
+      <w:r>
+        <w:rPr>
+          <w:b/>
+          <w:bCs/>
+          <w:i w:val="0"/>
+          <w:iCs w:val="0"/>
+          <w:color w:val="000000" w:themeColor="text1"/>
+          <w:sz w:val="24"/>
+          <w:szCs w:val="24"/>
+        </w:rPr>
+        <w:t>: Convoluted Saturation</w:t>
+      </w:r>
+      <w:r>
+        <w:rPr>
+          <w:b/>
+          <w:bCs/>
+          <w:i w:val="0"/>
+          <w:iCs w:val="0"/>
+          <w:color w:val="000000" w:themeColor="text1"/>
+          <w:sz w:val="24"/>
+          <w:szCs w:val="24"/>
+        </w:rPr>
+        <w:t xml:space="preserve"> and Overflow</w:t>
+      </w:r>
+    </w:p>
+    <w:p>
+      <w:r>
+        <w:t xml:space="preserve">The square root module is based on the algorithm description described in the ICCD conference paper, </w:t>
+      </w:r>
+      <w:r>
+        <w:rPr>
+          <w:u w:val="single"/>
+        </w:rPr>
+        <w:t>A New Non-Restoring Square Root Algorithm and Its VLSI Implementations</w:t>
+      </w:r>
+      <w:r>
+        <w:t xml:space="preserve">, by Yamin Li and </w:t>
+      </w:r>
+      <w:proofErr w:type="spellStart"/>
+      <w:r>
+        <w:t>Wanming</w:t>
+      </w:r>
+      <w:proofErr w:type="spellEnd"/>
+      <w:r>
+        <w:t xml:space="preserve"> Chu. </w:t>
+      </w:r>
+      <w:r>
+        <w:t xml:space="preserve">The initial source code was referenced from verilogcodes.blogspot.com, posted by user </w:t>
+      </w:r>
+      <w:proofErr w:type="spellStart"/>
+      <w:r>
+        <w:t>vipin</w:t>
+      </w:r>
+      <w:proofErr w:type="spellEnd"/>
+      <w:r>
+        <w:t>. In this square root design, the algorithm does iterations of add and subtracts and no use of multipliers.</w:t>
+      </w:r>
+      <w:r>
+        <w:t xml:space="preserve"> </w:t>
+      </w:r>
+    </w:p>
+    <w:p>
+      <w:r>
+        <w:lastRenderedPageBreak/>
+        <w:t>The source c</w:t>
+      </w:r>
+      <w:r>
+        <w:t>ode</w:t>
+      </w:r>
+      <w:r>
+        <w:t xml:space="preserve"> was updated with a state machine flow and </w:t>
+      </w:r>
+      <w:proofErr w:type="gramStart"/>
+      <w:r>
+        <w:t>start</w:t>
+      </w:r>
+      <w:proofErr w:type="gramEnd"/>
+      <w:r>
+        <w:t xml:space="preserve"> signal logic to initiate the comp</w:t>
+      </w:r>
+      <w:r>
+        <w:t>u</w:t>
+      </w:r>
+      <w:r>
+        <w:t>tation.</w:t>
+      </w:r>
+      <w:r>
+        <w:t xml:space="preserve"> </w:t>
+      </w:r>
+      <w:r>
+        <w:t xml:space="preserve"> Once the square root value is calculated a check is added to determine if the value is greater than the max value of 255.</w:t>
+      </w:r>
+    </w:p>
+    <w:p>
+      <w:pPr>
+        <w:pStyle w:val="Heading1"/>
+        <w:rPr>
+          <w:b/>
+          <w:bCs/>
+          <w:color w:val="000000" w:themeColor="text1"/>
+        </w:rPr>
+      </w:pPr>
+      <w:r>
+        <w:rPr>
+          <w:b/>
+          <w:bCs/>
+          <w:color w:val="000000" w:themeColor="text1"/>
+        </w:rPr>
+        <w:t>Results</w:t>
+      </w:r>
+      <w:r>
+        <w:rPr>
+          <w:b/>
+          <w:bCs/>
+          <w:color w:val="000000" w:themeColor="text1"/>
+        </w:rPr>
+        <w:t xml:space="preserve"> </w:t>
+      </w:r>
     </w:p>
     <w:p/>
     <w:sectPr>
@@ -2747,7 +4902,7 @@
           <w:rPr>
             <w:noProof/>
           </w:rPr>
-          <w:t>2</w:t>
+          <w:t>4</w:t>
         </w:r>
         <w:r>
           <w:rPr>
@@ -3065,13 +5220,13 @@
       </w:pPr>
     </w:lvl>
   </w:abstractNum>
-  <w:num w:numId="1" w16cid:durableId="1722751409">
+  <w:num w:numId="1" w16cid:durableId="1736463276">
     <w:abstractNumId w:val="2"/>
   </w:num>
-  <w:num w:numId="2" w16cid:durableId="1224489210">
+  <w:num w:numId="2" w16cid:durableId="87041972">
     <w:abstractNumId w:val="0"/>
   </w:num>
-  <w:num w:numId="3" w16cid:durableId="1690251204">
+  <w:num w:numId="3" w16cid:durableId="1823886605">
     <w:abstractNumId w:val="1"/>
   </w:num>
 </w:numbering>
@@ -4190,8 +6345,8 @@
       </w:tblBorders>
     </w:tblPr>
   </w:style>
-  <w:style w:type="character" w:styleId="UnresolvedMention">
-    <w:name w:val="Unresolved Mention"/>
+  <w:style w:type="character" w:customStyle="1" w:styleId="UnresolvedMention1">
+    <w:name w:val="Unresolved Mention1"/>
     <w:basedOn w:val="DefaultParagraphFont"/>
     <w:uiPriority w:val="99"/>
     <w:semiHidden/>
@@ -4517,7 +6672,7 @@
 </file>
 
 <file path=customXml/itemProps1.xml><?xml version="1.0" encoding="utf-8"?>
-<ds:datastoreItem xmlns:ds="http://schemas.openxmlformats.org/officeDocument/2006/customXml" ds:itemID="{8DDF0738-B9B4-4C13-B376-E6A3D519537B}">
+<ds:datastoreItem xmlns:ds="http://schemas.openxmlformats.org/officeDocument/2006/customXml" ds:itemID="{A02FCCFA-C2FA-4462-8DC1-CC78C12B0E5B}">
   <ds:schemaRefs>
     <ds:schemaRef ds:uri="http://schemas.openxmlformats.org/officeDocument/2006/bibliography"/>
   </ds:schemaRefs>

</xml_diff>

<commit_message>
prelim draft and vitis code
</commit_message>
<xml_diff>
--- a/documents/rev.docx
+++ b/documents/rev.docx
@@ -71,11 +71,9 @@
       <w:pPr>
         <w:jc w:val="center"/>
       </w:pPr>
-      <w:proofErr w:type="gramStart"/>
       <w:r>
         <w:t>By</w:t>
       </w:r>
-      <w:proofErr w:type="gramEnd"/>
     </w:p>
     <w:p>
       <w:pPr>
@@ -253,7 +251,7 @@
         </w:r>
       </w:ins>
       <w:r>
-        <w:t xml:space="preserve">   </w:t>
+        <w:t xml:space="preserve">  </w:t>
       </w:r>
       <w:r>
         <w:t>_</w:t>
@@ -344,15 +342,7 @@
       </w:pPr>
       <w:ins w:id="36" w:author="Funes, Aaron" w:date="2026-10-10T14:17:00Z">
         <w:r>
-          <w:t xml:space="preserve">Dr. </w:t>
-        </w:r>
-        <w:proofErr w:type="spellStart"/>
-        <w:r>
-          <w:t>Shahnam</w:t>
-        </w:r>
-        <w:proofErr w:type="spellEnd"/>
-        <w:r>
-          <w:t xml:space="preserve"> Mirzaei</w:t>
+          <w:t>Dr. Shahnam Mirzaei</w:t>
         </w:r>
       </w:ins>
       <w:ins w:id="37" w:author="Funes, Aaron" w:date="2026-10-10T14:19:00Z">
@@ -614,7 +604,21 @@
               <w:b/>
               <w:bCs/>
             </w:rPr>
-            <w:t>Design Implementation</w:t>
+            <w:t>Design Impleme</w:t>
+          </w:r>
+          <w:r>
+            <w:rPr>
+              <w:b/>
+              <w:bCs/>
+            </w:rPr>
+            <w:t>n</w:t>
+          </w:r>
+          <w:r>
+            <w:rPr>
+              <w:b/>
+              <w:bCs/>
+            </w:rPr>
+            <w:t>tation</w:t>
           </w:r>
           <w:r>
             <w:rPr>
@@ -643,7 +647,30 @@
             <w:ptab w:relativeTo="margin" w:alignment="right" w:leader="dot"/>
           </w:r>
           <w:r>
-            <w:t>7</w:t>
+            <w:t>8</w:t>
+          </w:r>
+        </w:p>
+        <w:p>
+          <w:pPr>
+            <w:pStyle w:val="TOC1"/>
+          </w:pPr>
+          <w:r>
+            <w:rPr>
+              <w:b/>
+            </w:rPr>
+            <w:t>Re</w:t>
+          </w:r>
+          <w:r>
+            <w:rPr>
+              <w:b/>
+            </w:rPr>
+            <w:t>ferences</w:t>
+          </w:r>
+          <w:r>
+            <w:ptab w:relativeTo="margin" w:alignment="right" w:leader="dot"/>
+          </w:r>
+          <w:r>
+            <w:t>10</w:t>
           </w:r>
         </w:p>
       </w:sdtContent>
@@ -696,7 +723,7 @@
       <w:r>
         <w:fldChar w:fldCharType="separate"/>
       </w:r>
-      <w:hyperlink w:anchor="_Toc243843887" w:history="1">
+      <w:hyperlink w:anchor="_Toc244119055" w:history="1">
         <w:r>
           <w:rPr>
             <w:rStyle w:val="Hyperlink"/>
@@ -724,7 +751,7 @@
             <w:noProof/>
             <w:webHidden/>
           </w:rPr>
-          <w:instrText xml:space="preserve"> PAGEREF _Toc243843887 \h </w:instrText>
+          <w:instrText xml:space="preserve"> PAGEREF _Toc244119055 \h </w:instrText>
         </w:r>
         <w:r>
           <w:rPr>
@@ -810,7 +837,7 @@
       <w:r>
         <w:fldChar w:fldCharType="separate"/>
       </w:r>
-      <w:hyperlink w:anchor="_Toc243843889" w:history="1">
+      <w:hyperlink w:anchor="_Toc244119056" w:history="1">
         <w:r>
           <w:rPr>
             <w:rStyle w:val="Hyperlink"/>
@@ -838,7 +865,7 @@
             <w:noProof/>
             <w:webHidden/>
           </w:rPr>
-          <w:instrText xml:space="preserve"> PAGEREF _Toc243843889 \h </w:instrText>
+          <w:instrText xml:space="preserve"> PAGEREF _Toc244119056 \h </w:instrText>
         </w:r>
         <w:r>
           <w:rPr>
@@ -880,7 +907,7 @@
           <w:noProof/>
         </w:rPr>
       </w:pPr>
-      <w:hyperlink w:anchor="_Toc243843890" w:history="1">
+      <w:hyperlink w:anchor="_Toc244119057" w:history="1">
         <w:r>
           <w:rPr>
             <w:rStyle w:val="Hyperlink"/>
@@ -908,7 +935,7 @@
             <w:noProof/>
             <w:webHidden/>
           </w:rPr>
-          <w:instrText xml:space="preserve"> PAGEREF _Toc243843890 \h </w:instrText>
+          <w:instrText xml:space="preserve"> PAGEREF _Toc244119057 \h </w:instrText>
         </w:r>
         <w:r>
           <w:rPr>
@@ -950,7 +977,7 @@
           <w:noProof/>
         </w:rPr>
       </w:pPr>
-      <w:hyperlink w:anchor="_Toc243843891" w:history="1">
+      <w:hyperlink w:anchor="_Toc244119058" w:history="1">
         <w:r>
           <w:rPr>
             <w:rStyle w:val="Hyperlink"/>
@@ -978,7 +1005,7 @@
             <w:noProof/>
             <w:webHidden/>
           </w:rPr>
-          <w:instrText xml:space="preserve"> PAGEREF _Toc243843891 \h </w:instrText>
+          <w:instrText xml:space="preserve"> PAGEREF _Toc244119058 \h </w:instrText>
         </w:r>
         <w:r>
           <w:rPr>
@@ -1020,7 +1047,7 @@
           <w:noProof/>
         </w:rPr>
       </w:pPr>
-      <w:hyperlink w:anchor="_Toc243843892" w:history="1">
+      <w:hyperlink w:anchor="_Toc244119059" w:history="1">
         <w:r>
           <w:rPr>
             <w:rStyle w:val="Hyperlink"/>
@@ -1048,7 +1075,7 @@
             <w:noProof/>
             <w:webHidden/>
           </w:rPr>
-          <w:instrText xml:space="preserve"> PAGEREF _Toc243843892 \h </w:instrText>
+          <w:instrText xml:space="preserve"> PAGEREF _Toc244119059 \h </w:instrText>
         </w:r>
         <w:r>
           <w:rPr>
@@ -1090,7 +1117,7 @@
           <w:noProof/>
         </w:rPr>
       </w:pPr>
-      <w:hyperlink w:anchor="_Toc243843893" w:history="1">
+      <w:hyperlink w:anchor="_Toc244119060" w:history="1">
         <w:r>
           <w:rPr>
             <w:rStyle w:val="Hyperlink"/>
@@ -1101,6 +1128,15 @@
         </w:r>
         <w:r>
           <w:rPr>
+            <w:rStyle w:val="Hyperlink"/>
+            <w:b/>
+            <w:noProof/>
+            <w:vertAlign w:val="superscript"/>
+          </w:rPr>
+          <w:t>1</w:t>
+        </w:r>
+        <w:r>
+          <w:rPr>
             <w:noProof/>
             <w:webHidden/>
           </w:rPr>
@@ -1118,7 +1154,7 @@
             <w:noProof/>
             <w:webHidden/>
           </w:rPr>
-          <w:instrText xml:space="preserve"> PAGEREF _Toc243843893 \h </w:instrText>
+          <w:instrText xml:space="preserve"> PAGEREF _Toc244119060 \h </w:instrText>
         </w:r>
         <w:r>
           <w:rPr>
@@ -1160,7 +1196,7 @@
           <w:noProof/>
         </w:rPr>
       </w:pPr>
-      <w:hyperlink w:anchor="_Toc243843894" w:history="1">
+      <w:hyperlink w:anchor="_Toc244119061" w:history="1">
         <w:r>
           <w:rPr>
             <w:rStyle w:val="Hyperlink"/>
@@ -1188,7 +1224,7 @@
             <w:noProof/>
             <w:webHidden/>
           </w:rPr>
-          <w:instrText xml:space="preserve"> PAGEREF _Toc243843894 \h </w:instrText>
+          <w:instrText xml:space="preserve"> PAGEREF _Toc244119061 \h </w:instrText>
         </w:r>
         <w:r>
           <w:rPr>
@@ -1230,7 +1266,7 @@
           <w:noProof/>
         </w:rPr>
       </w:pPr>
-      <w:hyperlink w:anchor="_Toc243843895" w:history="1">
+      <w:hyperlink w:anchor="_Toc244119062" w:history="1">
         <w:r>
           <w:rPr>
             <w:rStyle w:val="Hyperlink"/>
@@ -1258,7 +1294,7 @@
             <w:noProof/>
             <w:webHidden/>
           </w:rPr>
-          <w:instrText xml:space="preserve"> PAGEREF _Toc243843895 \h </w:instrText>
+          <w:instrText xml:space="preserve"> PAGEREF _Toc244119062 \h </w:instrText>
         </w:r>
         <w:r>
           <w:rPr>
@@ -1300,7 +1336,7 @@
           <w:noProof/>
         </w:rPr>
       </w:pPr>
-      <w:hyperlink w:anchor="_Toc243843896" w:history="1">
+      <w:hyperlink w:anchor="_Toc244119063" w:history="1">
         <w:r>
           <w:rPr>
             <w:rStyle w:val="Hyperlink"/>
@@ -1329,7 +1365,7 @@
             <w:noProof/>
             <w:webHidden/>
           </w:rPr>
-          <w:instrText xml:space="preserve"> PAGEREF _Toc243843896 \h </w:instrText>
+          <w:instrText xml:space="preserve"> PAGEREF _Toc244119063 \h </w:instrText>
         </w:r>
         <w:r>
           <w:rPr>
@@ -1371,7 +1407,7 @@
           <w:noProof/>
         </w:rPr>
       </w:pPr>
-      <w:hyperlink w:anchor="_Toc243843897" w:history="1">
+      <w:hyperlink w:anchor="_Toc244119064" w:history="1">
         <w:r>
           <w:rPr>
             <w:rStyle w:val="Hyperlink"/>
@@ -1400,7 +1436,7 @@
             <w:noProof/>
             <w:webHidden/>
           </w:rPr>
-          <w:instrText xml:space="preserve"> PAGEREF _Toc243843897 \h </w:instrText>
+          <w:instrText xml:space="preserve"> PAGEREF _Toc244119064 \h </w:instrText>
         </w:r>
         <w:r>
           <w:rPr>
@@ -1442,7 +1478,7 @@
           <w:noProof/>
         </w:rPr>
       </w:pPr>
-      <w:hyperlink w:anchor="_Toc243843898" w:history="1">
+      <w:hyperlink w:anchor="_Toc244119065" w:history="1">
         <w:r>
           <w:rPr>
             <w:rStyle w:val="Hyperlink"/>
@@ -1471,7 +1507,7 @@
             <w:noProof/>
             <w:webHidden/>
           </w:rPr>
-          <w:instrText xml:space="preserve"> PAGEREF _Toc243843898 \h </w:instrText>
+          <w:instrText xml:space="preserve"> PAGEREF _Toc244119065 \h </w:instrText>
         </w:r>
         <w:r>
           <w:rPr>
@@ -1503,6 +1539,429 @@
       </w:hyperlink>
     </w:p>
     <w:p>
+      <w:pPr>
+        <w:pStyle w:val="TableofFigures"/>
+        <w:tabs>
+          <w:tab w:val="right" w:leader="dot" w:pos="9350"/>
+        </w:tabs>
+        <w:rPr>
+          <w:rFonts w:eastAsiaTheme="minorEastAsia"/>
+          <w:noProof/>
+        </w:rPr>
+      </w:pPr>
+      <w:hyperlink w:anchor="_Toc244119066" w:history="1">
+        <w:r>
+          <w:rPr>
+            <w:rStyle w:val="Hyperlink"/>
+            <w:b/>
+            <w:bCs/>
+            <w:noProof/>
+          </w:rPr>
+          <w:t>Figure 11: Convoluted Saturation and Overflow</w:t>
+        </w:r>
+        <w:r>
+          <w:rPr>
+            <w:noProof/>
+            <w:webHidden/>
+          </w:rPr>
+          <w:tab/>
+        </w:r>
+        <w:r>
+          <w:rPr>
+            <w:noProof/>
+            <w:webHidden/>
+          </w:rPr>
+          <w:fldChar w:fldCharType="begin"/>
+        </w:r>
+        <w:r>
+          <w:rPr>
+            <w:noProof/>
+            <w:webHidden/>
+          </w:rPr>
+          <w:instrText xml:space="preserve"> PAGEREF _Toc244119066 \h </w:instrText>
+        </w:r>
+        <w:r>
+          <w:rPr>
+            <w:noProof/>
+            <w:webHidden/>
+          </w:rPr>
+        </w:r>
+        <w:r>
+          <w:rPr>
+            <w:noProof/>
+            <w:webHidden/>
+          </w:rPr>
+          <w:fldChar w:fldCharType="separate"/>
+        </w:r>
+        <w:r>
+          <w:rPr>
+            <w:noProof/>
+            <w:webHidden/>
+          </w:rPr>
+          <w:t>6</w:t>
+        </w:r>
+        <w:r>
+          <w:rPr>
+            <w:noProof/>
+            <w:webHidden/>
+          </w:rPr>
+          <w:fldChar w:fldCharType="end"/>
+        </w:r>
+      </w:hyperlink>
+    </w:p>
+    <w:p>
+      <w:pPr>
+        <w:pStyle w:val="TableofFigures"/>
+        <w:tabs>
+          <w:tab w:val="right" w:leader="dot" w:pos="9350"/>
+        </w:tabs>
+        <w:rPr>
+          <w:rFonts w:eastAsiaTheme="minorEastAsia"/>
+          <w:noProof/>
+        </w:rPr>
+      </w:pPr>
+      <w:hyperlink w:anchor="_Toc244119067" w:history="1">
+        <w:r>
+          <w:rPr>
+            <w:rStyle w:val="Hyperlink"/>
+            <w:b/>
+            <w:bCs/>
+            <w:noProof/>
+          </w:rPr>
+          <w:t>Figure 12 : Sobel Block Diagram</w:t>
+        </w:r>
+        <w:r>
+          <w:rPr>
+            <w:noProof/>
+            <w:webHidden/>
+          </w:rPr>
+          <w:tab/>
+        </w:r>
+        <w:r>
+          <w:rPr>
+            <w:noProof/>
+            <w:webHidden/>
+          </w:rPr>
+          <w:fldChar w:fldCharType="begin"/>
+        </w:r>
+        <w:r>
+          <w:rPr>
+            <w:noProof/>
+            <w:webHidden/>
+          </w:rPr>
+          <w:instrText xml:space="preserve"> PAGEREF _Toc244119067 \h </w:instrText>
+        </w:r>
+        <w:r>
+          <w:rPr>
+            <w:noProof/>
+            <w:webHidden/>
+          </w:rPr>
+        </w:r>
+        <w:r>
+          <w:rPr>
+            <w:noProof/>
+            <w:webHidden/>
+          </w:rPr>
+          <w:fldChar w:fldCharType="separate"/>
+        </w:r>
+        <w:r>
+          <w:rPr>
+            <w:noProof/>
+            <w:webHidden/>
+          </w:rPr>
+          <w:t>7</w:t>
+        </w:r>
+        <w:r>
+          <w:rPr>
+            <w:noProof/>
+            <w:webHidden/>
+          </w:rPr>
+          <w:fldChar w:fldCharType="end"/>
+        </w:r>
+      </w:hyperlink>
+    </w:p>
+    <w:p>
+      <w:pPr>
+        <w:pStyle w:val="TableofFigures"/>
+        <w:tabs>
+          <w:tab w:val="right" w:leader="dot" w:pos="9350"/>
+        </w:tabs>
+        <w:rPr>
+          <w:rFonts w:eastAsiaTheme="minorEastAsia"/>
+          <w:noProof/>
+        </w:rPr>
+      </w:pPr>
+      <w:hyperlink w:anchor="_Toc244119068" w:history="1">
+        <w:r>
+          <w:rPr>
+            <w:rStyle w:val="Hyperlink"/>
+            <w:b/>
+            <w:noProof/>
+          </w:rPr>
+          <w:t>Figure 13 : Golden Model</w:t>
+        </w:r>
+        <w:r>
+          <w:rPr>
+            <w:noProof/>
+            <w:webHidden/>
+          </w:rPr>
+          <w:tab/>
+        </w:r>
+        <w:r>
+          <w:rPr>
+            <w:noProof/>
+            <w:webHidden/>
+          </w:rPr>
+          <w:fldChar w:fldCharType="begin"/>
+        </w:r>
+        <w:r>
+          <w:rPr>
+            <w:noProof/>
+            <w:webHidden/>
+          </w:rPr>
+          <w:instrText xml:space="preserve"> PAGEREF _Toc244119068 \h </w:instrText>
+        </w:r>
+        <w:r>
+          <w:rPr>
+            <w:noProof/>
+            <w:webHidden/>
+          </w:rPr>
+        </w:r>
+        <w:r>
+          <w:rPr>
+            <w:noProof/>
+            <w:webHidden/>
+          </w:rPr>
+          <w:fldChar w:fldCharType="separate"/>
+        </w:r>
+        <w:r>
+          <w:rPr>
+            <w:noProof/>
+            <w:webHidden/>
+          </w:rPr>
+          <w:t>8</w:t>
+        </w:r>
+        <w:r>
+          <w:rPr>
+            <w:noProof/>
+            <w:webHidden/>
+          </w:rPr>
+          <w:fldChar w:fldCharType="end"/>
+        </w:r>
+      </w:hyperlink>
+    </w:p>
+    <w:p>
+      <w:pPr>
+        <w:pStyle w:val="TableofFigures"/>
+        <w:tabs>
+          <w:tab w:val="right" w:leader="dot" w:pos="9350"/>
+        </w:tabs>
+        <w:rPr>
+          <w:rFonts w:eastAsiaTheme="minorEastAsia"/>
+          <w:noProof/>
+        </w:rPr>
+      </w:pPr>
+      <w:hyperlink w:anchor="_Toc244119069" w:history="1">
+        <w:r>
+          <w:rPr>
+            <w:rStyle w:val="Hyperlink"/>
+            <w:b/>
+            <w:noProof/>
+          </w:rPr>
+          <w:t>Figure 14 : Max Pixel Value check</w:t>
+        </w:r>
+        <w:r>
+          <w:rPr>
+            <w:noProof/>
+            <w:webHidden/>
+          </w:rPr>
+          <w:tab/>
+        </w:r>
+        <w:r>
+          <w:rPr>
+            <w:noProof/>
+            <w:webHidden/>
+          </w:rPr>
+          <w:fldChar w:fldCharType="begin"/>
+        </w:r>
+        <w:r>
+          <w:rPr>
+            <w:noProof/>
+            <w:webHidden/>
+          </w:rPr>
+          <w:instrText xml:space="preserve"> PAGEREF _Toc244119069 \h </w:instrText>
+        </w:r>
+        <w:r>
+          <w:rPr>
+            <w:noProof/>
+            <w:webHidden/>
+          </w:rPr>
+        </w:r>
+        <w:r>
+          <w:rPr>
+            <w:noProof/>
+            <w:webHidden/>
+          </w:rPr>
+          <w:fldChar w:fldCharType="separate"/>
+        </w:r>
+        <w:r>
+          <w:rPr>
+            <w:noProof/>
+            <w:webHidden/>
+          </w:rPr>
+          <w:t>8</w:t>
+        </w:r>
+        <w:r>
+          <w:rPr>
+            <w:noProof/>
+            <w:webHidden/>
+          </w:rPr>
+          <w:fldChar w:fldCharType="end"/>
+        </w:r>
+      </w:hyperlink>
+    </w:p>
+    <w:p>
+      <w:pPr>
+        <w:pStyle w:val="TableofFigures"/>
+        <w:tabs>
+          <w:tab w:val="right" w:leader="dot" w:pos="9350"/>
+        </w:tabs>
+        <w:rPr>
+          <w:rFonts w:eastAsiaTheme="minorEastAsia"/>
+          <w:noProof/>
+        </w:rPr>
+      </w:pPr>
+      <w:hyperlink w:anchor="_Toc244119070" w:history="1">
+        <w:r>
+          <w:rPr>
+            <w:rStyle w:val="Hyperlink"/>
+            <w:b/>
+            <w:noProof/>
+          </w:rPr>
+          <w:t>Figure 15 : Simulation Results</w:t>
+        </w:r>
+        <w:r>
+          <w:rPr>
+            <w:noProof/>
+            <w:webHidden/>
+          </w:rPr>
+          <w:tab/>
+        </w:r>
+        <w:r>
+          <w:rPr>
+            <w:noProof/>
+            <w:webHidden/>
+          </w:rPr>
+          <w:fldChar w:fldCharType="begin"/>
+        </w:r>
+        <w:r>
+          <w:rPr>
+            <w:noProof/>
+            <w:webHidden/>
+          </w:rPr>
+          <w:instrText xml:space="preserve"> PAGEREF _Toc244119070 \h </w:instrText>
+        </w:r>
+        <w:r>
+          <w:rPr>
+            <w:noProof/>
+            <w:webHidden/>
+          </w:rPr>
+        </w:r>
+        <w:r>
+          <w:rPr>
+            <w:noProof/>
+            <w:webHidden/>
+          </w:rPr>
+          <w:fldChar w:fldCharType="separate"/>
+        </w:r>
+        <w:r>
+          <w:rPr>
+            <w:noProof/>
+            <w:webHidden/>
+          </w:rPr>
+          <w:t>8</w:t>
+        </w:r>
+        <w:r>
+          <w:rPr>
+            <w:noProof/>
+            <w:webHidden/>
+          </w:rPr>
+          <w:fldChar w:fldCharType="end"/>
+        </w:r>
+      </w:hyperlink>
+    </w:p>
+    <w:p>
+      <w:pPr>
+        <w:pStyle w:val="TableofFigures"/>
+        <w:tabs>
+          <w:tab w:val="right" w:leader="dot" w:pos="9350"/>
+        </w:tabs>
+        <w:rPr>
+          <w:rFonts w:eastAsiaTheme="minorEastAsia"/>
+          <w:noProof/>
+        </w:rPr>
+      </w:pPr>
+      <w:hyperlink w:anchor="_Toc244119071" w:history="1">
+        <w:r>
+          <w:rPr>
+            <w:rStyle w:val="Hyperlink"/>
+            <w:b/>
+            <w:bCs/>
+            <w:noProof/>
+          </w:rPr>
+          <w:t>Figure 16 : Test Log Output</w:t>
+        </w:r>
+        <w:r>
+          <w:rPr>
+            <w:noProof/>
+            <w:webHidden/>
+          </w:rPr>
+          <w:tab/>
+        </w:r>
+        <w:r>
+          <w:rPr>
+            <w:noProof/>
+            <w:webHidden/>
+          </w:rPr>
+          <w:fldChar w:fldCharType="begin"/>
+        </w:r>
+        <w:r>
+          <w:rPr>
+            <w:noProof/>
+            <w:webHidden/>
+          </w:rPr>
+          <w:instrText xml:space="preserve"> PAGEREF _Toc244119071 \h </w:instrText>
+        </w:r>
+        <w:r>
+          <w:rPr>
+            <w:noProof/>
+            <w:webHidden/>
+          </w:rPr>
+        </w:r>
+        <w:r>
+          <w:rPr>
+            <w:noProof/>
+            <w:webHidden/>
+          </w:rPr>
+          <w:fldChar w:fldCharType="separate"/>
+        </w:r>
+        <w:r>
+          <w:rPr>
+            <w:noProof/>
+            <w:webHidden/>
+          </w:rPr>
+          <w:t>9</w:t>
+        </w:r>
+        <w:r>
+          <w:rPr>
+            <w:noProof/>
+            <w:webHidden/>
+          </w:rPr>
+          <w:fldChar w:fldCharType="end"/>
+        </w:r>
+      </w:hyperlink>
+    </w:p>
+    <w:p>
       <w:r>
         <w:fldChar w:fldCharType="end"/>
       </w:r>
@@ -1512,16 +1971,17 @@
     </w:p>
     <w:p>
       <w:pPr>
+        <w:pStyle w:val="Heading1"/>
         <w:jc w:val="center"/>
         <w:rPr>
           <w:b/>
-          <w:bCs/>
-        </w:rPr>
-      </w:pPr>
-      <w:r>
-        <w:rPr>
-          <w:b/>
-          <w:bCs/>
+          <w:color w:val="000000" w:themeColor="text1"/>
+        </w:rPr>
+      </w:pPr>
+      <w:r>
+        <w:rPr>
+          <w:b/>
+          <w:color w:val="000000" w:themeColor="text1"/>
         </w:rPr>
         <w:lastRenderedPageBreak/>
         <w:t>Acronym List</w:t>
@@ -1703,11 +2163,9 @@
       <w:pPr>
         <w:jc w:val="center"/>
       </w:pPr>
-      <w:proofErr w:type="gramStart"/>
       <w:r>
         <w:t>By</w:t>
       </w:r>
-      <w:proofErr w:type="gramEnd"/>
     </w:p>
     <w:p>
       <w:pPr>
@@ -1743,26 +2201,10 @@
         <w:t xml:space="preserve">Edge detection algorithms are an important image processing technique used in our current world. They are used </w:t>
       </w:r>
       <w:r>
-        <w:t xml:space="preserve">across many applications, medical devices, surveillance systems, and autonomous systems for example. The Sobel Filter is an edge detection algorithm that </w:t>
-      </w:r>
-      <w:proofErr w:type="gramStart"/>
-      <w:r>
-        <w:t>applies</w:t>
-      </w:r>
-      <w:proofErr w:type="gramEnd"/>
-      <w:r>
-        <w:t xml:space="preserve"> a 3x3 filter upon a subsection of an image to find any edges that may exist. When performed in software the filter is applied consecutively through the data of the image. </w:t>
-      </w:r>
-      <w:r>
-        <w:t xml:space="preserve">With the use of a Field-Programmable Gate Array (FPGA), the filter could be applied in parallel allowing the edge detection process to be sped up. In this project, an image will be loaded to the </w:t>
-      </w:r>
-      <w:proofErr w:type="spellStart"/>
-      <w:r>
-        <w:t>Zybo</w:t>
-      </w:r>
-      <w:proofErr w:type="spellEnd"/>
-      <w:r>
-        <w:t xml:space="preserve"> Z7-20 development board, where the filter design will exist in the programmable logic (PL), have the filter applied to the image, and output the updated image with the edge detection applied.</w:t>
+        <w:t xml:space="preserve">across many applications, medical devices, surveillance systems, and autonomous systems for example. The Sobel Filter is an edge detection algorithm that applies a 3x3 filter upon a subsection of an image to find any edges that may exist. When performed in software the filter is applied consecutively through the data of the image. </w:t>
+      </w:r>
+      <w:r>
+        <w:t>With the use of a Field-Programmable Gate Array (FPGA), the filter could be applied in parallel allowing the edge detection process to be sped up. In this project, an image will be loaded to the Zybo Z7-20 development board, where the filter design will exist in the programmable logic (PL), have the filter applied to the image, and output the updated image with the edge detection applied.</w:t>
       </w:r>
     </w:p>
     <w:p>
@@ -1873,7 +2315,13 @@
         <w:fldChar w:fldCharType="end"/>
       </w:r>
       <w:r>
-        <w:t xml:space="preserve">, the post image processing image. </w:t>
+        <w:t xml:space="preserve">, the post </w:t>
+      </w:r>
+      <w:r>
+        <w:t>image-processing</w:t>
+      </w:r>
+      <w:r>
+        <w:t xml:space="preserve"> image. </w:t>
       </w:r>
     </w:p>
     <w:p>
@@ -1951,7 +2399,7 @@
         </w:rPr>
       </w:pPr>
       <w:bookmarkStart w:id="46" w:name="_Ref242543934"/>
-      <w:bookmarkStart w:id="47" w:name="_Toc243843889"/>
+      <w:bookmarkStart w:id="47" w:name="_Toc244119056"/>
       <w:r>
         <w:rPr>
           <w:b/>
@@ -2108,7 +2556,7 @@
         </w:rPr>
       </w:pPr>
       <w:bookmarkStart w:id="48" w:name="_Ref242543947"/>
-      <w:bookmarkStart w:id="49" w:name="_Toc243843890"/>
+      <w:bookmarkStart w:id="49" w:name="_Toc244119057"/>
       <w:r>
         <w:rPr>
           <w:b/>
@@ -2201,15 +2649,7 @@
       </w:pPr>
       <w:r>
         <w:lastRenderedPageBreak/>
-        <w:t xml:space="preserve">The Sobel Filter is an edge detection algorithm that </w:t>
-      </w:r>
-      <w:proofErr w:type="gramStart"/>
-      <w:r>
-        <w:t>applies</w:t>
-      </w:r>
-      <w:proofErr w:type="gramEnd"/>
-      <w:r>
-        <w:t xml:space="preserve"> a 3x3 filter upon a subsection of an image to find any edges that may exist.</w:t>
+        <w:t>The Sobel Filter is an edge detection algorithm that applies a 3x3 filter upon a subsection of an image to find any edges that may exist.</w:t>
       </w:r>
       <w:r>
         <w:t xml:space="preserve"> The filter is performed by appl</w:t>
@@ -2352,7 +2792,7 @@
         </w:rPr>
       </w:pPr>
       <w:bookmarkStart w:id="50" w:name="_Ref242543517"/>
-      <w:bookmarkStart w:id="51" w:name="_Toc243843891"/>
+      <w:bookmarkStart w:id="51" w:name="_Toc244119058"/>
       <w:r>
         <w:rPr>
           <w:b/>
@@ -2436,25 +2876,7 @@
     </w:p>
     <w:p>
       <w:r>
-        <w:t>To apply the derivative, weights are multiplied to each pixel location with the upper row being pixels (0,0), (0,1), (0,2), where the designation is (</w:t>
-      </w:r>
-      <w:proofErr w:type="spellStart"/>
-      <w:proofErr w:type="gramStart"/>
-      <w:r>
-        <w:t>row,column</w:t>
-      </w:r>
-      <w:proofErr w:type="spellEnd"/>
-      <w:proofErr w:type="gramEnd"/>
-      <w:r>
-        <w:t xml:space="preserve">). Once all the weights are applied to each pixel </w:t>
-      </w:r>
-      <w:proofErr w:type="gramStart"/>
-      <w:r>
-        <w:t>location</w:t>
-      </w:r>
-      <w:proofErr w:type="gramEnd"/>
-      <w:r>
-        <w:t xml:space="preserve"> they are summed providing the associated out</w:t>
+        <w:t>To apply the derivative, weights are multiplied to each pixel location with the upper row being pixels (0,0), (0,1), (0,2), where the designation is (row,column). Once all the weights are applied to each pixel location they are summed providing the associated out</w:t>
       </w:r>
       <w:r>
         <w:t>put</w:t>
@@ -2602,7 +3024,7 @@
         </w:rPr>
       </w:pPr>
       <w:bookmarkStart w:id="52" w:name="_Ref242546529"/>
-      <w:bookmarkStart w:id="53" w:name="_Toc243843892"/>
+      <w:bookmarkStart w:id="53" w:name="_Toc244119059"/>
       <w:r>
         <w:rPr>
           <w:b/>
@@ -2694,53 +3116,13 @@
     </w:p>
     <w:p>
       <w:r>
-        <w:t xml:space="preserve">The </w:t>
-      </w:r>
-      <w:proofErr w:type="spellStart"/>
-      <w:r>
-        <w:t>Zybo</w:t>
-      </w:r>
-      <w:proofErr w:type="spellEnd"/>
-      <w:r>
-        <w:t xml:space="preserve"> Z7-20 development board is used for the application of this project. The </w:t>
-      </w:r>
-      <w:proofErr w:type="spellStart"/>
-      <w:r>
-        <w:t>Zybo</w:t>
-      </w:r>
-      <w:proofErr w:type="spellEnd"/>
-      <w:r>
-        <w:t xml:space="preserve"> Z7 is </w:t>
-      </w:r>
-      <w:proofErr w:type="spellStart"/>
-      <w:r>
-        <w:t>a</w:t>
-      </w:r>
-      <w:proofErr w:type="spellEnd"/>
+        <w:t>The Zybo Z7-20 development board is used for the application of this project. The Zybo Z7 is a All Programmable System-on-Chip (AP SoC) device. It contains a dual-core ARM Cortex-A9 processor with Field Programmable Gate Array (FPGA) logic.</w:t>
+      </w:r>
       <w:r>
         <w:t xml:space="preserve"> </w:t>
       </w:r>
-      <w:proofErr w:type="gramStart"/>
-      <w:r>
-        <w:t>All Programmable</w:t>
-      </w:r>
-      <w:proofErr w:type="gramEnd"/>
-      <w:r>
-        <w:t xml:space="preserve"> System-on-Chip (AP SoC) device. It contains a dual-core ARM Cortex-A9 processor with Field Programmable Gate Array (FPGA) logic.</w:t>
-      </w:r>
-      <w:r>
-        <w:t xml:space="preserve"> </w:t>
-      </w:r>
-      <w:r>
-        <w:t xml:space="preserve">The board can be broken down </w:t>
-      </w:r>
-      <w:proofErr w:type="gramStart"/>
-      <w:r>
-        <w:t>in to</w:t>
-      </w:r>
-      <w:proofErr w:type="gramEnd"/>
-      <w:r>
-        <w:t xml:space="preserve"> two sections, programmable logic and the processing system (PS).</w:t>
+      <w:r>
+        <w:t>The board can be broken down in to two sections, programmable logic and the processing system (PS).</w:t>
       </w:r>
     </w:p>
     <w:p>
@@ -2817,7 +3199,7 @@
           <w:vertAlign w:val="superscript"/>
         </w:rPr>
       </w:pPr>
-      <w:bookmarkStart w:id="54" w:name="_Toc243843893"/>
+      <w:bookmarkStart w:id="54" w:name="_Toc244119060"/>
       <w:r>
         <w:rPr>
           <w:b/>
@@ -2894,9 +3276,8 @@
           <w:sz w:val="24"/>
           <w:szCs w:val="24"/>
         </w:rPr>
-        <w:t xml:space="preserve">: </w:t>
-      </w:r>
-      <w:proofErr w:type="spellStart"/>
+        <w:t>: Zybo Block Diagram</w:t>
+      </w:r>
       <w:r>
         <w:rPr>
           <w:b/>
@@ -2905,39 +3286,15 @@
           <w:color w:val="auto"/>
           <w:sz w:val="24"/>
           <w:szCs w:val="24"/>
-        </w:rPr>
-        <w:t>Zybo</w:t>
-      </w:r>
-      <w:proofErr w:type="spellEnd"/>
-      <w:r>
-        <w:rPr>
-          <w:b/>
-          <w:i w:val="0"/>
-          <w:iCs w:val="0"/>
-          <w:color w:val="auto"/>
-          <w:sz w:val="24"/>
-          <w:szCs w:val="24"/>
-        </w:rPr>
-        <w:t xml:space="preserve"> Block Diagram</w:t>
+          <w:vertAlign w:val="superscript"/>
+        </w:rPr>
+        <w:t>1</w:t>
       </w:r>
       <w:bookmarkEnd w:id="54"/>
     </w:p>
     <w:p>
-      <w:proofErr w:type="gramStart"/>
-      <w:r>
-        <w:t>In order to</w:t>
-      </w:r>
-      <w:proofErr w:type="gramEnd"/>
-      <w:r>
-        <w:t xml:space="preserve"> access the PL design for the Sobel filter, Advanced </w:t>
-      </w:r>
-      <w:proofErr w:type="spellStart"/>
-      <w:r>
-        <w:t>eXtensible</w:t>
-      </w:r>
-      <w:proofErr w:type="spellEnd"/>
-      <w:r>
-        <w:t xml:space="preserve"> </w:t>
+      <w:r>
+        <w:t xml:space="preserve">In order to access the PL design for the Sobel filter, Advanced eXtensible </w:t>
       </w:r>
       <w:r>
         <w:t xml:space="preserve">Interface (AXI) buses are used to establish </w:t>
@@ -2946,15 +3303,7 @@
         <w:t>communications</w:t>
       </w:r>
       <w:r>
-        <w:t xml:space="preserve"> with PS </w:t>
-      </w:r>
-      <w:proofErr w:type="gramStart"/>
-      <w:r>
-        <w:t>portion</w:t>
-      </w:r>
-      <w:proofErr w:type="gramEnd"/>
-      <w:r>
-        <w:t xml:space="preserve">. </w:t>
+        <w:t xml:space="preserve"> with PS portion. </w:t>
       </w:r>
       <w:r>
         <w:t xml:space="preserve">The AXI buses will be used to read and write to addresses chosen </w:t>
@@ -3056,7 +3405,7 @@
           <w:sz w:val="24"/>
         </w:rPr>
       </w:pPr>
-      <w:bookmarkStart w:id="55" w:name="_Toc243843894"/>
+      <w:bookmarkStart w:id="55" w:name="_Toc244119061"/>
       <w:r>
         <w:rPr>
           <w:b/>
@@ -3248,7 +3597,7 @@
         </w:rPr>
       </w:pPr>
       <w:bookmarkStart w:id="57" w:name="_Ref243417072"/>
-      <w:bookmarkStart w:id="58" w:name="_Toc243843895"/>
+      <w:bookmarkStart w:id="58" w:name="_Toc244119062"/>
       <w:r>
         <w:rPr>
           <w:b/>
@@ -3340,42 +3689,10 @@
         <w:rPr>
           <w:noProof/>
         </w:rPr>
-        <w:fldChar w:fldCharType="begin"/>
-      </w:r>
-      <w:r>
-        <w:instrText xml:space="preserve"> REF _Ref243843957 \h </w:instrText>
-      </w:r>
-      <w:r>
-        <w:rPr>
-          <w:noProof/>
-        </w:rPr>
-      </w:r>
-      <w:r>
-        <w:rPr>
-          <w:noProof/>
-        </w:rPr>
-        <w:instrText xml:space="preserve"> \* MERGEFORMAT </w:instrText>
-      </w:r>
-      <w:r>
-        <w:rPr>
-          <w:noProof/>
-        </w:rPr>
-        <w:fldChar w:fldCharType="separate"/>
-      </w:r>
-      <w:r>
-        <w:t xml:space="preserve">Figure </w:t>
-      </w:r>
-      <w:r>
-        <w:rPr>
-          <w:noProof/>
-        </w:rPr>
-        <w:t>8</w:t>
-      </w:r>
-      <w:r>
-        <w:rPr>
-          <w:noProof/>
-        </w:rPr>
-        <w:fldChar w:fldCharType="end"/>
+        <w:t>Figure</w:t>
+      </w:r>
+      <w:r>
+        <w:t xml:space="preserve"> 9</w:t>
       </w:r>
       <w:r>
         <w:fldChar w:fldCharType="end"/>
@@ -3402,6 +3719,9 @@
         <w:jc w:val="center"/>
       </w:pPr>
       <w:r>
+        <w:rPr>
+          <w:noProof/>
+        </w:rPr>
         <w:drawing>
           <wp:inline distT="0" distB="0" distL="0" distR="0" wp14:anchorId="4B7614AC" wp14:editId="5E5802E1">
             <wp:extent cx="2553737" cy="2255520"/>
@@ -3453,8 +3773,8 @@
           <w:szCs w:val="24"/>
         </w:rPr>
       </w:pPr>
-      <w:bookmarkStart w:id="59" w:name="_Toc243843896"/>
-      <w:bookmarkStart w:id="60" w:name="_Ref243843957"/>
+      <w:bookmarkStart w:id="59" w:name="_Ref243843957"/>
+      <w:bookmarkStart w:id="60" w:name="_Toc244119063"/>
       <w:r>
         <w:rPr>
           <w:b/>
@@ -3528,20 +3848,20 @@
         </w:rPr>
         <w:fldChar w:fldCharType="end"/>
       </w:r>
+      <w:bookmarkEnd w:id="59"/>
+      <w:r>
+        <w:rPr>
+          <w:b/>
+          <w:bCs/>
+          <w:i w:val="0"/>
+          <w:iCs w:val="0"/>
+          <w:color w:val="000000" w:themeColor="text1"/>
+          <w:sz w:val="24"/>
+          <w:szCs w:val="24"/>
+        </w:rPr>
+        <w:t>: Sobel Filter State Diagram</w:t>
+      </w:r>
       <w:bookmarkEnd w:id="60"/>
-      <w:r>
-        <w:rPr>
-          <w:b/>
-          <w:bCs/>
-          <w:i w:val="0"/>
-          <w:iCs w:val="0"/>
-          <w:color w:val="000000" w:themeColor="text1"/>
-          <w:sz w:val="24"/>
-          <w:szCs w:val="24"/>
-        </w:rPr>
-        <w:t>: Sobel Filter State Diagram</w:t>
-      </w:r>
-      <w:bookmarkEnd w:id="59"/>
     </w:p>
     <w:p>
       <w:r>
@@ -3570,23 +3890,7 @@
         <w:fldChar w:fldCharType="end"/>
       </w:r>
       <w:r>
-        <w:t xml:space="preserve">, is the state flow for </w:t>
-      </w:r>
-      <w:proofErr w:type="gramStart"/>
-      <w:r>
-        <w:t>the Sobel</w:t>
-      </w:r>
-      <w:proofErr w:type="gramEnd"/>
-      <w:r>
-        <w:t xml:space="preserve"> X and Y submodules. The arithmetic logic is broken down </w:t>
-      </w:r>
-      <w:proofErr w:type="gramStart"/>
-      <w:r>
-        <w:t>in to</w:t>
-      </w:r>
-      <w:proofErr w:type="gramEnd"/>
-      <w:r>
-        <w:t xml:space="preserve"> multiple stages to handle the saturation and overflow checks correctly.</w:t>
+        <w:t>, is the state flow for the Sobel X and Y submodules. The arithmetic logic is broken down in to multiple stages to handle the saturation and overflow checks correctly.</w:t>
       </w:r>
     </w:p>
     <w:p>
@@ -3644,18 +3948,20 @@
           <w:bCs/>
           <w:i w:val="0"/>
           <w:iCs w:val="0"/>
+          <w:color w:val="000000" w:themeColor="text1"/>
           <w:sz w:val="24"/>
           <w:szCs w:val="24"/>
         </w:rPr>
       </w:pPr>
       <w:bookmarkStart w:id="61" w:name="_Ref243734373"/>
-      <w:bookmarkStart w:id="62" w:name="_Toc243843897"/>
+      <w:bookmarkStart w:id="62" w:name="_Toc244119064"/>
       <w:r>
         <w:rPr>
           <w:b/>
           <w:bCs/>
           <w:i w:val="0"/>
           <w:iCs w:val="0"/>
+          <w:color w:val="000000" w:themeColor="text1"/>
           <w:sz w:val="24"/>
           <w:szCs w:val="24"/>
         </w:rPr>
@@ -3667,6 +3973,7 @@
           <w:bCs/>
           <w:i w:val="0"/>
           <w:iCs w:val="0"/>
+          <w:color w:val="000000" w:themeColor="text1"/>
           <w:sz w:val="24"/>
           <w:szCs w:val="24"/>
         </w:rPr>
@@ -3678,6 +3985,7 @@
           <w:bCs/>
           <w:i w:val="0"/>
           <w:iCs w:val="0"/>
+          <w:color w:val="000000" w:themeColor="text1"/>
           <w:sz w:val="24"/>
           <w:szCs w:val="24"/>
         </w:rPr>
@@ -3689,6 +3997,7 @@
           <w:bCs/>
           <w:i w:val="0"/>
           <w:iCs w:val="0"/>
+          <w:color w:val="000000" w:themeColor="text1"/>
           <w:sz w:val="24"/>
           <w:szCs w:val="24"/>
         </w:rPr>
@@ -3701,6 +4010,7 @@
           <w:i w:val="0"/>
           <w:iCs w:val="0"/>
           <w:noProof/>
+          <w:color w:val="000000" w:themeColor="text1"/>
           <w:sz w:val="24"/>
           <w:szCs w:val="24"/>
         </w:rPr>
@@ -3712,6 +4022,7 @@
           <w:bCs/>
           <w:i w:val="0"/>
           <w:iCs w:val="0"/>
+          <w:color w:val="000000" w:themeColor="text1"/>
           <w:sz w:val="24"/>
           <w:szCs w:val="24"/>
         </w:rPr>
@@ -3724,6 +4035,7 @@
           <w:bCs/>
           <w:i w:val="0"/>
           <w:iCs w:val="0"/>
+          <w:color w:val="000000" w:themeColor="text1"/>
           <w:sz w:val="24"/>
           <w:szCs w:val="24"/>
         </w:rPr>
@@ -3814,15 +4126,7 @@
         <w:t xml:space="preserve">is </w:t>
       </w:r>
       <w:r>
-        <w:t xml:space="preserve">a pixel value of 255 in </w:t>
-      </w:r>
-      <w:proofErr w:type="gramStart"/>
-      <w:r>
-        <w:t>all the</w:t>
-      </w:r>
-      <w:proofErr w:type="gramEnd"/>
-      <w:r>
-        <w:t xml:space="preserve"> positive weights and a pixel value of </w:t>
+        <w:t xml:space="preserve">a pixel value of 255 in all the positive weights and a pixel value of </w:t>
       </w:r>
       <w:r>
         <w:t>zero</w:t>
@@ -3839,13 +4143,8 @@
       <w:r>
         <w:t xml:space="preserve"> </w:t>
       </w:r>
-      <w:proofErr w:type="gramStart"/>
-      <w:r>
-        <w:t>This</w:t>
-      </w:r>
-      <w:proofErr w:type="gramEnd"/>
-      <w:r>
-        <w:t xml:space="preserve"> holds true for the minimum value with the negative weights, where the minimum value is -1020.</w:t>
+      <w:r>
+        <w:t>This holds true for the minimum value with the negative weights, where the minimum value is -1020.</w:t>
       </w:r>
       <w:r>
         <w:t xml:space="preserve"> For this to be stored properly in signed fixed point, a bit length of 11 is used. At the most significant bit (MSB) the weight is -2</w:t>
@@ -4304,7 +4603,7 @@
           <w:sz w:val="24"/>
         </w:rPr>
       </w:pPr>
-      <w:bookmarkStart w:id="63" w:name="_Toc243843887"/>
+      <w:bookmarkStart w:id="63" w:name="_Toc244119055"/>
       <w:r>
         <w:rPr>
           <w:b/>
@@ -4444,17 +4743,19 @@
           <w:bCs/>
           <w:i w:val="0"/>
           <w:iCs w:val="0"/>
+          <w:color w:val="000000" w:themeColor="text1"/>
           <w:sz w:val="24"/>
           <w:szCs w:val="24"/>
         </w:rPr>
       </w:pPr>
-      <w:bookmarkStart w:id="64" w:name="_Toc243843898"/>
+      <w:bookmarkStart w:id="64" w:name="_Toc244119065"/>
       <w:r>
         <w:rPr>
           <w:b/>
           <w:bCs/>
           <w:i w:val="0"/>
           <w:iCs w:val="0"/>
+          <w:color w:val="000000" w:themeColor="text1"/>
           <w:sz w:val="24"/>
           <w:szCs w:val="24"/>
         </w:rPr>
@@ -4466,6 +4767,7 @@
           <w:bCs/>
           <w:i w:val="0"/>
           <w:iCs w:val="0"/>
+          <w:color w:val="000000" w:themeColor="text1"/>
           <w:sz w:val="24"/>
           <w:szCs w:val="24"/>
         </w:rPr>
@@ -4477,6 +4779,7 @@
           <w:bCs/>
           <w:i w:val="0"/>
           <w:iCs w:val="0"/>
+          <w:color w:val="000000" w:themeColor="text1"/>
           <w:sz w:val="24"/>
           <w:szCs w:val="24"/>
         </w:rPr>
@@ -4488,6 +4791,7 @@
           <w:bCs/>
           <w:i w:val="0"/>
           <w:iCs w:val="0"/>
+          <w:color w:val="000000" w:themeColor="text1"/>
           <w:sz w:val="24"/>
           <w:szCs w:val="24"/>
         </w:rPr>
@@ -4500,6 +4804,7 @@
           <w:i w:val="0"/>
           <w:iCs w:val="0"/>
           <w:noProof/>
+          <w:color w:val="000000" w:themeColor="text1"/>
           <w:sz w:val="24"/>
           <w:szCs w:val="24"/>
         </w:rPr>
@@ -4511,6 +4816,7 @@
           <w:bCs/>
           <w:i w:val="0"/>
           <w:iCs w:val="0"/>
+          <w:color w:val="000000" w:themeColor="text1"/>
           <w:sz w:val="24"/>
           <w:szCs w:val="24"/>
         </w:rPr>
@@ -4522,6 +4828,7 @@
           <w:bCs/>
           <w:i w:val="0"/>
           <w:iCs w:val="0"/>
+          <w:color w:val="000000" w:themeColor="text1"/>
           <w:sz w:val="24"/>
           <w:szCs w:val="24"/>
         </w:rPr>
@@ -4556,10 +4863,7 @@
         <w:fldChar w:fldCharType="begin"/>
       </w:r>
       <w:r>
-        <w:instrText xml:space="preserve"> REF _Ref243845774 \h </w:instrText>
-      </w:r>
-      <w:r>
-        <w:instrText xml:space="preserve"> \* MERGEFORMAT </w:instrText>
+        <w:instrText xml:space="preserve"> REF _Ref243845774 \h  \* MERGEFORMAT </w:instrText>
       </w:r>
       <w:r>
         <w:fldChar w:fldCharType="separate"/>
@@ -4586,6 +4890,9 @@
         <w:jc w:val="center"/>
       </w:pPr>
       <w:r>
+        <w:rPr>
+          <w:noProof/>
+        </w:rPr>
         <w:drawing>
           <wp:inline distT="0" distB="0" distL="0" distR="0" wp14:anchorId="4D060404" wp14:editId="2E50AF01">
             <wp:extent cx="3872160" cy="2606675"/>
@@ -4638,6 +4945,7 @@
         </w:rPr>
       </w:pPr>
       <w:bookmarkStart w:id="65" w:name="_Ref243845774"/>
+      <w:bookmarkStart w:id="66" w:name="_Toc244119066"/>
       <w:r>
         <w:rPr>
           <w:b/>
@@ -4736,6 +5044,7 @@
         </w:rPr>
         <w:t xml:space="preserve"> and Overflow</w:t>
       </w:r>
+      <w:bookmarkEnd w:id="66"/>
     </w:p>
     <w:p>
       <w:r>
@@ -4748,26 +5057,34 @@
         <w:t>A New Non-Restoring Square Root Algorithm and Its VLSI Implementations</w:t>
       </w:r>
       <w:r>
-        <w:t xml:space="preserve">, by Yamin Li and </w:t>
-      </w:r>
-      <w:proofErr w:type="spellStart"/>
-      <w:r>
-        <w:t>Wanming</w:t>
-      </w:r>
-      <w:proofErr w:type="spellEnd"/>
-      <w:r>
-        <w:t xml:space="preserve"> Chu. </w:t>
-      </w:r>
-      <w:r>
-        <w:t xml:space="preserve">The initial source code was referenced from verilogcodes.blogspot.com, posted by user </w:t>
-      </w:r>
-      <w:proofErr w:type="spellStart"/>
-      <w:r>
-        <w:t>vipin</w:t>
-      </w:r>
-      <w:proofErr w:type="spellEnd"/>
-      <w:r>
-        <w:t>. In this square root design, the algorithm does iterations of add and subtracts and no use of multipliers.</w:t>
+        <w:rPr>
+          <w:vertAlign w:val="superscript"/>
+        </w:rPr>
+        <w:t>2</w:t>
+      </w:r>
+      <w:r>
+        <w:t xml:space="preserve">, by Yamin Li and Wanming Chu. </w:t>
+      </w:r>
+      <w:r>
+        <w:t xml:space="preserve">The initial source code, </w:t>
+      </w:r>
+      <w:r>
+        <w:t xml:space="preserve">referenced from </w:t>
+      </w:r>
+      <w:r>
+        <w:rPr>
+          <w:u w:val="single"/>
+        </w:rPr>
+        <w:t>verilogcodes.blogspot.com</w:t>
+      </w:r>
+      <w:r>
+        <w:rPr>
+          <w:vertAlign w:val="superscript"/>
+        </w:rPr>
+        <w:t>3</w:t>
+      </w:r>
+      <w:r>
+        <w:t>, posted by user vipin. In this square root design, the algorithm does iterations of add and subtracts and no use of multipliers.</w:t>
       </w:r>
       <w:r>
         <w:t xml:space="preserve"> </w:t>
@@ -4782,15 +5099,7 @@
         <w:t>ode</w:t>
       </w:r>
       <w:r>
-        <w:t xml:space="preserve"> was updated with a state machine flow and </w:t>
-      </w:r>
-      <w:proofErr w:type="gramStart"/>
-      <w:r>
-        <w:t>start</w:t>
-      </w:r>
-      <w:proofErr w:type="gramEnd"/>
-      <w:r>
-        <w:t xml:space="preserve"> signal logic to initiate the comp</w:t>
+        <w:t xml:space="preserve"> was updated with a state machine flow and start signal logic to initiate the comp</w:t>
       </w:r>
       <w:r>
         <w:t>u</w:t>
@@ -4802,7 +5111,360 @@
         <w:t xml:space="preserve"> </w:t>
       </w:r>
       <w:r>
-        <w:t xml:space="preserve"> Once the square root value is calculated a check is added to determine if the value is greater than the max value of 255.</w:t>
+        <w:t xml:space="preserve"> Once the square root value is calculated</w:t>
+      </w:r>
+      <w:r>
+        <w:t>, a check</w:t>
+      </w:r>
+      <w:r>
+        <w:t xml:space="preserve"> determine</w:t>
+      </w:r>
+      <w:r>
+        <w:t>s</w:t>
+      </w:r>
+      <w:r>
+        <w:t xml:space="preserve"> if the value is greater than the max value of 255.</w:t>
+      </w:r>
+    </w:p>
+    <w:p>
+      <w:r>
+        <w:t xml:space="preserve">The </w:t>
+      </w:r>
+      <w:r>
+        <w:t>file type</w:t>
+      </w:r>
+      <w:r>
+        <w:t xml:space="preserve"> cho</w:t>
+      </w:r>
+      <w:r>
+        <w:t xml:space="preserve">sen to hold the image data is </w:t>
+      </w:r>
+      <w:r>
+        <w:t>bitm</w:t>
+      </w:r>
+      <w:r>
+        <w:t xml:space="preserve">ap (BMP). BMP can store raw, uncompressed pixel data with no concern for losing quality in the image. To decode a BMP file, the header portion </w:t>
+      </w:r>
+      <w:r>
+        <w:t xml:space="preserve">provides </w:t>
+      </w:r>
+      <w:r>
+        <w:t>the relevant information about the image. Th</w:t>
+      </w:r>
+      <w:r>
+        <w:t xml:space="preserve">e </w:t>
+      </w:r>
+      <w:r>
+        <w:t xml:space="preserve">information </w:t>
+      </w:r>
+      <w:r>
+        <w:t xml:space="preserve">available is </w:t>
+      </w:r>
+      <w:r>
+        <w:t xml:space="preserve">the width, </w:t>
+      </w:r>
+      <w:r>
+        <w:t>height,</w:t>
+      </w:r>
+      <w:r>
+        <w:t xml:space="preserve"> byte offset location for where the pixel</w:t>
+      </w:r>
+      <w:r>
+        <w:t xml:space="preserve"> data is located</w:t>
+      </w:r>
+      <w:r>
+        <w:t>, and number of bytes per pixel</w:t>
+      </w:r>
+      <w:r>
+        <w:t xml:space="preserve">. The </w:t>
+      </w:r>
+      <w:r>
+        <w:t xml:space="preserve">baseline C </w:t>
+      </w:r>
+      <w:r>
+        <w:t>code to read a BMP file</w:t>
+      </w:r>
+      <w:r>
+        <w:t xml:space="preserve"> is referenced from </w:t>
+      </w:r>
+      <w:hyperlink r:id="rId21" w:history="1">
+        <w:r>
+          <w:rPr>
+            <w:rStyle w:val="Hyperlink"/>
+            <w:color w:val="auto"/>
+          </w:rPr>
+          <w:t>https://github.com/subrata05/image-processing-in-c/</w:t>
+        </w:r>
+      </w:hyperlink>
+      <w:r>
+        <w:rPr>
+          <w:vertAlign w:val="superscript"/>
+        </w:rPr>
+        <w:t>4</w:t>
+      </w:r>
+      <w:r>
+        <w:t xml:space="preserve">, </w:t>
+      </w:r>
+      <w:r>
+        <w:t xml:space="preserve">written by </w:t>
+      </w:r>
+      <w:r>
+        <w:t>user</w:t>
+      </w:r>
+      <w:r>
+        <w:t xml:space="preserve"> </w:t>
+      </w:r>
+      <w:r>
+        <w:t>Subrata Sarkar</w:t>
+      </w:r>
+      <w:r>
+        <w:t xml:space="preserve">. A structure </w:t>
+      </w:r>
+      <w:r>
+        <w:t>holds the information provided by the header and the pixel values. The pixel values starting address location is assign to a pointer variable that is accessed later to provide the pixel matrix needed for the Sobel operation.</w:t>
+      </w:r>
+    </w:p>
+    <w:p>
+      <w:r>
+        <w:t>In order for the PL and PS to communicate an AXI</w:t>
+      </w:r>
+      <w:r>
+        <w:t xml:space="preserve"> </w:t>
+      </w:r>
+      <w:r>
+        <w:t xml:space="preserve">IP block is generated from the </w:t>
+      </w:r>
+      <w:r>
+        <w:t>Sobel Verilog code.</w:t>
+      </w:r>
+      <w:r>
+        <w:t xml:space="preserve"> </w:t>
+      </w:r>
+      <w:r>
+        <w:t xml:space="preserve">The IP block is then instantiated in a block diagram with the other </w:t>
+      </w:r>
+      <w:r>
+        <w:t>required block design</w:t>
+      </w:r>
+      <w:r>
+        <w:t>s</w:t>
+      </w:r>
+      <w:r>
+        <w:t xml:space="preserve"> </w:t>
+      </w:r>
+      <w:r>
+        <w:t>to</w:t>
+      </w:r>
+      <w:r>
+        <w:t xml:space="preserve"> communicate with the processor, as show in</w:t>
+      </w:r>
+      <w:r>
+        <w:t xml:space="preserve"> </w:t>
+      </w:r>
+      <w:r>
+        <w:fldChar w:fldCharType="begin"/>
+      </w:r>
+      <w:r>
+        <w:instrText xml:space="preserve"> REF _Ref244118568 \h </w:instrText>
+      </w:r>
+      <w:r>
+        <w:instrText xml:space="preserve"> \* MERGEFORMAT </w:instrText>
+      </w:r>
+      <w:r>
+        <w:fldChar w:fldCharType="separate"/>
+      </w:r>
+      <w:r>
+        <w:rPr>
+          <w:color w:val="000000" w:themeColor="text1"/>
+        </w:rPr>
+        <w:t xml:space="preserve">Figure </w:t>
+      </w:r>
+      <w:r>
+        <w:rPr>
+          <w:noProof/>
+          <w:color w:val="000000" w:themeColor="text1"/>
+        </w:rPr>
+        <w:t>12</w:t>
+      </w:r>
+      <w:r>
+        <w:fldChar w:fldCharType="end"/>
+      </w:r>
+      <w:r>
+        <w:t>.</w:t>
+      </w:r>
+      <w:r>
+        <w:tab/>
+        <w:t xml:space="preserve"> </w:t>
+      </w:r>
+    </w:p>
+    <w:p>
+      <w:pPr>
+        <w:keepNext/>
+        <w:jc w:val="center"/>
+      </w:pPr>
+      <w:r>
+        <w:drawing>
+          <wp:inline distT="0" distB="0" distL="0" distR="0" wp14:anchorId="08F85509" wp14:editId="31FC24FD">
+            <wp:extent cx="5181600" cy="2826629"/>
+            <wp:effectExtent l="0" t="0" r="0" b="0"/>
+            <wp:docPr id="984068266" name="Picture 1"/>
+            <wp:cNvGraphicFramePr>
+              <a:graphicFrameLocks xmlns:a="http://schemas.openxmlformats.org/drawingml/2006/main" noChangeAspect="1"/>
+            </wp:cNvGraphicFramePr>
+            <a:graphic xmlns:a="http://schemas.openxmlformats.org/drawingml/2006/main">
+              <a:graphicData uri="http://schemas.openxmlformats.org/drawingml/2006/picture">
+                <pic:pic xmlns:pic="http://schemas.openxmlformats.org/drawingml/2006/picture">
+                  <pic:nvPicPr>
+                    <pic:cNvPr id="984068266" name=""/>
+                    <pic:cNvPicPr/>
+                  </pic:nvPicPr>
+                  <pic:blipFill>
+                    <a:blip r:embed="rId22"/>
+                    <a:stretch>
+                      <a:fillRect/>
+                    </a:stretch>
+                  </pic:blipFill>
+                  <pic:spPr>
+                    <a:xfrm>
+                      <a:off x="0" y="0"/>
+                      <a:ext cx="5192625" cy="2832644"/>
+                    </a:xfrm>
+                    <a:prstGeom prst="rect">
+                      <a:avLst/>
+                    </a:prstGeom>
+                  </pic:spPr>
+                </pic:pic>
+              </a:graphicData>
+            </a:graphic>
+          </wp:inline>
+        </w:drawing>
+      </w:r>
+    </w:p>
+    <w:p>
+      <w:pPr>
+        <w:pStyle w:val="Caption"/>
+        <w:jc w:val="center"/>
+        <w:rPr>
+          <w:b/>
+          <w:bCs/>
+          <w:i w:val="0"/>
+          <w:iCs w:val="0"/>
+          <w:color w:val="000000" w:themeColor="text1"/>
+          <w:sz w:val="24"/>
+          <w:szCs w:val="24"/>
+        </w:rPr>
+      </w:pPr>
+      <w:bookmarkStart w:id="67" w:name="_Ref244118565"/>
+      <w:bookmarkStart w:id="68" w:name="_Ref244118568"/>
+      <w:bookmarkStart w:id="69" w:name="_Toc244119067"/>
+      <w:r>
+        <w:rPr>
+          <w:b/>
+          <w:bCs/>
+          <w:i w:val="0"/>
+          <w:iCs w:val="0"/>
+          <w:color w:val="000000" w:themeColor="text1"/>
+          <w:sz w:val="24"/>
+          <w:szCs w:val="24"/>
+        </w:rPr>
+        <w:t xml:space="preserve">Figure </w:t>
+      </w:r>
+      <w:r>
+        <w:rPr>
+          <w:b/>
+          <w:bCs/>
+          <w:i w:val="0"/>
+          <w:iCs w:val="0"/>
+          <w:color w:val="000000" w:themeColor="text1"/>
+          <w:sz w:val="24"/>
+          <w:szCs w:val="24"/>
+        </w:rPr>
+        <w:fldChar w:fldCharType="begin"/>
+      </w:r>
+      <w:r>
+        <w:rPr>
+          <w:b/>
+          <w:bCs/>
+          <w:i w:val="0"/>
+          <w:iCs w:val="0"/>
+          <w:color w:val="000000" w:themeColor="text1"/>
+          <w:sz w:val="24"/>
+          <w:szCs w:val="24"/>
+        </w:rPr>
+        <w:instrText xml:space="preserve"> SEQ Figure \* ARABIC </w:instrText>
+      </w:r>
+      <w:r>
+        <w:rPr>
+          <w:b/>
+          <w:bCs/>
+          <w:i w:val="0"/>
+          <w:iCs w:val="0"/>
+          <w:color w:val="000000" w:themeColor="text1"/>
+          <w:sz w:val="24"/>
+          <w:szCs w:val="24"/>
+        </w:rPr>
+        <w:fldChar w:fldCharType="separate"/>
+      </w:r>
+      <w:r>
+        <w:rPr>
+          <w:b/>
+          <w:bCs/>
+          <w:i w:val="0"/>
+          <w:iCs w:val="0"/>
+          <w:noProof/>
+          <w:color w:val="000000" w:themeColor="text1"/>
+          <w:sz w:val="24"/>
+          <w:szCs w:val="24"/>
+        </w:rPr>
+        <w:t>12</w:t>
+      </w:r>
+      <w:r>
+        <w:rPr>
+          <w:b/>
+          <w:bCs/>
+          <w:i w:val="0"/>
+          <w:iCs w:val="0"/>
+          <w:color w:val="000000" w:themeColor="text1"/>
+          <w:sz w:val="24"/>
+          <w:szCs w:val="24"/>
+        </w:rPr>
+        <w:fldChar w:fldCharType="end"/>
+      </w:r>
+      <w:bookmarkEnd w:id="68"/>
+      <w:r>
+        <w:rPr>
+          <w:b/>
+          <w:bCs/>
+          <w:i w:val="0"/>
+          <w:iCs w:val="0"/>
+          <w:color w:val="000000" w:themeColor="text1"/>
+          <w:sz w:val="24"/>
+          <w:szCs w:val="24"/>
+        </w:rPr>
+        <w:t xml:space="preserve"> : Sobel Block Diagram</w:t>
+      </w:r>
+      <w:bookmarkEnd w:id="67"/>
+      <w:bookmarkEnd w:id="69"/>
+    </w:p>
+    <w:p/>
+    <w:p>
+      <w:pPr>
+        <w:rPr>
+          <w:rFonts w:asciiTheme="majorHAnsi" w:eastAsiaTheme="majorEastAsia" w:hAnsiTheme="majorHAnsi" w:cstheme="majorBidi"/>
+          <w:b/>
+          <w:bCs/>
+          <w:color w:val="000000" w:themeColor="text1"/>
+          <w:sz w:val="40"/>
+          <w:szCs w:val="40"/>
+        </w:rPr>
+      </w:pPr>
+      <w:r>
+        <w:rPr>
+          <w:b/>
+          <w:bCs/>
+          <w:color w:val="000000" w:themeColor="text1"/>
+        </w:rPr>
+        <w:br w:type="page"/>
       </w:r>
     </w:p>
     <w:p>
@@ -4820,6 +5482,7 @@
           <w:bCs/>
           <w:color w:val="000000" w:themeColor="text1"/>
         </w:rPr>
+        <w:lastRenderedPageBreak/>
         <w:t>Results</w:t>
       </w:r>
       <w:r>
@@ -4831,7 +5494,765 @@
         <w:t xml:space="preserve"> </w:t>
       </w:r>
     </w:p>
+    <w:p>
+      <w:r>
+        <w:t xml:space="preserve">The Verilog code is verified through a self-checking randomized input stimulus testbench. </w:t>
+      </w:r>
+      <w:r>
+        <w:t>The s</w:t>
+      </w:r>
+      <w:r>
+        <w:t xml:space="preserve">timulus is </w:t>
+      </w:r>
+      <w:r>
+        <w:t>an</w:t>
+      </w:r>
+      <w:r>
+        <w:t xml:space="preserve"> 8-bit 9x1 array, meant to represent a matrix sample from an image</w:t>
+      </w:r>
+      <w:r>
+        <w:t xml:space="preserve">. A golden value is calculated </w:t>
+      </w:r>
+      <w:r>
+        <w:t xml:space="preserve">using </w:t>
+      </w:r>
+      <w:r>
+        <w:t xml:space="preserve">initial integer values, and the square root value </w:t>
+      </w:r>
+      <w:r>
+        <w:t xml:space="preserve">is saved </w:t>
+      </w:r>
+      <w:r>
+        <w:t xml:space="preserve">to a real variable. The value is floored down to an 8-bit integer value needed to represent the </w:t>
+      </w:r>
+      <w:r>
+        <w:t xml:space="preserve">integer </w:t>
+      </w:r>
+      <w:r>
+        <w:t>pixel valu</w:t>
+      </w:r>
+      <w:r>
+        <w:t>e.</w:t>
+      </w:r>
+    </w:p>
+    <w:p>
+      <w:pPr>
+        <w:keepNext/>
+        <w:jc w:val="center"/>
+      </w:pPr>
+      <w:r>
+        <w:rPr>
+          <w:noProof/>
+        </w:rPr>
+        <w:drawing>
+          <wp:inline distT="0" distB="0" distL="0" distR="0" wp14:anchorId="776E31C6" wp14:editId="20BB43CF">
+            <wp:extent cx="5254715" cy="1704975"/>
+            <wp:effectExtent l="0" t="0" r="0" b="0"/>
+            <wp:docPr id="2" name="Picture 2"/>
+            <wp:cNvGraphicFramePr>
+              <a:graphicFrameLocks xmlns:a="http://schemas.openxmlformats.org/drawingml/2006/main" noChangeAspect="1"/>
+            </wp:cNvGraphicFramePr>
+            <a:graphic xmlns:a="http://schemas.openxmlformats.org/drawingml/2006/main">
+              <a:graphicData uri="http://schemas.openxmlformats.org/drawingml/2006/picture">
+                <pic:pic xmlns:pic="http://schemas.openxmlformats.org/drawingml/2006/picture">
+                  <pic:nvPicPr>
+                    <pic:cNvPr id="1" name=""/>
+                    <pic:cNvPicPr/>
+                  </pic:nvPicPr>
+                  <pic:blipFill>
+                    <a:blip r:embed="rId23"/>
+                    <a:stretch>
+                      <a:fillRect/>
+                    </a:stretch>
+                  </pic:blipFill>
+                  <pic:spPr>
+                    <a:xfrm>
+                      <a:off x="0" y="0"/>
+                      <a:ext cx="5299200" cy="1719409"/>
+                    </a:xfrm>
+                    <a:prstGeom prst="rect">
+                      <a:avLst/>
+                    </a:prstGeom>
+                  </pic:spPr>
+                </pic:pic>
+              </a:graphicData>
+            </a:graphic>
+          </wp:inline>
+        </w:drawing>
+      </w:r>
+    </w:p>
+    <w:p>
+      <w:pPr>
+        <w:pStyle w:val="Caption"/>
+        <w:jc w:val="center"/>
+        <w:rPr>
+          <w:b/>
+          <w:i w:val="0"/>
+          <w:color w:val="000000" w:themeColor="text1"/>
+          <w:sz w:val="24"/>
+        </w:rPr>
+      </w:pPr>
+      <w:bookmarkStart w:id="70" w:name="_Toc244119068"/>
+      <w:r>
+        <w:rPr>
+          <w:b/>
+          <w:i w:val="0"/>
+          <w:color w:val="000000" w:themeColor="text1"/>
+          <w:sz w:val="24"/>
+        </w:rPr>
+        <w:t xml:space="preserve">Figure </w:t>
+      </w:r>
+      <w:r>
+        <w:rPr>
+          <w:b/>
+          <w:i w:val="0"/>
+          <w:color w:val="000000" w:themeColor="text1"/>
+          <w:sz w:val="24"/>
+        </w:rPr>
+        <w:fldChar w:fldCharType="begin"/>
+      </w:r>
+      <w:r>
+        <w:rPr>
+          <w:b/>
+          <w:i w:val="0"/>
+          <w:color w:val="000000" w:themeColor="text1"/>
+          <w:sz w:val="24"/>
+        </w:rPr>
+        <w:instrText xml:space="preserve"> SEQ Figure \* ARABIC </w:instrText>
+      </w:r>
+      <w:r>
+        <w:rPr>
+          <w:b/>
+          <w:i w:val="0"/>
+          <w:color w:val="000000" w:themeColor="text1"/>
+          <w:sz w:val="24"/>
+        </w:rPr>
+        <w:fldChar w:fldCharType="separate"/>
+      </w:r>
+      <w:r>
+        <w:rPr>
+          <w:b/>
+          <w:i w:val="0"/>
+          <w:noProof/>
+          <w:color w:val="000000" w:themeColor="text1"/>
+          <w:sz w:val="24"/>
+        </w:rPr>
+        <w:t>13</w:t>
+      </w:r>
+      <w:r>
+        <w:rPr>
+          <w:b/>
+          <w:i w:val="0"/>
+          <w:color w:val="000000" w:themeColor="text1"/>
+          <w:sz w:val="24"/>
+        </w:rPr>
+        <w:fldChar w:fldCharType="end"/>
+      </w:r>
+      <w:r>
+        <w:rPr>
+          <w:b/>
+          <w:i w:val="0"/>
+          <w:color w:val="000000" w:themeColor="text1"/>
+          <w:sz w:val="24"/>
+        </w:rPr>
+        <w:t xml:space="preserve"> : Golden Model</w:t>
+      </w:r>
+      <w:bookmarkEnd w:id="70"/>
+    </w:p>
+    <w:p>
+      <w:r>
+        <w:t xml:space="preserve">The integer pixel value is clipped to a maximum value of 255 as that is the max pixel intensity value allowed for a pixel, shown in </w:t>
+      </w:r>
+      <w:r>
+        <w:fldChar w:fldCharType="begin"/>
+      </w:r>
+      <w:r>
+        <w:instrText xml:space="preserve"> REF _Ref244006851 \h  \* MERGEFORMAT </w:instrText>
+      </w:r>
+      <w:r>
+        <w:fldChar w:fldCharType="separate"/>
+      </w:r>
+      <w:r>
+        <w:t xml:space="preserve">Figure </w:t>
+      </w:r>
+      <w:r>
+        <w:rPr>
+          <w:noProof/>
+        </w:rPr>
+        <w:t>14</w:t>
+      </w:r>
+      <w:r>
+        <w:fldChar w:fldCharType="end"/>
+      </w:r>
+      <w:r>
+        <w:t>.</w:t>
+      </w:r>
+    </w:p>
+    <w:p>
+      <w:pPr>
+        <w:keepNext/>
+        <w:jc w:val="center"/>
+      </w:pPr>
+      <w:r>
+        <w:rPr>
+          <w:noProof/>
+        </w:rPr>
+        <w:drawing>
+          <wp:inline distT="0" distB="0" distL="0" distR="0" wp14:anchorId="11CF362D" wp14:editId="09CD6372">
+            <wp:extent cx="1800865" cy="1419225"/>
+            <wp:effectExtent l="0" t="0" r="0" b="0"/>
+            <wp:docPr id="3" name="Picture 3"/>
+            <wp:cNvGraphicFramePr>
+              <a:graphicFrameLocks xmlns:a="http://schemas.openxmlformats.org/drawingml/2006/main" noChangeAspect="1"/>
+            </wp:cNvGraphicFramePr>
+            <a:graphic xmlns:a="http://schemas.openxmlformats.org/drawingml/2006/main">
+              <a:graphicData uri="http://schemas.openxmlformats.org/drawingml/2006/picture">
+                <pic:pic xmlns:pic="http://schemas.openxmlformats.org/drawingml/2006/picture">
+                  <pic:nvPicPr>
+                    <pic:cNvPr id="1" name=""/>
+                    <pic:cNvPicPr/>
+                  </pic:nvPicPr>
+                  <pic:blipFill>
+                    <a:blip r:embed="rId24"/>
+                    <a:stretch>
+                      <a:fillRect/>
+                    </a:stretch>
+                  </pic:blipFill>
+                  <pic:spPr>
+                    <a:xfrm>
+                      <a:off x="0" y="0"/>
+                      <a:ext cx="1810391" cy="1426732"/>
+                    </a:xfrm>
+                    <a:prstGeom prst="rect">
+                      <a:avLst/>
+                    </a:prstGeom>
+                  </pic:spPr>
+                </pic:pic>
+              </a:graphicData>
+            </a:graphic>
+          </wp:inline>
+        </w:drawing>
+      </w:r>
+    </w:p>
+    <w:p>
+      <w:pPr>
+        <w:pStyle w:val="Caption"/>
+        <w:jc w:val="center"/>
+        <w:rPr>
+          <w:b/>
+          <w:i w:val="0"/>
+          <w:color w:val="000000" w:themeColor="text1"/>
+          <w:sz w:val="24"/>
+        </w:rPr>
+      </w:pPr>
+      <w:bookmarkStart w:id="71" w:name="_Ref244006851"/>
+      <w:bookmarkStart w:id="72" w:name="_Toc244119069"/>
+      <w:r>
+        <w:rPr>
+          <w:b/>
+          <w:i w:val="0"/>
+          <w:color w:val="000000" w:themeColor="text1"/>
+          <w:sz w:val="24"/>
+        </w:rPr>
+        <w:t xml:space="preserve">Figure </w:t>
+      </w:r>
+      <w:r>
+        <w:rPr>
+          <w:b/>
+          <w:i w:val="0"/>
+          <w:color w:val="000000" w:themeColor="text1"/>
+          <w:sz w:val="24"/>
+        </w:rPr>
+        <w:fldChar w:fldCharType="begin"/>
+      </w:r>
+      <w:r>
+        <w:rPr>
+          <w:b/>
+          <w:i w:val="0"/>
+          <w:color w:val="000000" w:themeColor="text1"/>
+          <w:sz w:val="24"/>
+        </w:rPr>
+        <w:instrText xml:space="preserve"> SEQ Figure \* ARABIC </w:instrText>
+      </w:r>
+      <w:r>
+        <w:rPr>
+          <w:b/>
+          <w:i w:val="0"/>
+          <w:color w:val="000000" w:themeColor="text1"/>
+          <w:sz w:val="24"/>
+        </w:rPr>
+        <w:fldChar w:fldCharType="separate"/>
+      </w:r>
+      <w:r>
+        <w:rPr>
+          <w:b/>
+          <w:i w:val="0"/>
+          <w:noProof/>
+          <w:color w:val="000000" w:themeColor="text1"/>
+          <w:sz w:val="24"/>
+        </w:rPr>
+        <w:t>14</w:t>
+      </w:r>
+      <w:r>
+        <w:rPr>
+          <w:b/>
+          <w:i w:val="0"/>
+          <w:color w:val="000000" w:themeColor="text1"/>
+          <w:sz w:val="24"/>
+        </w:rPr>
+        <w:fldChar w:fldCharType="end"/>
+      </w:r>
+      <w:bookmarkEnd w:id="71"/>
+      <w:r>
+        <w:rPr>
+          <w:b/>
+          <w:i w:val="0"/>
+          <w:color w:val="000000" w:themeColor="text1"/>
+          <w:sz w:val="24"/>
+        </w:rPr>
+        <w:t xml:space="preserve"> : Max Pixel Value check</w:t>
+      </w:r>
+      <w:bookmarkEnd w:id="72"/>
+    </w:p>
+    <w:p>
+      <w:r>
+        <w:t xml:space="preserve">A snippet of the simulation results are shown below in </w:t>
+      </w:r>
+      <w:r>
+        <w:fldChar w:fldCharType="begin"/>
+      </w:r>
+      <w:r>
+        <w:instrText xml:space="preserve"> REF _Ref244009483 \h  \* MERGEFORMAT </w:instrText>
+      </w:r>
+      <w:r>
+        <w:fldChar w:fldCharType="separate"/>
+      </w:r>
+      <w:r>
+        <w:rPr>
+          <w:color w:val="000000" w:themeColor="text1"/>
+        </w:rPr>
+        <w:t xml:space="preserve">Figure </w:t>
+      </w:r>
+      <w:r>
+        <w:rPr>
+          <w:noProof/>
+          <w:color w:val="000000" w:themeColor="text1"/>
+        </w:rPr>
+        <w:t>15</w:t>
+      </w:r>
+      <w:r>
+        <w:fldChar w:fldCharType="end"/>
+      </w:r>
+      <w:r>
+        <w:t>.</w:t>
+      </w:r>
+    </w:p>
+    <w:p>
+      <w:pPr>
+        <w:keepNext/>
+        <w:jc w:val="center"/>
+      </w:pPr>
+      <w:r>
+        <w:rPr>
+          <w:noProof/>
+        </w:rPr>
+        <w:drawing>
+          <wp:inline distT="0" distB="0" distL="0" distR="0" wp14:anchorId="7346F92C" wp14:editId="26050D05">
+            <wp:extent cx="6188075" cy="1457107"/>
+            <wp:effectExtent l="0" t="0" r="0" b="0"/>
+            <wp:docPr id="8" name="Picture 7">
+              <a:extLst xmlns:a="http://schemas.openxmlformats.org/drawingml/2006/main">
+                <a:ext uri="{FF2B5EF4-FFF2-40B4-BE49-F238E27FC236}">
+                  <a16:creationId xmlns:a16="http://schemas.microsoft.com/office/drawing/2014/main" id="{5DA65844-1CF3-3626-088B-7D735ED77594}"/>
+                </a:ext>
+              </a:extLst>
+            </wp:docPr>
+            <wp:cNvGraphicFramePr>
+              <a:graphicFrameLocks xmlns:a="http://schemas.openxmlformats.org/drawingml/2006/main" noChangeAspect="1"/>
+            </wp:cNvGraphicFramePr>
+            <a:graphic xmlns:a="http://schemas.openxmlformats.org/drawingml/2006/main">
+              <a:graphicData uri="http://schemas.openxmlformats.org/drawingml/2006/picture">
+                <pic:pic xmlns:pic="http://schemas.openxmlformats.org/drawingml/2006/picture">
+                  <pic:nvPicPr>
+                    <pic:cNvPr id="8" name="Picture 7">
+                      <a:extLst>
+                        <a:ext uri="{FF2B5EF4-FFF2-40B4-BE49-F238E27FC236}">
+                          <a16:creationId xmlns:a16="http://schemas.microsoft.com/office/drawing/2014/main" id="{5DA65844-1CF3-3626-088B-7D735ED77594}"/>
+                        </a:ext>
+                      </a:extLst>
+                    </pic:cNvPr>
+                    <pic:cNvPicPr>
+                      <a:picLocks noChangeAspect="1"/>
+                    </pic:cNvPicPr>
+                  </pic:nvPicPr>
+                  <pic:blipFill>
+                    <a:blip r:embed="rId25"/>
+                    <a:stretch>
+                      <a:fillRect/>
+                    </a:stretch>
+                  </pic:blipFill>
+                  <pic:spPr>
+                    <a:xfrm>
+                      <a:off x="0" y="0"/>
+                      <a:ext cx="6225041" cy="1465811"/>
+                    </a:xfrm>
+                    <a:prstGeom prst="rect">
+                      <a:avLst/>
+                    </a:prstGeom>
+                  </pic:spPr>
+                </pic:pic>
+              </a:graphicData>
+            </a:graphic>
+          </wp:inline>
+        </w:drawing>
+      </w:r>
+    </w:p>
+    <w:p>
+      <w:pPr>
+        <w:pStyle w:val="Caption"/>
+        <w:jc w:val="center"/>
+        <w:rPr>
+          <w:b/>
+          <w:i w:val="0"/>
+          <w:color w:val="000000" w:themeColor="text1"/>
+          <w:sz w:val="24"/>
+        </w:rPr>
+      </w:pPr>
+      <w:bookmarkStart w:id="73" w:name="_Ref244009483"/>
+      <w:bookmarkStart w:id="74" w:name="_Toc244119070"/>
+      <w:r>
+        <w:rPr>
+          <w:b/>
+          <w:i w:val="0"/>
+          <w:color w:val="000000" w:themeColor="text1"/>
+          <w:sz w:val="24"/>
+        </w:rPr>
+        <w:t xml:space="preserve">Figure </w:t>
+      </w:r>
+      <w:r>
+        <w:rPr>
+          <w:b/>
+          <w:i w:val="0"/>
+          <w:color w:val="000000" w:themeColor="text1"/>
+          <w:sz w:val="24"/>
+        </w:rPr>
+        <w:fldChar w:fldCharType="begin"/>
+      </w:r>
+      <w:r>
+        <w:rPr>
+          <w:b/>
+          <w:i w:val="0"/>
+          <w:color w:val="000000" w:themeColor="text1"/>
+          <w:sz w:val="24"/>
+        </w:rPr>
+        <w:instrText xml:space="preserve"> SEQ Figure \* ARABIC </w:instrText>
+      </w:r>
+      <w:r>
+        <w:rPr>
+          <w:b/>
+          <w:i w:val="0"/>
+          <w:color w:val="000000" w:themeColor="text1"/>
+          <w:sz w:val="24"/>
+        </w:rPr>
+        <w:fldChar w:fldCharType="separate"/>
+      </w:r>
+      <w:r>
+        <w:rPr>
+          <w:b/>
+          <w:i w:val="0"/>
+          <w:noProof/>
+          <w:color w:val="000000" w:themeColor="text1"/>
+          <w:sz w:val="24"/>
+        </w:rPr>
+        <w:t>15</w:t>
+      </w:r>
+      <w:r>
+        <w:rPr>
+          <w:b/>
+          <w:i w:val="0"/>
+          <w:color w:val="000000" w:themeColor="text1"/>
+          <w:sz w:val="24"/>
+        </w:rPr>
+        <w:fldChar w:fldCharType="end"/>
+      </w:r>
+      <w:bookmarkEnd w:id="73"/>
+      <w:r>
+        <w:rPr>
+          <w:b/>
+          <w:i w:val="0"/>
+          <w:color w:val="000000" w:themeColor="text1"/>
+          <w:sz w:val="24"/>
+        </w:rPr>
+        <w:t xml:space="preserve"> : Simulation Results</w:t>
+      </w:r>
+      <w:bookmarkEnd w:id="74"/>
+    </w:p>
+    <w:p>
+      <w:r>
+        <w:lastRenderedPageBreak/>
+        <w:t xml:space="preserve">The address indexing was verified on a local </w:t>
+      </w:r>
+      <w:r>
+        <w:t>C</w:t>
+      </w:r>
+      <w:r>
+        <w:t xml:space="preserve"> program to confirm the </w:t>
+      </w:r>
+      <w:r>
+        <w:t>accessing</w:t>
+      </w:r>
+      <w:r>
+        <w:t xml:space="preserve"> method. A basic filter to apply the brightness was applied and called as a function to </w:t>
+      </w:r>
+      <w:r>
+        <w:t>confirm the function method.</w:t>
+      </w:r>
+    </w:p>
+    <w:p>
+      <w:pPr>
+        <w:keepNext/>
+        <w:jc w:val="center"/>
+      </w:pPr>
+      <w:r>
+        <w:drawing>
+          <wp:inline distT="0" distB="0" distL="0" distR="0" wp14:anchorId="42A3E37F" wp14:editId="192BF702">
+            <wp:extent cx="2082844" cy="3019425"/>
+            <wp:effectExtent l="0" t="0" r="0" b="0"/>
+            <wp:docPr id="1496041087" name="Picture 1"/>
+            <wp:cNvGraphicFramePr>
+              <a:graphicFrameLocks xmlns:a="http://schemas.openxmlformats.org/drawingml/2006/main" noChangeAspect="1"/>
+            </wp:cNvGraphicFramePr>
+            <a:graphic xmlns:a="http://schemas.openxmlformats.org/drawingml/2006/main">
+              <a:graphicData uri="http://schemas.openxmlformats.org/drawingml/2006/picture">
+                <pic:pic xmlns:pic="http://schemas.openxmlformats.org/drawingml/2006/picture">
+                  <pic:nvPicPr>
+                    <pic:cNvPr id="1496041087" name=""/>
+                    <pic:cNvPicPr/>
+                  </pic:nvPicPr>
+                  <pic:blipFill>
+                    <a:blip r:embed="rId26"/>
+                    <a:stretch>
+                      <a:fillRect/>
+                    </a:stretch>
+                  </pic:blipFill>
+                  <pic:spPr>
+                    <a:xfrm>
+                      <a:off x="0" y="0"/>
+                      <a:ext cx="2087482" cy="3026149"/>
+                    </a:xfrm>
+                    <a:prstGeom prst="rect">
+                      <a:avLst/>
+                    </a:prstGeom>
+                  </pic:spPr>
+                </pic:pic>
+              </a:graphicData>
+            </a:graphic>
+          </wp:inline>
+        </w:drawing>
+      </w:r>
+    </w:p>
+    <w:p>
+      <w:pPr>
+        <w:pStyle w:val="Caption"/>
+        <w:jc w:val="center"/>
+        <w:rPr>
+          <w:b/>
+          <w:bCs/>
+          <w:i w:val="0"/>
+          <w:iCs w:val="0"/>
+          <w:color w:val="000000" w:themeColor="text1"/>
+        </w:rPr>
+      </w:pPr>
+      <w:bookmarkStart w:id="75" w:name="_Toc244119071"/>
+      <w:r>
+        <w:rPr>
+          <w:b/>
+          <w:bCs/>
+          <w:i w:val="0"/>
+          <w:iCs w:val="0"/>
+          <w:color w:val="000000" w:themeColor="text1"/>
+        </w:rPr>
+        <w:t xml:space="preserve">Figure </w:t>
+      </w:r>
+      <w:r>
+        <w:rPr>
+          <w:b/>
+          <w:bCs/>
+          <w:i w:val="0"/>
+          <w:iCs w:val="0"/>
+          <w:color w:val="000000" w:themeColor="text1"/>
+        </w:rPr>
+        <w:fldChar w:fldCharType="begin"/>
+      </w:r>
+      <w:r>
+        <w:rPr>
+          <w:b/>
+          <w:bCs/>
+          <w:i w:val="0"/>
+          <w:iCs w:val="0"/>
+          <w:color w:val="000000" w:themeColor="text1"/>
+        </w:rPr>
+        <w:instrText xml:space="preserve"> SEQ Figure \* ARABIC </w:instrText>
+      </w:r>
+      <w:r>
+        <w:rPr>
+          <w:b/>
+          <w:bCs/>
+          <w:i w:val="0"/>
+          <w:iCs w:val="0"/>
+          <w:color w:val="000000" w:themeColor="text1"/>
+        </w:rPr>
+        <w:fldChar w:fldCharType="separate"/>
+      </w:r>
+      <w:r>
+        <w:rPr>
+          <w:b/>
+          <w:bCs/>
+          <w:i w:val="0"/>
+          <w:iCs w:val="0"/>
+          <w:noProof/>
+          <w:color w:val="000000" w:themeColor="text1"/>
+        </w:rPr>
+        <w:t>16</w:t>
+      </w:r>
+      <w:r>
+        <w:rPr>
+          <w:b/>
+          <w:bCs/>
+          <w:i w:val="0"/>
+          <w:iCs w:val="0"/>
+          <w:color w:val="000000" w:themeColor="text1"/>
+        </w:rPr>
+        <w:fldChar w:fldCharType="end"/>
+      </w:r>
+      <w:r>
+        <w:rPr>
+          <w:b/>
+          <w:bCs/>
+          <w:i w:val="0"/>
+          <w:iCs w:val="0"/>
+          <w:color w:val="000000" w:themeColor="text1"/>
+        </w:rPr>
+        <w:t xml:space="preserve"> : Test Log Output</w:t>
+      </w:r>
+      <w:bookmarkEnd w:id="75"/>
+    </w:p>
     <w:p/>
+    <w:p/>
+    <w:p>
+      <w:pPr>
+        <w:jc w:val="center"/>
+      </w:pPr>
+    </w:p>
+    <w:p/>
+    <w:p>
+      <w:pPr>
+        <w:rPr>
+          <w:rFonts w:asciiTheme="majorHAnsi" w:eastAsiaTheme="majorEastAsia" w:hAnsiTheme="majorHAnsi" w:cstheme="majorBidi"/>
+          <w:b/>
+          <w:bCs/>
+          <w:color w:val="000000" w:themeColor="text1"/>
+          <w:sz w:val="40"/>
+          <w:szCs w:val="40"/>
+        </w:rPr>
+      </w:pPr>
+      <w:r>
+        <w:rPr>
+          <w:b/>
+          <w:bCs/>
+          <w:color w:val="000000" w:themeColor="text1"/>
+        </w:rPr>
+        <w:br w:type="page"/>
+      </w:r>
+    </w:p>
+    <w:p>
+      <w:pPr>
+        <w:pStyle w:val="Heading1"/>
+        <w:rPr>
+          <w:b/>
+          <w:bCs/>
+          <w:color w:val="000000" w:themeColor="text1"/>
+        </w:rPr>
+      </w:pPr>
+      <w:r>
+        <w:rPr>
+          <w:b/>
+          <w:bCs/>
+          <w:color w:val="000000" w:themeColor="text1"/>
+        </w:rPr>
+        <w:lastRenderedPageBreak/>
+        <w:t>References</w:t>
+      </w:r>
+    </w:p>
+    <w:p>
+      <w:pPr>
+        <w:pStyle w:val="ListParagraph"/>
+        <w:numPr>
+          <w:ilvl w:val="0"/>
+          <w:numId w:val="4"/>
+        </w:numPr>
+      </w:pPr>
+      <w:hyperlink r:id="rId27" w:history="1">
+        <w:r>
+          <w:rPr>
+            <w:rStyle w:val="Hyperlink"/>
+          </w:rPr>
+          <w:t>Zybo Z7 Reference Manual - Digilent Reference</w:t>
+        </w:r>
+      </w:hyperlink>
+    </w:p>
+    <w:p>
+      <w:pPr>
+        <w:pStyle w:val="ListParagraph"/>
+        <w:numPr>
+          <w:ilvl w:val="0"/>
+          <w:numId w:val="4"/>
+        </w:numPr>
+      </w:pPr>
+      <w:hyperlink r:id="rId28" w:history="1">
+        <w:r>
+          <w:rPr>
+            <w:rStyle w:val="Hyperlink"/>
+          </w:rPr>
+          <w:t>https://yamin.cis.k.hosei.ac.jp/papers/ICCD96.pdf</w:t>
+        </w:r>
+      </w:hyperlink>
+    </w:p>
+    <w:p>
+      <w:pPr>
+        <w:pStyle w:val="ListParagraph"/>
+        <w:numPr>
+          <w:ilvl w:val="0"/>
+          <w:numId w:val="4"/>
+        </w:numPr>
+      </w:pPr>
+      <w:hyperlink r:id="rId29" w:history="1">
+        <w:r>
+          <w:rPr>
+            <w:rStyle w:val="Hyperlink"/>
+          </w:rPr>
+          <w:t>https://verilogcodes.blogspot.com/2020/12/synthesizable-clocked-square-root.html</w:t>
+        </w:r>
+      </w:hyperlink>
+    </w:p>
+    <w:p>
+      <w:pPr>
+        <w:pStyle w:val="ListParagraph"/>
+        <w:numPr>
+          <w:ilvl w:val="0"/>
+          <w:numId w:val="4"/>
+        </w:numPr>
+      </w:pPr>
+      <w:hyperlink r:id="rId30" w:history="1">
+        <w:r>
+          <w:rPr>
+            <w:rStyle w:val="Hyperlink"/>
+            <w:color w:val="auto"/>
+          </w:rPr>
+          <w:t>https://github.com/subrata05/image-processing-in-c/</w:t>
+        </w:r>
+      </w:hyperlink>
+    </w:p>
     <w:sectPr>
       <w:pgSz w:w="12240" w:h="15840"/>
       <w:pgMar w:top="1440" w:right="1440" w:bottom="1440" w:left="1440" w:header="720" w:footer="720" w:gutter="0"/>
@@ -4902,7 +6323,7 @@
           <w:rPr>
             <w:noProof/>
           </w:rPr>
-          <w:t>4</w:t>
+          <w:t>8</w:t>
         </w:r>
         <w:r>
           <w:rPr>
@@ -5043,6 +6464,95 @@
     </w:lvl>
   </w:abstractNum>
   <w:abstractNum w:abstractNumId="1" w15:restartNumberingAfterBreak="0">
+    <w:nsid w:val="40954B16"/>
+    <w:multiLevelType w:val="hybridMultilevel"/>
+    <w:tmpl w:val="BD4212CC"/>
+    <w:lvl w:ilvl="0" w:tplc="0409000F">
+      <w:start w:val="1"/>
+      <w:numFmt w:val="decimal"/>
+      <w:lvlText w:val="%1."/>
+      <w:lvlJc w:val="left"/>
+      <w:pPr>
+        <w:ind w:left="720" w:hanging="360"/>
+      </w:pPr>
+      <w:rPr>
+        <w:rFonts w:hint="default"/>
+      </w:rPr>
+    </w:lvl>
+    <w:lvl w:ilvl="1" w:tplc="04090019" w:tentative="1">
+      <w:start w:val="1"/>
+      <w:numFmt w:val="lowerLetter"/>
+      <w:lvlText w:val="%2."/>
+      <w:lvlJc w:val="left"/>
+      <w:pPr>
+        <w:ind w:left="1440" w:hanging="360"/>
+      </w:pPr>
+    </w:lvl>
+    <w:lvl w:ilvl="2" w:tplc="0409001B" w:tentative="1">
+      <w:start w:val="1"/>
+      <w:numFmt w:val="lowerRoman"/>
+      <w:lvlText w:val="%3."/>
+      <w:lvlJc w:val="right"/>
+      <w:pPr>
+        <w:ind w:left="2160" w:hanging="180"/>
+      </w:pPr>
+    </w:lvl>
+    <w:lvl w:ilvl="3" w:tplc="0409000F" w:tentative="1">
+      <w:start w:val="1"/>
+      <w:numFmt w:val="decimal"/>
+      <w:lvlText w:val="%4."/>
+      <w:lvlJc w:val="left"/>
+      <w:pPr>
+        <w:ind w:left="2880" w:hanging="360"/>
+      </w:pPr>
+    </w:lvl>
+    <w:lvl w:ilvl="4" w:tplc="04090019" w:tentative="1">
+      <w:start w:val="1"/>
+      <w:numFmt w:val="lowerLetter"/>
+      <w:lvlText w:val="%5."/>
+      <w:lvlJc w:val="left"/>
+      <w:pPr>
+        <w:ind w:left="3600" w:hanging="360"/>
+      </w:pPr>
+    </w:lvl>
+    <w:lvl w:ilvl="5" w:tplc="0409001B" w:tentative="1">
+      <w:start w:val="1"/>
+      <w:numFmt w:val="lowerRoman"/>
+      <w:lvlText w:val="%6."/>
+      <w:lvlJc w:val="right"/>
+      <w:pPr>
+        <w:ind w:left="4320" w:hanging="180"/>
+      </w:pPr>
+    </w:lvl>
+    <w:lvl w:ilvl="6" w:tplc="0409000F" w:tentative="1">
+      <w:start w:val="1"/>
+      <w:numFmt w:val="decimal"/>
+      <w:lvlText w:val="%7."/>
+      <w:lvlJc w:val="left"/>
+      <w:pPr>
+        <w:ind w:left="5040" w:hanging="360"/>
+      </w:pPr>
+    </w:lvl>
+    <w:lvl w:ilvl="7" w:tplc="04090019" w:tentative="1">
+      <w:start w:val="1"/>
+      <w:numFmt w:val="lowerLetter"/>
+      <w:lvlText w:val="%8."/>
+      <w:lvlJc w:val="left"/>
+      <w:pPr>
+        <w:ind w:left="5760" w:hanging="360"/>
+      </w:pPr>
+    </w:lvl>
+    <w:lvl w:ilvl="8" w:tplc="0409001B" w:tentative="1">
+      <w:start w:val="1"/>
+      <w:numFmt w:val="lowerRoman"/>
+      <w:lvlText w:val="%9."/>
+      <w:lvlJc w:val="right"/>
+      <w:pPr>
+        <w:ind w:left="6480" w:hanging="180"/>
+      </w:pPr>
+    </w:lvl>
+  </w:abstractNum>
+  <w:abstractNum w:abstractNumId="2" w15:restartNumberingAfterBreak="0">
     <w:nsid w:val="5B99405D"/>
     <w:multiLevelType w:val="hybridMultilevel"/>
     <w:tmpl w:val="0F8A8F50"/>
@@ -5131,7 +6641,7 @@
       </w:pPr>
     </w:lvl>
   </w:abstractNum>
-  <w:abstractNum w:abstractNumId="2" w15:restartNumberingAfterBreak="0">
+  <w:abstractNum w:abstractNumId="3" w15:restartNumberingAfterBreak="0">
     <w:nsid w:val="6CB51F75"/>
     <w:multiLevelType w:val="hybridMultilevel"/>
     <w:tmpl w:val="91C26C5A"/>
@@ -5220,13 +6730,16 @@
       </w:pPr>
     </w:lvl>
   </w:abstractNum>
-  <w:num w:numId="1" w16cid:durableId="1736463276">
+  <w:num w:numId="1" w16cid:durableId="2125995782">
+    <w:abstractNumId w:val="3"/>
+  </w:num>
+  <w:num w:numId="2" w16cid:durableId="1796748400">
+    <w:abstractNumId w:val="0"/>
+  </w:num>
+  <w:num w:numId="3" w16cid:durableId="254872289">
     <w:abstractNumId w:val="2"/>
   </w:num>
-  <w:num w:numId="2" w16cid:durableId="87041972">
-    <w:abstractNumId w:val="0"/>
-  </w:num>
-  <w:num w:numId="3" w16cid:durableId="1823886605">
+  <w:num w:numId="4" w16cid:durableId="1270549042">
     <w:abstractNumId w:val="1"/>
   </w:num>
 </w:numbering>
@@ -5844,7 +7357,6 @@
   <w:style w:type="character" w:default="1" w:styleId="DefaultParagraphFont">
     <w:name w:val="Default Paragraph Font"/>
     <w:uiPriority w:val="1"/>
-    <w:semiHidden/>
     <w:unhideWhenUsed/>
   </w:style>
   <w:style w:type="table" w:default="1" w:styleId="TableNormal">
@@ -6369,6 +7881,18 @@
       <w:u w:val="single"/>
     </w:rPr>
   </w:style>
+  <w:style w:type="character" w:styleId="UnresolvedMention">
+    <w:name w:val="Unresolved Mention"/>
+    <w:basedOn w:val="DefaultParagraphFont"/>
+    <w:uiPriority w:val="99"/>
+    <w:semiHidden/>
+    <w:unhideWhenUsed/>
+    <w:rsid w:val="00FF05D4"/>
+    <w:rPr>
+      <w:color w:val="605E5C"/>
+      <w:shd w:val="clear" w:color="auto" w:fill="E1DFDD"/>
+    </w:rPr>
+  </w:style>
 </w:styles>
 </file>
 
@@ -6672,7 +8196,7 @@
 </file>
 
 <file path=customXml/itemProps1.xml><?xml version="1.0" encoding="utf-8"?>
-<ds:datastoreItem xmlns:ds="http://schemas.openxmlformats.org/officeDocument/2006/customXml" ds:itemID="{A02FCCFA-C2FA-4462-8DC1-CC78C12B0E5B}">
+<ds:datastoreItem xmlns:ds="http://schemas.openxmlformats.org/officeDocument/2006/customXml" ds:itemID="{54D0A44A-16A2-4AB8-B925-9412CA1D2B35}">
   <ds:schemaRefs>
     <ds:schemaRef ds:uri="http://schemas.openxmlformats.org/officeDocument/2006/bibliography"/>
   </ds:schemaRefs>

</xml_diff>